<commit_message>
feat(token + signup with google): add token feature and signup with gmail
</commit_message>
<xml_diff>
--- a/Requirenments.docx
+++ b/Requirenments.docx
@@ -113,14 +113,16 @@
           <w:szCs w:val="32"/>
         </w:rPr>
       </w:pPr>
+      <w:proofErr w:type="spellStart"/>
       <w:r>
         <w:rPr>
           <w:sz w:val="32"/>
           <w:szCs w:val="32"/>
         </w:rPr>
         <w:lastRenderedPageBreak/>
-        <w:t>Username</w:t>
-      </w:r>
+        <w:t>firstName</w:t>
+      </w:r>
+      <w:proofErr w:type="spellEnd"/>
     </w:p>
     <w:p>
       <w:pPr>
@@ -134,13 +136,15 @@
           <w:szCs w:val="32"/>
         </w:rPr>
       </w:pPr>
-      <w:r>
-        <w:rPr>
-          <w:sz w:val="32"/>
-          <w:szCs w:val="32"/>
-        </w:rPr>
-        <w:t>Email</w:t>
-      </w:r>
+      <w:proofErr w:type="spellStart"/>
+      <w:r>
+        <w:rPr>
+          <w:sz w:val="32"/>
+          <w:szCs w:val="32"/>
+        </w:rPr>
+        <w:t>lastName</w:t>
+      </w:r>
+      <w:proofErr w:type="spellEnd"/>
     </w:p>
     <w:p>
       <w:pPr>
@@ -159,7 +163,14 @@
           <w:sz w:val="32"/>
           <w:szCs w:val="32"/>
         </w:rPr>
-        <w:t>Password</w:t>
+        <w:t>u</w:t>
+      </w:r>
+      <w:r>
+        <w:rPr>
+          <w:sz w:val="32"/>
+          <w:szCs w:val="32"/>
+        </w:rPr>
+        <w:t>sername</w:t>
       </w:r>
     </w:p>
     <w:p>
@@ -179,7 +190,14 @@
           <w:sz w:val="32"/>
           <w:szCs w:val="32"/>
         </w:rPr>
-        <w:t>Gender</w:t>
+        <w:t>e</w:t>
+      </w:r>
+      <w:r>
+        <w:rPr>
+          <w:sz w:val="32"/>
+          <w:szCs w:val="32"/>
+        </w:rPr>
+        <w:t>mail</w:t>
       </w:r>
     </w:p>
     <w:p>
@@ -199,6 +217,53 @@
           <w:sz w:val="32"/>
           <w:szCs w:val="32"/>
         </w:rPr>
+        <w:t>p</w:t>
+      </w:r>
+      <w:r>
+        <w:rPr>
+          <w:sz w:val="32"/>
+          <w:szCs w:val="32"/>
+        </w:rPr>
+        <w:t>assword</w:t>
+      </w:r>
+    </w:p>
+    <w:p>
+      <w:pPr>
+        <w:pStyle w:val="ListParagraph"/>
+        <w:numPr>
+          <w:ilvl w:val="0"/>
+          <w:numId w:val="2"/>
+        </w:numPr>
+        <w:rPr>
+          <w:sz w:val="32"/>
+          <w:szCs w:val="32"/>
+        </w:rPr>
+      </w:pPr>
+      <w:r>
+        <w:rPr>
+          <w:sz w:val="32"/>
+          <w:szCs w:val="32"/>
+        </w:rPr>
+        <w:t>phone</w:t>
+      </w:r>
+    </w:p>
+    <w:p>
+      <w:pPr>
+        <w:pStyle w:val="ListParagraph"/>
+        <w:numPr>
+          <w:ilvl w:val="0"/>
+          <w:numId w:val="2"/>
+        </w:numPr>
+        <w:rPr>
+          <w:sz w:val="32"/>
+          <w:szCs w:val="32"/>
+        </w:rPr>
+      </w:pPr>
+      <w:r>
+        <w:rPr>
+          <w:sz w:val="32"/>
+          <w:szCs w:val="32"/>
+        </w:rPr>
         <w:t>DOB</w:t>
       </w:r>
     </w:p>
@@ -214,12 +279,21 @@
           <w:szCs w:val="32"/>
         </w:rPr>
       </w:pPr>
-      <w:r>
-        <w:rPr>
-          <w:sz w:val="32"/>
-          <w:szCs w:val="32"/>
-        </w:rPr>
-        <w:t>Confirm Email</w:t>
+      <w:proofErr w:type="spellStart"/>
+      <w:r>
+        <w:rPr>
+          <w:sz w:val="32"/>
+          <w:szCs w:val="32"/>
+        </w:rPr>
+        <w:t>confirmEmail</w:t>
+      </w:r>
+      <w:proofErr w:type="spellEnd"/>
+      <w:r>
+        <w:rPr>
+          <w:sz w:val="32"/>
+          <w:szCs w:val="32"/>
+        </w:rPr>
+        <w:t xml:space="preserve"> </w:t>
       </w:r>
     </w:p>
     <w:p>
@@ -239,7 +313,146 @@
           <w:sz w:val="32"/>
           <w:szCs w:val="32"/>
         </w:rPr>
+        <w:t>i</w:t>
+      </w:r>
+      <w:r>
+        <w:rPr>
+          <w:sz w:val="32"/>
+          <w:szCs w:val="32"/>
+        </w:rPr>
+        <w:t>mage</w:t>
+      </w:r>
+    </w:p>
+    <w:p>
+      <w:pPr>
+        <w:pStyle w:val="ListParagraph"/>
+        <w:numPr>
+          <w:ilvl w:val="0"/>
+          <w:numId w:val="2"/>
+        </w:numPr>
+        <w:rPr>
+          <w:sz w:val="32"/>
+          <w:szCs w:val="32"/>
+        </w:rPr>
+      </w:pPr>
+      <w:proofErr w:type="spellStart"/>
+      <w:r>
+        <w:rPr>
+          <w:sz w:val="32"/>
+          <w:szCs w:val="32"/>
+        </w:rPr>
+        <w:t>cover</w:t>
+      </w:r>
+      <w:r>
+        <w:rPr>
+          <w:sz w:val="32"/>
+          <w:szCs w:val="32"/>
+        </w:rPr>
+        <w:t>Image</w:t>
+      </w:r>
+      <w:proofErr w:type="spellEnd"/>
+    </w:p>
+    <w:p>
+      <w:pPr>
+        <w:pStyle w:val="ListParagraph"/>
+        <w:numPr>
+          <w:ilvl w:val="0"/>
+          <w:numId w:val="2"/>
+        </w:numPr>
+        <w:rPr>
+          <w:sz w:val="32"/>
+          <w:szCs w:val="32"/>
+        </w:rPr>
+      </w:pPr>
+      <w:r>
+        <w:rPr>
+          <w:sz w:val="32"/>
+          <w:szCs w:val="32"/>
+        </w:rPr>
         <w:lastRenderedPageBreak/>
+        <w:t>gender</w:t>
+      </w:r>
+      <w:r>
+        <w:rPr>
+          <w:sz w:val="32"/>
+          <w:szCs w:val="32"/>
+        </w:rPr>
+        <w:t xml:space="preserve"> (0=&gt; male, 1 =&gt; female)</w:t>
+      </w:r>
+    </w:p>
+    <w:p>
+      <w:pPr>
+        <w:pStyle w:val="ListParagraph"/>
+        <w:numPr>
+          <w:ilvl w:val="0"/>
+          <w:numId w:val="2"/>
+        </w:numPr>
+        <w:rPr>
+          <w:sz w:val="32"/>
+          <w:szCs w:val="32"/>
+        </w:rPr>
+      </w:pPr>
+      <w:r>
+        <w:rPr>
+          <w:sz w:val="32"/>
+          <w:szCs w:val="32"/>
+        </w:rPr>
+        <w:t>role</w:t>
+      </w:r>
+      <w:r>
+        <w:rPr>
+          <w:sz w:val="32"/>
+          <w:szCs w:val="32"/>
+        </w:rPr>
+        <w:t xml:space="preserve"> (0=&gt; user, 1=&gt; admin)</w:t>
+      </w:r>
+    </w:p>
+    <w:p>
+      <w:pPr>
+        <w:pStyle w:val="ListParagraph"/>
+        <w:numPr>
+          <w:ilvl w:val="0"/>
+          <w:numId w:val="2"/>
+        </w:numPr>
+        <w:rPr>
+          <w:sz w:val="32"/>
+          <w:szCs w:val="32"/>
+        </w:rPr>
+      </w:pPr>
+      <w:r>
+        <w:rPr>
+          <w:sz w:val="32"/>
+          <w:szCs w:val="32"/>
+        </w:rPr>
+        <w:t>provider (0=&gt; System, 1=&gt; google</w:t>
+      </w:r>
+      <w:bookmarkStart w:id="0" w:name="_GoBack"/>
+      <w:bookmarkEnd w:id="0"/>
+      <w:r>
+        <w:rPr>
+          <w:sz w:val="32"/>
+          <w:szCs w:val="32"/>
+        </w:rPr>
+        <w:t>)</w:t>
+      </w:r>
+    </w:p>
+    <w:p>
+      <w:pPr>
+        <w:pStyle w:val="ListParagraph"/>
+        <w:numPr>
+          <w:ilvl w:val="0"/>
+          <w:numId w:val="2"/>
+        </w:numPr>
+        <w:rPr>
+          <w:sz w:val="32"/>
+          <w:szCs w:val="32"/>
+        </w:rPr>
+      </w:pPr>
+      <w:r>
+        <w:rPr>
+          <w:sz w:val="32"/>
+          <w:szCs w:val="32"/>
+        </w:rPr>
         <w:t>Created At</w:t>
       </w:r>
     </w:p>
@@ -285,51 +498,6 @@
     </w:p>
     <w:p>
       <w:pPr>
-        <w:pStyle w:val="ListParagraph"/>
-        <w:numPr>
-          <w:ilvl w:val="0"/>
-          <w:numId w:val="2"/>
-        </w:numPr>
-        <w:rPr>
-          <w:sz w:val="32"/>
-          <w:szCs w:val="32"/>
-        </w:rPr>
-      </w:pPr>
-      <w:r>
-        <w:rPr>
-          <w:sz w:val="32"/>
-          <w:szCs w:val="32"/>
-        </w:rPr>
-        <w:t>Image</w:t>
-      </w:r>
-    </w:p>
-    <w:p>
-      <w:pPr>
-        <w:pStyle w:val="ListParagraph"/>
-        <w:numPr>
-          <w:ilvl w:val="0"/>
-          <w:numId w:val="2"/>
-        </w:numPr>
-        <w:rPr>
-          <w:sz w:val="32"/>
-          <w:szCs w:val="32"/>
-        </w:rPr>
-      </w:pPr>
-      <w:r>
-        <w:rPr>
-          <w:sz w:val="32"/>
-          <w:szCs w:val="32"/>
-        </w:rPr>
-        <w:t>Cover Image</w:t>
-      </w:r>
-    </w:p>
-    <w:p>
-      <w:pPr>
-        <w:pStyle w:val="ListParagraph"/>
-        <w:numPr>
-          <w:ilvl w:val="0"/>
-          <w:numId w:val="1"/>
-        </w:numPr>
         <w:rPr>
           <w:b/>
           <w:bCs/>
@@ -691,8 +859,68 @@
           <w:sz w:val="32"/>
           <w:szCs w:val="32"/>
         </w:rPr>
+        <w:t>Update Password</w:t>
+      </w:r>
+    </w:p>
+    <w:p>
+      <w:pPr>
+        <w:pStyle w:val="ListParagraph"/>
+        <w:numPr>
+          <w:ilvl w:val="0"/>
+          <w:numId w:val="4"/>
+        </w:numPr>
+        <w:rPr>
+          <w:sz w:val="32"/>
+          <w:szCs w:val="32"/>
+        </w:rPr>
+      </w:pPr>
+      <w:r>
+        <w:rPr>
+          <w:sz w:val="32"/>
+          <w:szCs w:val="32"/>
+        </w:rPr>
+        <w:t>Update Profile</w:t>
+      </w:r>
+    </w:p>
+    <w:p>
+      <w:pPr>
+        <w:pStyle w:val="ListParagraph"/>
+        <w:numPr>
+          <w:ilvl w:val="0"/>
+          <w:numId w:val="4"/>
+        </w:numPr>
+        <w:rPr>
+          <w:sz w:val="32"/>
+          <w:szCs w:val="32"/>
+        </w:rPr>
+      </w:pPr>
+      <w:r>
+        <w:rPr>
+          <w:sz w:val="32"/>
+          <w:szCs w:val="32"/>
+        </w:rPr>
+        <w:t>Freeze Profile</w:t>
+      </w:r>
+    </w:p>
+    <w:p>
+      <w:pPr>
+        <w:pStyle w:val="ListParagraph"/>
+        <w:numPr>
+          <w:ilvl w:val="0"/>
+          <w:numId w:val="4"/>
+        </w:numPr>
+        <w:rPr>
+          <w:sz w:val="32"/>
+          <w:szCs w:val="32"/>
+        </w:rPr>
+      </w:pPr>
+      <w:r>
+        <w:rPr>
+          <w:sz w:val="32"/>
+          <w:szCs w:val="32"/>
+        </w:rPr>
         <w:lastRenderedPageBreak/>
-        <w:t>Update Password</w:t>
+        <w:t>CRUD Operations to Message model</w:t>
       </w:r>
     </w:p>
     <w:p>
@@ -712,48 +940,48 @@
           <w:sz w:val="32"/>
           <w:szCs w:val="32"/>
         </w:rPr>
-        <w:t>Update Profile</w:t>
-      </w:r>
-    </w:p>
-    <w:p>
-      <w:pPr>
-        <w:pStyle w:val="ListParagraph"/>
-        <w:numPr>
-          <w:ilvl w:val="0"/>
-          <w:numId w:val="4"/>
-        </w:numPr>
-        <w:rPr>
-          <w:sz w:val="32"/>
-          <w:szCs w:val="32"/>
-        </w:rPr>
-      </w:pPr>
-      <w:r>
-        <w:rPr>
-          <w:sz w:val="32"/>
-          <w:szCs w:val="32"/>
-        </w:rPr>
-        <w:t>Freeze Profile</w:t>
-      </w:r>
-    </w:p>
-    <w:p>
-      <w:pPr>
-        <w:pStyle w:val="ListParagraph"/>
-        <w:numPr>
-          <w:ilvl w:val="0"/>
-          <w:numId w:val="4"/>
-        </w:numPr>
-        <w:rPr>
-          <w:sz w:val="32"/>
-          <w:szCs w:val="32"/>
-        </w:rPr>
-      </w:pPr>
-      <w:r>
-        <w:rPr>
-          <w:sz w:val="32"/>
-          <w:szCs w:val="32"/>
-        </w:rPr>
-        <w:t>CRUD Operations to Message model</w:t>
-      </w:r>
+        <w:t>Login</w:t>
+      </w:r>
+      <w:r>
+        <w:rPr>
+          <w:sz w:val="32"/>
+          <w:szCs w:val="32"/>
+        </w:rPr>
+        <w:t xml:space="preserve"> and signup</w:t>
+      </w:r>
+      <w:r>
+        <w:rPr>
+          <w:sz w:val="32"/>
+          <w:szCs w:val="32"/>
+        </w:rPr>
+        <w:t xml:space="preserve"> with </w:t>
+      </w:r>
+      <w:proofErr w:type="spellStart"/>
+      <w:r>
+        <w:rPr>
+          <w:sz w:val="32"/>
+          <w:szCs w:val="32"/>
+        </w:rPr>
+        <w:t>gmail</w:t>
+      </w:r>
+      <w:proofErr w:type="spellEnd"/>
+    </w:p>
+    <w:p>
+      <w:pPr>
+        <w:ind w:left="360"/>
+        <w:rPr>
+          <w:sz w:val="32"/>
+          <w:szCs w:val="32"/>
+        </w:rPr>
+      </w:pPr>
+    </w:p>
+    <w:p>
+      <w:pPr>
+        <w:rPr>
+          <w:sz w:val="32"/>
+          <w:szCs w:val="32"/>
+        </w:rPr>
+      </w:pPr>
     </w:p>
     <w:p>
       <w:pPr>
@@ -957,35 +1185,7 @@
           <w:sz w:val="32"/>
           <w:szCs w:val="32"/>
         </w:rPr>
-        <w:t>(5</w:t>
-      </w:r>
-      <w:r>
-        <w:rPr>
-          <w:sz w:val="32"/>
-          <w:szCs w:val="32"/>
-        </w:rPr>
-        <w:t>/09/2026 –</w:t>
-      </w:r>
-      <w:r>
-        <w:rPr>
-          <w:sz w:val="32"/>
-          <w:szCs w:val="32"/>
-        </w:rPr>
-        <w:t xml:space="preserve"> 11</w:t>
-      </w:r>
-      <w:r>
-        <w:rPr>
-          <w:sz w:val="32"/>
-          <w:szCs w:val="32"/>
-        </w:rPr>
-        <w:t>/09/2026</w:t>
-      </w:r>
-      <w:r>
-        <w:rPr>
-          <w:sz w:val="32"/>
-          <w:szCs w:val="32"/>
-        </w:rPr>
-        <w:t>)</w:t>
+        <w:t>(5/09/2026 – 11/09/2026)</w:t>
       </w:r>
     </w:p>
     <w:p>
@@ -1153,16 +1353,7 @@
           <w:sz w:val="32"/>
           <w:szCs w:val="32"/>
         </w:rPr>
-        <w:t>Ha</w:t>
-      </w:r>
-      <w:bookmarkStart w:id="0" w:name="_GoBack"/>
-      <w:bookmarkEnd w:id="0"/>
-      <w:r>
-        <w:rPr>
-          <w:sz w:val="32"/>
-          <w:szCs w:val="32"/>
-        </w:rPr>
-        <w:t>sh and encryption</w:t>
+        <w:t>Hash and encryption</w:t>
       </w:r>
     </w:p>
     <w:p>
@@ -1384,42 +1575,7 @@
           <w:szCs w:val="32"/>
         </w:rPr>
         <w:lastRenderedPageBreak/>
-        <w:t xml:space="preserve">Sprint three </w:t>
-      </w:r>
-      <w:r>
-        <w:rPr>
-          <w:sz w:val="32"/>
-          <w:szCs w:val="32"/>
-        </w:rPr>
-        <w:t>(</w:t>
-      </w:r>
-      <w:r>
-        <w:rPr>
-          <w:sz w:val="32"/>
-          <w:szCs w:val="32"/>
-        </w:rPr>
-        <w:t>19</w:t>
-      </w:r>
-      <w:r>
-        <w:rPr>
-          <w:sz w:val="32"/>
-          <w:szCs w:val="32"/>
-        </w:rPr>
-        <w:t xml:space="preserve">/09/2026 – </w:t>
-      </w:r>
-      <w:r>
-        <w:rPr>
-          <w:sz w:val="32"/>
-          <w:szCs w:val="32"/>
-        </w:rPr>
-        <w:t>25</w:t>
-      </w:r>
-      <w:r>
-        <w:rPr>
-          <w:sz w:val="32"/>
-          <w:szCs w:val="32"/>
-        </w:rPr>
-        <w:t>/09/2026)</w:t>
+        <w:t>Sprint three (19/09/2026 – 25/09/2026)</w:t>
       </w:r>
     </w:p>
     <w:p>
@@ -1580,63 +1736,7 @@
           <w:szCs w:val="32"/>
         </w:rPr>
         <w:lastRenderedPageBreak/>
-        <w:t xml:space="preserve">Sprint </w:t>
-      </w:r>
-      <w:r>
-        <w:rPr>
-          <w:sz w:val="32"/>
-          <w:szCs w:val="32"/>
-        </w:rPr>
-        <w:t>four</w:t>
-      </w:r>
-      <w:r>
-        <w:rPr>
-          <w:sz w:val="32"/>
-          <w:szCs w:val="32"/>
-        </w:rPr>
-        <w:t xml:space="preserve"> (</w:t>
-      </w:r>
-      <w:r>
-        <w:rPr>
-          <w:sz w:val="32"/>
-          <w:szCs w:val="32"/>
-        </w:rPr>
-        <w:t>26</w:t>
-      </w:r>
-      <w:r>
-        <w:rPr>
-          <w:sz w:val="32"/>
-          <w:szCs w:val="32"/>
-        </w:rPr>
-        <w:t xml:space="preserve">/09/2026 – </w:t>
-      </w:r>
-      <w:r>
-        <w:rPr>
-          <w:sz w:val="32"/>
-          <w:szCs w:val="32"/>
-        </w:rPr>
-        <w:t>02</w:t>
-      </w:r>
-      <w:r>
-        <w:rPr>
-          <w:sz w:val="32"/>
-          <w:szCs w:val="32"/>
-        </w:rPr>
-        <w:t>/</w:t>
-      </w:r>
-      <w:r>
-        <w:rPr>
-          <w:sz w:val="32"/>
-          <w:szCs w:val="32"/>
-        </w:rPr>
-        <w:t>10</w:t>
-      </w:r>
-      <w:r>
-        <w:rPr>
-          <w:sz w:val="32"/>
-          <w:szCs w:val="32"/>
-        </w:rPr>
-        <w:t>/2026)</w:t>
+        <w:t>Sprint four (26/09/2026 – 02/10/2026)</w:t>
       </w:r>
     </w:p>
     <w:p>
@@ -2270,7 +2370,7 @@
   <w:abstractNum w:abstractNumId="5" w15:restartNumberingAfterBreak="0">
     <w:nsid w:val="51183EA0"/>
     <w:multiLevelType w:val="hybridMultilevel"/>
-    <w:tmpl w:val="BB0407F8"/>
+    <w:tmpl w:val="A2DC844C"/>
     <w:lvl w:ilvl="0" w:tplc="CB8C6448">
       <w:start w:val="1"/>
       <w:numFmt w:val="decimal"/>
@@ -3392,4 +3492,16 @@
     </a:ext>
   </a:extLst>
 </a:theme>
+</file>
+
+<file path=customXml/item1.xml><?xml version="1.0" encoding="utf-8"?>
+<b:Sources xmlns:b="http://schemas.openxmlformats.org/officeDocument/2006/bibliography" xmlns="http://schemas.openxmlformats.org/officeDocument/2006/bibliography" SelectedStyle="\APASixthEditionOfficeOnline.xsl" StyleName="APA" Version="6"/>
+</file>
+
+<file path=customXml/itemProps1.xml><?xml version="1.0" encoding="utf-8"?>
+<ds:datastoreItem xmlns:ds="http://schemas.openxmlformats.org/officeDocument/2006/customXml" ds:itemID="{C8B43FC5-5D53-44B0-9003-5F87AE30AFB8}">
+  <ds:schemaRefs>
+    <ds:schemaRef ds:uri="http://schemas.openxmlformats.org/officeDocument/2006/bibliography"/>
+  </ds:schemaRefs>
+</ds:datastoreItem>
 </file>
</xml_diff>

<commit_message>
feat (comments): add new comments to each function
</commit_message>
<xml_diff>
--- a/Requirenments.docx
+++ b/Requirenments.docx
@@ -100,340 +100,422 @@
           <w:docGrid w:linePitch="360"/>
         </w:sectPr>
       </w:pPr>
-    </w:p>
-    <w:p>
-      <w:pPr>
-        <w:pStyle w:val="ListParagraph"/>
-        <w:numPr>
-          <w:ilvl w:val="0"/>
-          <w:numId w:val="2"/>
-        </w:numPr>
-        <w:rPr>
-          <w:sz w:val="32"/>
-          <w:szCs w:val="32"/>
-        </w:rPr>
-      </w:pPr>
-      <w:proofErr w:type="spellStart"/>
-      <w:r>
-        <w:rPr>
-          <w:sz w:val="32"/>
-          <w:szCs w:val="32"/>
-        </w:rPr>
-        <w:lastRenderedPageBreak/>
-        <w:t>firstName</w:t>
-      </w:r>
-      <w:proofErr w:type="spellEnd"/>
-    </w:p>
-    <w:p>
-      <w:pPr>
-        <w:pStyle w:val="ListParagraph"/>
-        <w:numPr>
-          <w:ilvl w:val="0"/>
-          <w:numId w:val="2"/>
-        </w:numPr>
-        <w:rPr>
-          <w:sz w:val="32"/>
-          <w:szCs w:val="32"/>
-        </w:rPr>
-      </w:pPr>
-      <w:proofErr w:type="spellStart"/>
-      <w:r>
-        <w:rPr>
-          <w:sz w:val="32"/>
-          <w:szCs w:val="32"/>
-        </w:rPr>
-        <w:t>lastName</w:t>
-      </w:r>
-      <w:proofErr w:type="spellEnd"/>
-    </w:p>
-    <w:p>
-      <w:pPr>
-        <w:pStyle w:val="ListParagraph"/>
-        <w:numPr>
-          <w:ilvl w:val="0"/>
-          <w:numId w:val="2"/>
-        </w:numPr>
-        <w:rPr>
-          <w:sz w:val="32"/>
-          <w:szCs w:val="32"/>
-        </w:rPr>
-      </w:pPr>
-      <w:r>
-        <w:rPr>
-          <w:sz w:val="32"/>
-          <w:szCs w:val="32"/>
-        </w:rPr>
-        <w:t>u</w:t>
-      </w:r>
-      <w:r>
-        <w:rPr>
-          <w:sz w:val="32"/>
-          <w:szCs w:val="32"/>
-        </w:rPr>
-        <w:t>sername</w:t>
-      </w:r>
-    </w:p>
-    <w:p>
-      <w:pPr>
-        <w:pStyle w:val="ListParagraph"/>
-        <w:numPr>
-          <w:ilvl w:val="0"/>
-          <w:numId w:val="2"/>
-        </w:numPr>
-        <w:rPr>
-          <w:sz w:val="32"/>
-          <w:szCs w:val="32"/>
-        </w:rPr>
-      </w:pPr>
-      <w:r>
-        <w:rPr>
-          <w:sz w:val="32"/>
-          <w:szCs w:val="32"/>
-        </w:rPr>
-        <w:t>e</w:t>
-      </w:r>
-      <w:r>
-        <w:rPr>
-          <w:sz w:val="32"/>
-          <w:szCs w:val="32"/>
-        </w:rPr>
-        <w:t>mail</w:t>
-      </w:r>
-    </w:p>
-    <w:p>
-      <w:pPr>
-        <w:pStyle w:val="ListParagraph"/>
-        <w:numPr>
-          <w:ilvl w:val="0"/>
-          <w:numId w:val="2"/>
-        </w:numPr>
-        <w:rPr>
-          <w:sz w:val="32"/>
-          <w:szCs w:val="32"/>
-        </w:rPr>
-      </w:pPr>
-      <w:r>
-        <w:rPr>
-          <w:sz w:val="32"/>
-          <w:szCs w:val="32"/>
-        </w:rPr>
-        <w:t>p</w:t>
-      </w:r>
-      <w:r>
-        <w:rPr>
-          <w:sz w:val="32"/>
-          <w:szCs w:val="32"/>
-        </w:rPr>
-        <w:t>assword</w:t>
-      </w:r>
-    </w:p>
-    <w:p>
-      <w:pPr>
-        <w:pStyle w:val="ListParagraph"/>
-        <w:numPr>
-          <w:ilvl w:val="0"/>
-          <w:numId w:val="2"/>
-        </w:numPr>
-        <w:rPr>
-          <w:sz w:val="32"/>
-          <w:szCs w:val="32"/>
-        </w:rPr>
-      </w:pPr>
-      <w:r>
-        <w:rPr>
-          <w:sz w:val="32"/>
-          <w:szCs w:val="32"/>
-        </w:rPr>
-        <w:t>phone</w:t>
-      </w:r>
-    </w:p>
-    <w:p>
-      <w:pPr>
-        <w:pStyle w:val="ListParagraph"/>
-        <w:numPr>
-          <w:ilvl w:val="0"/>
-          <w:numId w:val="2"/>
-        </w:numPr>
-        <w:rPr>
-          <w:sz w:val="32"/>
-          <w:szCs w:val="32"/>
-        </w:rPr>
-      </w:pPr>
-      <w:r>
-        <w:rPr>
-          <w:sz w:val="32"/>
-          <w:szCs w:val="32"/>
-        </w:rPr>
-        <w:t>DOB</w:t>
-      </w:r>
-    </w:p>
-    <w:p>
-      <w:pPr>
-        <w:pStyle w:val="ListParagraph"/>
-        <w:numPr>
-          <w:ilvl w:val="0"/>
-          <w:numId w:val="2"/>
-        </w:numPr>
-        <w:rPr>
-          <w:sz w:val="32"/>
-          <w:szCs w:val="32"/>
-        </w:rPr>
-      </w:pPr>
-      <w:proofErr w:type="spellStart"/>
-      <w:r>
-        <w:rPr>
-          <w:sz w:val="32"/>
-          <w:szCs w:val="32"/>
-        </w:rPr>
-        <w:t>confirmEmail</w:t>
-      </w:r>
-      <w:proofErr w:type="spellEnd"/>
-      <w:r>
-        <w:rPr>
-          <w:sz w:val="32"/>
-          <w:szCs w:val="32"/>
-        </w:rPr>
-        <w:t xml:space="preserve"> </w:t>
-      </w:r>
-    </w:p>
-    <w:p>
-      <w:pPr>
-        <w:pStyle w:val="ListParagraph"/>
-        <w:numPr>
-          <w:ilvl w:val="0"/>
-          <w:numId w:val="2"/>
-        </w:numPr>
-        <w:rPr>
-          <w:sz w:val="32"/>
-          <w:szCs w:val="32"/>
-        </w:rPr>
-      </w:pPr>
-      <w:r>
-        <w:rPr>
-          <w:sz w:val="32"/>
-          <w:szCs w:val="32"/>
-        </w:rPr>
-        <w:t>i</w:t>
-      </w:r>
-      <w:r>
-        <w:rPr>
-          <w:sz w:val="32"/>
-          <w:szCs w:val="32"/>
-        </w:rPr>
-        <w:t>mage</w:t>
-      </w:r>
-    </w:p>
-    <w:p>
-      <w:pPr>
-        <w:pStyle w:val="ListParagraph"/>
-        <w:numPr>
-          <w:ilvl w:val="0"/>
-          <w:numId w:val="2"/>
-        </w:numPr>
-        <w:rPr>
-          <w:sz w:val="32"/>
-          <w:szCs w:val="32"/>
-        </w:rPr>
-      </w:pPr>
-      <w:proofErr w:type="spellStart"/>
-      <w:r>
-        <w:rPr>
-          <w:sz w:val="32"/>
-          <w:szCs w:val="32"/>
-        </w:rPr>
-        <w:t>cover</w:t>
-      </w:r>
-      <w:r>
-        <w:rPr>
-          <w:sz w:val="32"/>
-          <w:szCs w:val="32"/>
-        </w:rPr>
-        <w:t>Image</w:t>
-      </w:r>
-      <w:proofErr w:type="spellEnd"/>
-    </w:p>
-    <w:p>
-      <w:pPr>
-        <w:pStyle w:val="ListParagraph"/>
-        <w:numPr>
-          <w:ilvl w:val="0"/>
-          <w:numId w:val="2"/>
-        </w:numPr>
-        <w:rPr>
-          <w:sz w:val="32"/>
-          <w:szCs w:val="32"/>
-        </w:rPr>
-      </w:pPr>
-      <w:r>
-        <w:rPr>
-          <w:sz w:val="32"/>
-          <w:szCs w:val="32"/>
-        </w:rPr>
-        <w:lastRenderedPageBreak/>
-        <w:t>gender</w:t>
-      </w:r>
-      <w:r>
-        <w:rPr>
-          <w:sz w:val="32"/>
-          <w:szCs w:val="32"/>
-        </w:rPr>
-        <w:t xml:space="preserve"> (0=&gt; male, 1 =&gt; female)</w:t>
-      </w:r>
-    </w:p>
-    <w:p>
-      <w:pPr>
-        <w:pStyle w:val="ListParagraph"/>
-        <w:numPr>
-          <w:ilvl w:val="0"/>
-          <w:numId w:val="2"/>
-        </w:numPr>
-        <w:rPr>
-          <w:sz w:val="32"/>
-          <w:szCs w:val="32"/>
-        </w:rPr>
-      </w:pPr>
-      <w:r>
-        <w:rPr>
-          <w:sz w:val="32"/>
-          <w:szCs w:val="32"/>
-        </w:rPr>
-        <w:t>role</w:t>
-      </w:r>
-      <w:r>
-        <w:rPr>
-          <w:sz w:val="32"/>
-          <w:szCs w:val="32"/>
-        </w:rPr>
-        <w:t xml:space="preserve"> (0=&gt; user, 1=&gt; admin)</w:t>
-      </w:r>
-    </w:p>
-    <w:p>
-      <w:pPr>
-        <w:pStyle w:val="ListParagraph"/>
-        <w:numPr>
-          <w:ilvl w:val="0"/>
-          <w:numId w:val="2"/>
-        </w:numPr>
-        <w:rPr>
-          <w:sz w:val="32"/>
-          <w:szCs w:val="32"/>
-        </w:rPr>
-      </w:pPr>
-      <w:r>
-        <w:rPr>
-          <w:sz w:val="32"/>
-          <w:szCs w:val="32"/>
-        </w:rPr>
-        <w:t>provider (0=&gt; System, 1=&gt; google</w:t>
-      </w:r>
       <w:bookmarkStart w:id="0" w:name="_GoBack"/>
       <w:bookmarkEnd w:id="0"/>
-      <w:r>
-        <w:rPr>
-          <w:sz w:val="32"/>
-          <w:szCs w:val="32"/>
-        </w:rPr>
-        <w:t>)</w:t>
+    </w:p>
+    <w:p>
+      <w:pPr>
+        <w:pStyle w:val="ListParagraph"/>
+        <w:numPr>
+          <w:ilvl w:val="0"/>
+          <w:numId w:val="2"/>
+        </w:numPr>
+        <w:rPr>
+          <w:sz w:val="32"/>
+          <w:szCs w:val="32"/>
+        </w:rPr>
+      </w:pPr>
+      <w:r>
+        <w:rPr>
+          <w:sz w:val="32"/>
+          <w:szCs w:val="32"/>
+        </w:rPr>
+        <w:lastRenderedPageBreak/>
+        <w:t>First n</w:t>
+      </w:r>
+      <w:r>
+        <w:rPr>
+          <w:sz w:val="32"/>
+          <w:szCs w:val="32"/>
+        </w:rPr>
+        <w:t>ame</w:t>
+      </w:r>
+    </w:p>
+    <w:p>
+      <w:pPr>
+        <w:pStyle w:val="ListParagraph"/>
+        <w:numPr>
+          <w:ilvl w:val="0"/>
+          <w:numId w:val="2"/>
+        </w:numPr>
+        <w:rPr>
+          <w:sz w:val="32"/>
+          <w:szCs w:val="32"/>
+        </w:rPr>
+      </w:pPr>
+      <w:r>
+        <w:rPr>
+          <w:sz w:val="32"/>
+          <w:szCs w:val="32"/>
+        </w:rPr>
+        <w:t>L</w:t>
+      </w:r>
+      <w:r>
+        <w:rPr>
+          <w:sz w:val="32"/>
+          <w:szCs w:val="32"/>
+        </w:rPr>
+        <w:t>ast</w:t>
+      </w:r>
+      <w:r>
+        <w:rPr>
+          <w:sz w:val="32"/>
+          <w:szCs w:val="32"/>
+        </w:rPr>
+        <w:t xml:space="preserve"> </w:t>
+      </w:r>
+      <w:r>
+        <w:rPr>
+          <w:sz w:val="32"/>
+          <w:szCs w:val="32"/>
+        </w:rPr>
+        <w:t>Name</w:t>
+      </w:r>
+    </w:p>
+    <w:p>
+      <w:pPr>
+        <w:pStyle w:val="ListParagraph"/>
+        <w:numPr>
+          <w:ilvl w:val="0"/>
+          <w:numId w:val="2"/>
+        </w:numPr>
+        <w:rPr>
+          <w:sz w:val="32"/>
+          <w:szCs w:val="32"/>
+        </w:rPr>
+      </w:pPr>
+      <w:r>
+        <w:rPr>
+          <w:sz w:val="32"/>
+          <w:szCs w:val="32"/>
+        </w:rPr>
+        <w:t>u</w:t>
+      </w:r>
+      <w:r>
+        <w:rPr>
+          <w:sz w:val="32"/>
+          <w:szCs w:val="32"/>
+        </w:rPr>
+        <w:t>sername</w:t>
+      </w:r>
+    </w:p>
+    <w:p>
+      <w:pPr>
+        <w:pStyle w:val="ListParagraph"/>
+        <w:numPr>
+          <w:ilvl w:val="0"/>
+          <w:numId w:val="2"/>
+        </w:numPr>
+        <w:rPr>
+          <w:sz w:val="32"/>
+          <w:szCs w:val="32"/>
+        </w:rPr>
+      </w:pPr>
+      <w:r>
+        <w:rPr>
+          <w:sz w:val="32"/>
+          <w:szCs w:val="32"/>
+        </w:rPr>
+        <w:t>e</w:t>
+      </w:r>
+      <w:r>
+        <w:rPr>
+          <w:sz w:val="32"/>
+          <w:szCs w:val="32"/>
+        </w:rPr>
+        <w:t>mail</w:t>
+      </w:r>
+    </w:p>
+    <w:p>
+      <w:pPr>
+        <w:pStyle w:val="ListParagraph"/>
+        <w:numPr>
+          <w:ilvl w:val="0"/>
+          <w:numId w:val="2"/>
+        </w:numPr>
+        <w:rPr>
+          <w:sz w:val="32"/>
+          <w:szCs w:val="32"/>
+        </w:rPr>
+      </w:pPr>
+      <w:r>
+        <w:rPr>
+          <w:sz w:val="32"/>
+          <w:szCs w:val="32"/>
+        </w:rPr>
+        <w:t>p</w:t>
+      </w:r>
+      <w:r>
+        <w:rPr>
+          <w:sz w:val="32"/>
+          <w:szCs w:val="32"/>
+        </w:rPr>
+        <w:t>assword</w:t>
+      </w:r>
+    </w:p>
+    <w:p>
+      <w:pPr>
+        <w:pStyle w:val="ListParagraph"/>
+        <w:numPr>
+          <w:ilvl w:val="0"/>
+          <w:numId w:val="2"/>
+        </w:numPr>
+        <w:rPr>
+          <w:sz w:val="32"/>
+          <w:szCs w:val="32"/>
+        </w:rPr>
+      </w:pPr>
+      <w:r>
+        <w:rPr>
+          <w:sz w:val="32"/>
+          <w:szCs w:val="32"/>
+        </w:rPr>
+        <w:t>phone</w:t>
+      </w:r>
+    </w:p>
+    <w:p>
+      <w:pPr>
+        <w:pStyle w:val="ListParagraph"/>
+        <w:numPr>
+          <w:ilvl w:val="0"/>
+          <w:numId w:val="2"/>
+        </w:numPr>
+        <w:rPr>
+          <w:sz w:val="32"/>
+          <w:szCs w:val="32"/>
+        </w:rPr>
+      </w:pPr>
+      <w:r>
+        <w:rPr>
+          <w:sz w:val="32"/>
+          <w:szCs w:val="32"/>
+        </w:rPr>
+        <w:t>DOB</w:t>
+      </w:r>
+    </w:p>
+    <w:p>
+      <w:pPr>
+        <w:pStyle w:val="ListParagraph"/>
+        <w:numPr>
+          <w:ilvl w:val="0"/>
+          <w:numId w:val="2"/>
+        </w:numPr>
+        <w:rPr>
+          <w:sz w:val="32"/>
+          <w:szCs w:val="32"/>
+        </w:rPr>
+      </w:pPr>
+      <w:r>
+        <w:rPr>
+          <w:sz w:val="32"/>
+          <w:szCs w:val="32"/>
+        </w:rPr>
+        <w:t>C</w:t>
+      </w:r>
+      <w:r>
+        <w:rPr>
+          <w:sz w:val="32"/>
+          <w:szCs w:val="32"/>
+        </w:rPr>
+        <w:t>onfirm</w:t>
+      </w:r>
+      <w:r>
+        <w:rPr>
+          <w:sz w:val="32"/>
+          <w:szCs w:val="32"/>
+        </w:rPr>
+        <w:t xml:space="preserve"> </w:t>
+      </w:r>
+      <w:r>
+        <w:rPr>
+          <w:sz w:val="32"/>
+          <w:szCs w:val="32"/>
+        </w:rPr>
+        <w:t xml:space="preserve">Email </w:t>
+      </w:r>
+    </w:p>
+    <w:p>
+      <w:pPr>
+        <w:pStyle w:val="ListParagraph"/>
+        <w:numPr>
+          <w:ilvl w:val="0"/>
+          <w:numId w:val="2"/>
+        </w:numPr>
+        <w:rPr>
+          <w:sz w:val="32"/>
+          <w:szCs w:val="32"/>
+        </w:rPr>
+      </w:pPr>
+      <w:r>
+        <w:rPr>
+          <w:sz w:val="32"/>
+          <w:szCs w:val="32"/>
+        </w:rPr>
+        <w:t>image</w:t>
+      </w:r>
+    </w:p>
+    <w:p>
+      <w:pPr>
+        <w:pStyle w:val="ListParagraph"/>
+        <w:numPr>
+          <w:ilvl w:val="0"/>
+          <w:numId w:val="2"/>
+        </w:numPr>
+        <w:rPr>
+          <w:sz w:val="32"/>
+          <w:szCs w:val="32"/>
+        </w:rPr>
+      </w:pPr>
+      <w:r>
+        <w:rPr>
+          <w:sz w:val="32"/>
+          <w:szCs w:val="32"/>
+        </w:rPr>
+        <w:t>C</w:t>
+      </w:r>
+      <w:r>
+        <w:rPr>
+          <w:sz w:val="32"/>
+          <w:szCs w:val="32"/>
+        </w:rPr>
+        <w:t>over</w:t>
+      </w:r>
+      <w:r>
+        <w:rPr>
+          <w:sz w:val="32"/>
+          <w:szCs w:val="32"/>
+        </w:rPr>
+        <w:t xml:space="preserve"> </w:t>
+      </w:r>
+      <w:r>
+        <w:rPr>
+          <w:sz w:val="32"/>
+          <w:szCs w:val="32"/>
+        </w:rPr>
+        <w:t>Image</w:t>
+      </w:r>
+    </w:p>
+    <w:p>
+      <w:pPr>
+        <w:pStyle w:val="ListParagraph"/>
+        <w:numPr>
+          <w:ilvl w:val="0"/>
+          <w:numId w:val="2"/>
+        </w:numPr>
+        <w:rPr>
+          <w:sz w:val="32"/>
+          <w:szCs w:val="32"/>
+        </w:rPr>
+      </w:pPr>
+      <w:r>
+        <w:rPr>
+          <w:sz w:val="32"/>
+          <w:szCs w:val="32"/>
+        </w:rPr>
+        <w:lastRenderedPageBreak/>
+        <w:t>gender (0=&gt; male, 1 =&gt; female)</w:t>
+      </w:r>
+    </w:p>
+    <w:p>
+      <w:pPr>
+        <w:pStyle w:val="ListParagraph"/>
+        <w:numPr>
+          <w:ilvl w:val="0"/>
+          <w:numId w:val="2"/>
+        </w:numPr>
+        <w:rPr>
+          <w:sz w:val="32"/>
+          <w:szCs w:val="32"/>
+        </w:rPr>
+      </w:pPr>
+      <w:r>
+        <w:rPr>
+          <w:sz w:val="32"/>
+          <w:szCs w:val="32"/>
+        </w:rPr>
+        <w:t>role</w:t>
+      </w:r>
+      <w:r>
+        <w:rPr>
+          <w:sz w:val="32"/>
+          <w:szCs w:val="32"/>
+        </w:rPr>
+        <w:t xml:space="preserve"> (0=&gt; user, 1=&gt; admin)</w:t>
+      </w:r>
+    </w:p>
+    <w:p>
+      <w:pPr>
+        <w:pStyle w:val="ListParagraph"/>
+        <w:numPr>
+          <w:ilvl w:val="0"/>
+          <w:numId w:val="2"/>
+        </w:numPr>
+        <w:rPr>
+          <w:sz w:val="32"/>
+          <w:szCs w:val="32"/>
+        </w:rPr>
+      </w:pPr>
+      <w:r>
+        <w:rPr>
+          <w:sz w:val="32"/>
+          <w:szCs w:val="32"/>
+        </w:rPr>
+        <w:t>provider (0=&gt; System, 1=&gt; google)</w:t>
+      </w:r>
+    </w:p>
+    <w:p>
+      <w:pPr>
+        <w:pStyle w:val="ListParagraph"/>
+        <w:numPr>
+          <w:ilvl w:val="0"/>
+          <w:numId w:val="2"/>
+        </w:numPr>
+        <w:rPr>
+          <w:sz w:val="32"/>
+          <w:szCs w:val="32"/>
+        </w:rPr>
+      </w:pPr>
+      <w:r>
+        <w:rPr>
+          <w:sz w:val="32"/>
+          <w:szCs w:val="32"/>
+        </w:rPr>
+        <w:t>change</w:t>
+      </w:r>
+      <w:r>
+        <w:rPr>
+          <w:sz w:val="32"/>
+          <w:szCs w:val="32"/>
+        </w:rPr>
+        <w:t xml:space="preserve"> </w:t>
+      </w:r>
+      <w:r>
+        <w:rPr>
+          <w:sz w:val="32"/>
+          <w:szCs w:val="32"/>
+        </w:rPr>
+        <w:t>Credentials</w:t>
+      </w:r>
+      <w:r>
+        <w:rPr>
+          <w:sz w:val="32"/>
+          <w:szCs w:val="32"/>
+        </w:rPr>
+        <w:t xml:space="preserve"> </w:t>
+      </w:r>
+      <w:r>
+        <w:rPr>
+          <w:sz w:val="32"/>
+          <w:szCs w:val="32"/>
+        </w:rPr>
+        <w:t>Time</w:t>
+      </w:r>
+      <w:r>
+        <w:rPr>
+          <w:sz w:val="32"/>
+          <w:szCs w:val="32"/>
+        </w:rPr>
+        <w:t xml:space="preserve"> </w:t>
       </w:r>
     </w:p>
     <w:p>
@@ -628,8 +710,28 @@
           <w:sz w:val="32"/>
           <w:szCs w:val="32"/>
         </w:rPr>
+        <w:t>Receiver ID</w:t>
+      </w:r>
+    </w:p>
+    <w:p>
+      <w:pPr>
+        <w:pStyle w:val="ListParagraph"/>
+        <w:numPr>
+          <w:ilvl w:val="0"/>
+          <w:numId w:val="3"/>
+        </w:numPr>
+        <w:rPr>
+          <w:sz w:val="32"/>
+          <w:szCs w:val="32"/>
+        </w:rPr>
+      </w:pPr>
+      <w:r>
+        <w:rPr>
+          <w:sz w:val="32"/>
+          <w:szCs w:val="32"/>
+        </w:rPr>
         <w:lastRenderedPageBreak/>
-        <w:t>Receiver ID</w:t>
+        <w:t>Sender ID</w:t>
       </w:r>
     </w:p>
     <w:p>
@@ -649,7 +751,7 @@
           <w:sz w:val="32"/>
           <w:szCs w:val="32"/>
         </w:rPr>
-        <w:t>Sender ID</w:t>
+        <w:t>Created At</w:t>
       </w:r>
     </w:p>
     <w:p>
@@ -713,7 +815,7 @@
         <w:pStyle w:val="ListParagraph"/>
         <w:numPr>
           <w:ilvl w:val="0"/>
-          <w:numId w:val="4"/>
+          <w:numId w:val="10"/>
         </w:numPr>
         <w:rPr>
           <w:sz w:val="32"/>
@@ -733,6 +835,13 @@
           <w:docGrid w:linePitch="360"/>
         </w:sectPr>
       </w:pPr>
+      <w:r>
+        <w:rPr>
+          <w:sz w:val="32"/>
+          <w:szCs w:val="32"/>
+        </w:rPr>
+        <w:t>Authentication:</w:t>
+      </w:r>
     </w:p>
     <w:p>
       <w:pPr>
@@ -792,8 +901,17 @@
           <w:sz w:val="32"/>
           <w:szCs w:val="32"/>
         </w:rPr>
-        <w:t>Send Email</w:t>
-      </w:r>
+        <w:t xml:space="preserve">Login and signup with </w:t>
+      </w:r>
+      <w:proofErr w:type="spellStart"/>
+      <w:r>
+        <w:rPr>
+          <w:sz w:val="32"/>
+          <w:szCs w:val="32"/>
+        </w:rPr>
+        <w:t>gmail</w:t>
+      </w:r>
+      <w:proofErr w:type="spellEnd"/>
     </w:p>
     <w:p>
       <w:pPr>
@@ -812,14 +930,8 @@
           <w:sz w:val="32"/>
           <w:szCs w:val="32"/>
         </w:rPr>
-        <w:t>P</w:t>
-      </w:r>
-      <w:r>
-        <w:rPr>
-          <w:sz w:val="32"/>
-          <w:szCs w:val="32"/>
-        </w:rPr>
-        <w:t>rofile</w:t>
+        <w:lastRenderedPageBreak/>
+        <w:t>Rotate token</w:t>
       </w:r>
     </w:p>
     <w:p>
@@ -839,152 +951,12 @@
           <w:sz w:val="32"/>
           <w:szCs w:val="32"/>
         </w:rPr>
-        <w:t>Forget Password</w:t>
-      </w:r>
-    </w:p>
-    <w:p>
-      <w:pPr>
-        <w:pStyle w:val="ListParagraph"/>
-        <w:numPr>
-          <w:ilvl w:val="0"/>
-          <w:numId w:val="4"/>
-        </w:numPr>
-        <w:rPr>
-          <w:sz w:val="32"/>
-          <w:szCs w:val="32"/>
-        </w:rPr>
-      </w:pPr>
-      <w:r>
-        <w:rPr>
-          <w:sz w:val="32"/>
-          <w:szCs w:val="32"/>
-        </w:rPr>
-        <w:t>Update Password</w:t>
-      </w:r>
-    </w:p>
-    <w:p>
-      <w:pPr>
-        <w:pStyle w:val="ListParagraph"/>
-        <w:numPr>
-          <w:ilvl w:val="0"/>
-          <w:numId w:val="4"/>
-        </w:numPr>
-        <w:rPr>
-          <w:sz w:val="32"/>
-          <w:szCs w:val="32"/>
-        </w:rPr>
-      </w:pPr>
-      <w:r>
-        <w:rPr>
-          <w:sz w:val="32"/>
-          <w:szCs w:val="32"/>
-        </w:rPr>
-        <w:t>Update Profile</w:t>
-      </w:r>
-    </w:p>
-    <w:p>
-      <w:pPr>
-        <w:pStyle w:val="ListParagraph"/>
-        <w:numPr>
-          <w:ilvl w:val="0"/>
-          <w:numId w:val="4"/>
-        </w:numPr>
-        <w:rPr>
-          <w:sz w:val="32"/>
-          <w:szCs w:val="32"/>
-        </w:rPr>
-      </w:pPr>
-      <w:r>
-        <w:rPr>
-          <w:sz w:val="32"/>
-          <w:szCs w:val="32"/>
-        </w:rPr>
-        <w:t>Freeze Profile</w:t>
-      </w:r>
-    </w:p>
-    <w:p>
-      <w:pPr>
-        <w:pStyle w:val="ListParagraph"/>
-        <w:numPr>
-          <w:ilvl w:val="0"/>
-          <w:numId w:val="4"/>
-        </w:numPr>
-        <w:rPr>
-          <w:sz w:val="32"/>
-          <w:szCs w:val="32"/>
-        </w:rPr>
-      </w:pPr>
-      <w:r>
-        <w:rPr>
-          <w:sz w:val="32"/>
-          <w:szCs w:val="32"/>
-        </w:rPr>
-        <w:lastRenderedPageBreak/>
-        <w:t>CRUD Operations to Message model</w:t>
-      </w:r>
-    </w:p>
-    <w:p>
-      <w:pPr>
-        <w:pStyle w:val="ListParagraph"/>
-        <w:numPr>
-          <w:ilvl w:val="0"/>
-          <w:numId w:val="4"/>
-        </w:numPr>
-        <w:rPr>
-          <w:sz w:val="32"/>
-          <w:szCs w:val="32"/>
-        </w:rPr>
-      </w:pPr>
-      <w:r>
-        <w:rPr>
-          <w:sz w:val="32"/>
-          <w:szCs w:val="32"/>
-        </w:rPr>
-        <w:t>Login</w:t>
-      </w:r>
-      <w:r>
-        <w:rPr>
-          <w:sz w:val="32"/>
-          <w:szCs w:val="32"/>
-        </w:rPr>
-        <w:t xml:space="preserve"> and signup</w:t>
-      </w:r>
-      <w:r>
-        <w:rPr>
-          <w:sz w:val="32"/>
-          <w:szCs w:val="32"/>
-        </w:rPr>
-        <w:t xml:space="preserve"> with </w:t>
-      </w:r>
-      <w:proofErr w:type="spellStart"/>
-      <w:r>
-        <w:rPr>
-          <w:sz w:val="32"/>
-          <w:szCs w:val="32"/>
-        </w:rPr>
-        <w:t>gmail</w:t>
-      </w:r>
-      <w:proofErr w:type="spellEnd"/>
-    </w:p>
-    <w:p>
-      <w:pPr>
-        <w:ind w:left="360"/>
-        <w:rPr>
-          <w:sz w:val="32"/>
-          <w:szCs w:val="32"/>
-        </w:rPr>
-      </w:pPr>
-    </w:p>
-    <w:p>
-      <w:pPr>
-        <w:rPr>
-          <w:sz w:val="32"/>
-          <w:szCs w:val="32"/>
-        </w:rPr>
-      </w:pPr>
-    </w:p>
-    <w:p>
-      <w:pPr>
+        <w:t>Logout</w:t>
+      </w:r>
+    </w:p>
+    <w:p>
+      <w:pPr>
+        <w:pStyle w:val="ListParagraph"/>
         <w:rPr>
           <w:sz w:val="32"/>
           <w:szCs w:val="32"/>
@@ -1006,76 +978,301 @@
     </w:p>
     <w:p>
       <w:pPr>
-        <w:rPr>
-          <w:sz w:val="32"/>
-          <w:szCs w:val="32"/>
-        </w:rPr>
-      </w:pPr>
-    </w:p>
-    <w:p>
-      <w:pPr>
-        <w:rPr>
-          <w:b/>
-          <w:bCs/>
-          <w:sz w:val="44"/>
-          <w:szCs w:val="44"/>
-          <w:u w:val="single"/>
-        </w:rPr>
-      </w:pPr>
-    </w:p>
-    <w:p>
-      <w:pPr>
-        <w:rPr>
-          <w:b/>
-          <w:bCs/>
-          <w:sz w:val="44"/>
-          <w:szCs w:val="44"/>
-          <w:u w:val="single"/>
-        </w:rPr>
-      </w:pPr>
-    </w:p>
-    <w:p>
-      <w:pPr>
-        <w:rPr>
-          <w:b/>
-          <w:bCs/>
-          <w:sz w:val="44"/>
-          <w:szCs w:val="44"/>
-          <w:u w:val="single"/>
-        </w:rPr>
-      </w:pPr>
-    </w:p>
-    <w:p>
-      <w:pPr>
-        <w:rPr>
-          <w:b/>
-          <w:bCs/>
-          <w:sz w:val="44"/>
-          <w:szCs w:val="44"/>
-          <w:u w:val="single"/>
-        </w:rPr>
-      </w:pPr>
-    </w:p>
-    <w:p>
-      <w:pPr>
-        <w:rPr>
-          <w:b/>
-          <w:bCs/>
-          <w:sz w:val="44"/>
-          <w:szCs w:val="44"/>
-          <w:u w:val="single"/>
-        </w:rPr>
-      </w:pPr>
-    </w:p>
-    <w:p>
-      <w:pPr>
-        <w:rPr>
-          <w:b/>
-          <w:bCs/>
-          <w:sz w:val="44"/>
-          <w:szCs w:val="44"/>
-          <w:u w:val="single"/>
-        </w:rPr>
+        <w:pStyle w:val="ListParagraph"/>
+        <w:numPr>
+          <w:ilvl w:val="0"/>
+          <w:numId w:val="10"/>
+        </w:numPr>
+        <w:rPr>
+          <w:sz w:val="32"/>
+          <w:szCs w:val="32"/>
+        </w:rPr>
+      </w:pPr>
+      <w:r>
+        <w:rPr>
+          <w:sz w:val="32"/>
+          <w:szCs w:val="32"/>
+        </w:rPr>
+        <w:lastRenderedPageBreak/>
+        <w:t>User:</w:t>
+      </w:r>
+    </w:p>
+    <w:p>
+      <w:pPr>
+        <w:pStyle w:val="ListParagraph"/>
+        <w:numPr>
+          <w:ilvl w:val="0"/>
+          <w:numId w:val="11"/>
+        </w:numPr>
+        <w:rPr>
+          <w:sz w:val="32"/>
+          <w:szCs w:val="32"/>
+        </w:rPr>
+        <w:sectPr>
+          <w:type w:val="continuous"/>
+          <w:pgSz w:w="12240" w:h="15840"/>
+          <w:pgMar w:top="1440" w:right="1440" w:bottom="1440" w:left="1440" w:header="720" w:footer="720" w:gutter="0"/>
+          <w:pgBorders w:offsetFrom="page">
+            <w:top w:val="thinThickThinSmallGap" w:sz="12" w:space="24" w:color="auto"/>
+            <w:left w:val="thinThickThinSmallGap" w:sz="12" w:space="24" w:color="auto"/>
+            <w:bottom w:val="thinThickThinSmallGap" w:sz="12" w:space="24" w:color="auto"/>
+            <w:right w:val="thinThickThinSmallGap" w:sz="12" w:space="24" w:color="auto"/>
+          </w:pgBorders>
+          <w:cols w:space="720"/>
+          <w:docGrid w:linePitch="360"/>
+        </w:sectPr>
+      </w:pPr>
+    </w:p>
+    <w:p>
+      <w:pPr>
+        <w:pStyle w:val="ListParagraph"/>
+        <w:numPr>
+          <w:ilvl w:val="0"/>
+          <w:numId w:val="11"/>
+        </w:numPr>
+        <w:rPr>
+          <w:sz w:val="32"/>
+          <w:szCs w:val="32"/>
+        </w:rPr>
+      </w:pPr>
+      <w:r>
+        <w:rPr>
+          <w:sz w:val="32"/>
+          <w:szCs w:val="32"/>
+        </w:rPr>
+        <w:lastRenderedPageBreak/>
+        <w:t>P</w:t>
+      </w:r>
+      <w:r>
+        <w:rPr>
+          <w:sz w:val="32"/>
+          <w:szCs w:val="32"/>
+        </w:rPr>
+        <w:t>rofile</w:t>
+      </w:r>
+    </w:p>
+    <w:p>
+      <w:pPr>
+        <w:pStyle w:val="ListParagraph"/>
+        <w:numPr>
+          <w:ilvl w:val="0"/>
+          <w:numId w:val="11"/>
+        </w:numPr>
+        <w:rPr>
+          <w:sz w:val="32"/>
+          <w:szCs w:val="32"/>
+        </w:rPr>
+      </w:pPr>
+      <w:r>
+        <w:rPr>
+          <w:sz w:val="32"/>
+          <w:szCs w:val="32"/>
+        </w:rPr>
+        <w:t>Get all users</w:t>
+      </w:r>
+    </w:p>
+    <w:p>
+      <w:pPr>
+        <w:pStyle w:val="ListParagraph"/>
+        <w:numPr>
+          <w:ilvl w:val="0"/>
+          <w:numId w:val="11"/>
+        </w:numPr>
+        <w:rPr>
+          <w:sz w:val="32"/>
+          <w:szCs w:val="32"/>
+        </w:rPr>
+      </w:pPr>
+      <w:r>
+        <w:rPr>
+          <w:sz w:val="32"/>
+          <w:szCs w:val="32"/>
+        </w:rPr>
+        <w:lastRenderedPageBreak/>
+        <w:t>Update Profile</w:t>
+      </w:r>
+    </w:p>
+    <w:p>
+      <w:pPr>
+        <w:pStyle w:val="ListParagraph"/>
+        <w:numPr>
+          <w:ilvl w:val="0"/>
+          <w:numId w:val="11"/>
+        </w:numPr>
+        <w:rPr>
+          <w:sz w:val="32"/>
+          <w:szCs w:val="32"/>
+        </w:rPr>
+        <w:sectPr>
+          <w:type w:val="continuous"/>
+          <w:pgSz w:w="12240" w:h="15840"/>
+          <w:pgMar w:top="1440" w:right="1440" w:bottom="1440" w:left="1440" w:header="720" w:footer="720" w:gutter="0"/>
+          <w:pgBorders w:offsetFrom="page">
+            <w:top w:val="thinThickThinSmallGap" w:sz="12" w:space="24" w:color="auto"/>
+            <w:left w:val="thinThickThinSmallGap" w:sz="12" w:space="24" w:color="auto"/>
+            <w:bottom w:val="thinThickThinSmallGap" w:sz="12" w:space="24" w:color="auto"/>
+            <w:right w:val="thinThickThinSmallGap" w:sz="12" w:space="24" w:color="auto"/>
+          </w:pgBorders>
+          <w:cols w:num="2" w:space="720"/>
+          <w:docGrid w:linePitch="360"/>
+        </w:sectPr>
+      </w:pPr>
+      <w:r>
+        <w:rPr>
+          <w:sz w:val="32"/>
+          <w:szCs w:val="32"/>
+        </w:rPr>
+        <w:t>Share Profile</w:t>
+      </w:r>
+    </w:p>
+    <w:p>
+      <w:pPr>
+        <w:rPr>
+          <w:sz w:val="32"/>
+          <w:szCs w:val="32"/>
+        </w:rPr>
+        <w:sectPr>
+          <w:type w:val="continuous"/>
+          <w:pgSz w:w="12240" w:h="15840"/>
+          <w:pgMar w:top="1440" w:right="1440" w:bottom="1440" w:left="1440" w:header="720" w:footer="720" w:gutter="0"/>
+          <w:pgBorders w:offsetFrom="page">
+            <w:top w:val="thinThickThinSmallGap" w:sz="12" w:space="24" w:color="auto"/>
+            <w:left w:val="thinThickThinSmallGap" w:sz="12" w:space="24" w:color="auto"/>
+            <w:bottom w:val="thinThickThinSmallGap" w:sz="12" w:space="24" w:color="auto"/>
+            <w:right w:val="thinThickThinSmallGap" w:sz="12" w:space="24" w:color="auto"/>
+          </w:pgBorders>
+          <w:cols w:space="720"/>
+          <w:docGrid w:linePitch="360"/>
+        </w:sectPr>
+      </w:pPr>
+    </w:p>
+    <w:p>
+      <w:pPr>
+        <w:rPr>
+          <w:sz w:val="32"/>
+          <w:szCs w:val="32"/>
+        </w:rPr>
+      </w:pPr>
+    </w:p>
+    <w:p>
+      <w:pPr>
+        <w:pStyle w:val="ListParagraph"/>
+        <w:numPr>
+          <w:ilvl w:val="0"/>
+          <w:numId w:val="12"/>
+        </w:numPr>
+        <w:rPr>
+          <w:sz w:val="32"/>
+          <w:szCs w:val="32"/>
+        </w:rPr>
+      </w:pPr>
+      <w:r>
+        <w:rPr>
+          <w:sz w:val="32"/>
+          <w:szCs w:val="32"/>
+        </w:rPr>
+        <w:t>Send Email</w:t>
+      </w:r>
+    </w:p>
+    <w:p>
+      <w:pPr>
+        <w:pStyle w:val="ListParagraph"/>
+        <w:numPr>
+          <w:ilvl w:val="0"/>
+          <w:numId w:val="12"/>
+        </w:numPr>
+        <w:rPr>
+          <w:sz w:val="32"/>
+          <w:szCs w:val="32"/>
+        </w:rPr>
+      </w:pPr>
+      <w:r>
+        <w:rPr>
+          <w:sz w:val="32"/>
+          <w:szCs w:val="32"/>
+        </w:rPr>
+        <w:t>Forget Password</w:t>
+      </w:r>
+    </w:p>
+    <w:p>
+      <w:pPr>
+        <w:pStyle w:val="ListParagraph"/>
+        <w:numPr>
+          <w:ilvl w:val="0"/>
+          <w:numId w:val="12"/>
+        </w:numPr>
+        <w:rPr>
+          <w:sz w:val="32"/>
+          <w:szCs w:val="32"/>
+        </w:rPr>
+      </w:pPr>
+      <w:r>
+        <w:rPr>
+          <w:sz w:val="32"/>
+          <w:szCs w:val="32"/>
+        </w:rPr>
+        <w:t>Update Password</w:t>
+      </w:r>
+    </w:p>
+    <w:p>
+      <w:pPr>
+        <w:pStyle w:val="ListParagraph"/>
+        <w:numPr>
+          <w:ilvl w:val="0"/>
+          <w:numId w:val="12"/>
+        </w:numPr>
+        <w:rPr>
+          <w:sz w:val="32"/>
+          <w:szCs w:val="32"/>
+        </w:rPr>
+      </w:pPr>
+      <w:r>
+        <w:rPr>
+          <w:sz w:val="32"/>
+          <w:szCs w:val="32"/>
+        </w:rPr>
+        <w:t>Freeze Profile</w:t>
+      </w:r>
+    </w:p>
+    <w:p>
+      <w:pPr>
+        <w:pStyle w:val="ListParagraph"/>
+        <w:numPr>
+          <w:ilvl w:val="0"/>
+          <w:numId w:val="12"/>
+        </w:numPr>
+        <w:rPr>
+          <w:sz w:val="32"/>
+          <w:szCs w:val="32"/>
+        </w:rPr>
+      </w:pPr>
+      <w:r>
+        <w:rPr>
+          <w:sz w:val="32"/>
+          <w:szCs w:val="32"/>
+        </w:rPr>
+        <w:t>CRUD Operations to Message model</w:t>
+      </w:r>
+    </w:p>
+    <w:p>
+      <w:pPr>
+        <w:rPr>
+          <w:sz w:val="32"/>
+          <w:szCs w:val="32"/>
+        </w:rPr>
+        <w:sectPr>
+          <w:type w:val="continuous"/>
+          <w:pgSz w:w="12240" w:h="15840"/>
+          <w:pgMar w:top="1440" w:right="1440" w:bottom="1440" w:left="1440" w:header="720" w:footer="720" w:gutter="0"/>
+          <w:pgBorders w:offsetFrom="page">
+            <w:top w:val="thinThickThinSmallGap" w:sz="12" w:space="24" w:color="auto"/>
+            <w:left w:val="thinThickThinSmallGap" w:sz="12" w:space="24" w:color="auto"/>
+            <w:bottom w:val="thinThickThinSmallGap" w:sz="12" w:space="24" w:color="auto"/>
+            <w:right w:val="thinThickThinSmallGap" w:sz="12" w:space="24" w:color="auto"/>
+          </w:pgBorders>
+          <w:cols w:space="720"/>
+          <w:docGrid w:linePitch="360"/>
+        </w:sectPr>
       </w:pPr>
     </w:p>
     <w:p>
@@ -2029,6 +2226,95 @@
     </w:lvl>
   </w:abstractNum>
   <w:abstractNum w:abstractNumId="2" w15:restartNumberingAfterBreak="0">
+    <w:nsid w:val="19E520F8"/>
+    <w:multiLevelType w:val="hybridMultilevel"/>
+    <w:tmpl w:val="174E6598"/>
+    <w:lvl w:ilvl="0" w:tplc="04090001">
+      <w:start w:val="1"/>
+      <w:numFmt w:val="bullet"/>
+      <w:lvlText w:val=""/>
+      <w:lvlJc w:val="left"/>
+      <w:pPr>
+        <w:ind w:left="1440" w:hanging="360"/>
+      </w:pPr>
+      <w:rPr>
+        <w:rFonts w:ascii="Symbol" w:hAnsi="Symbol" w:hint="default"/>
+      </w:rPr>
+    </w:lvl>
+    <w:lvl w:ilvl="1" w:tplc="04090019" w:tentative="1">
+      <w:start w:val="1"/>
+      <w:numFmt w:val="lowerLetter"/>
+      <w:lvlText w:val="%2."/>
+      <w:lvlJc w:val="left"/>
+      <w:pPr>
+        <w:ind w:left="2160" w:hanging="360"/>
+      </w:pPr>
+    </w:lvl>
+    <w:lvl w:ilvl="2" w:tplc="0409001B" w:tentative="1">
+      <w:start w:val="1"/>
+      <w:numFmt w:val="lowerRoman"/>
+      <w:lvlText w:val="%3."/>
+      <w:lvlJc w:val="right"/>
+      <w:pPr>
+        <w:ind w:left="2880" w:hanging="180"/>
+      </w:pPr>
+    </w:lvl>
+    <w:lvl w:ilvl="3" w:tplc="0409000F" w:tentative="1">
+      <w:start w:val="1"/>
+      <w:numFmt w:val="decimal"/>
+      <w:lvlText w:val="%4."/>
+      <w:lvlJc w:val="left"/>
+      <w:pPr>
+        <w:ind w:left="3600" w:hanging="360"/>
+      </w:pPr>
+    </w:lvl>
+    <w:lvl w:ilvl="4" w:tplc="04090019" w:tentative="1">
+      <w:start w:val="1"/>
+      <w:numFmt w:val="lowerLetter"/>
+      <w:lvlText w:val="%5."/>
+      <w:lvlJc w:val="left"/>
+      <w:pPr>
+        <w:ind w:left="4320" w:hanging="360"/>
+      </w:pPr>
+    </w:lvl>
+    <w:lvl w:ilvl="5" w:tplc="0409001B" w:tentative="1">
+      <w:start w:val="1"/>
+      <w:numFmt w:val="lowerRoman"/>
+      <w:lvlText w:val="%6."/>
+      <w:lvlJc w:val="right"/>
+      <w:pPr>
+        <w:ind w:left="5040" w:hanging="180"/>
+      </w:pPr>
+    </w:lvl>
+    <w:lvl w:ilvl="6" w:tplc="0409000F" w:tentative="1">
+      <w:start w:val="1"/>
+      <w:numFmt w:val="decimal"/>
+      <w:lvlText w:val="%7."/>
+      <w:lvlJc w:val="left"/>
+      <w:pPr>
+        <w:ind w:left="5760" w:hanging="360"/>
+      </w:pPr>
+    </w:lvl>
+    <w:lvl w:ilvl="7" w:tplc="04090019" w:tentative="1">
+      <w:start w:val="1"/>
+      <w:numFmt w:val="lowerLetter"/>
+      <w:lvlText w:val="%8."/>
+      <w:lvlJc w:val="left"/>
+      <w:pPr>
+        <w:ind w:left="6480" w:hanging="360"/>
+      </w:pPr>
+    </w:lvl>
+    <w:lvl w:ilvl="8" w:tplc="0409001B" w:tentative="1">
+      <w:start w:val="1"/>
+      <w:numFmt w:val="lowerRoman"/>
+      <w:lvlText w:val="%9."/>
+      <w:lvlJc w:val="right"/>
+      <w:pPr>
+        <w:ind w:left="7200" w:hanging="180"/>
+      </w:pPr>
+    </w:lvl>
+  </w:abstractNum>
+  <w:abstractNum w:abstractNumId="3" w15:restartNumberingAfterBreak="0">
     <w:nsid w:val="2C8D58AC"/>
     <w:multiLevelType w:val="hybridMultilevel"/>
     <w:tmpl w:val="16EA9878"/>
@@ -2141,7 +2427,96 @@
       </w:rPr>
     </w:lvl>
   </w:abstractNum>
-  <w:abstractNum w:abstractNumId="3" w15:restartNumberingAfterBreak="0">
+  <w:abstractNum w:abstractNumId="4" w15:restartNumberingAfterBreak="0">
+    <w:nsid w:val="352E6D4D"/>
+    <w:multiLevelType w:val="hybridMultilevel"/>
+    <w:tmpl w:val="314E0254"/>
+    <w:lvl w:ilvl="0" w:tplc="FAE0E4E8">
+      <w:start w:val="1"/>
+      <w:numFmt w:val="decimal"/>
+      <w:lvlText w:val="%1-"/>
+      <w:lvlJc w:val="left"/>
+      <w:pPr>
+        <w:ind w:left="1530" w:hanging="405"/>
+      </w:pPr>
+      <w:rPr>
+        <w:rFonts w:hint="default"/>
+      </w:rPr>
+    </w:lvl>
+    <w:lvl w:ilvl="1" w:tplc="04090019" w:tentative="1">
+      <w:start w:val="1"/>
+      <w:numFmt w:val="lowerLetter"/>
+      <w:lvlText w:val="%2."/>
+      <w:lvlJc w:val="left"/>
+      <w:pPr>
+        <w:ind w:left="2205" w:hanging="360"/>
+      </w:pPr>
+    </w:lvl>
+    <w:lvl w:ilvl="2" w:tplc="0409001B" w:tentative="1">
+      <w:start w:val="1"/>
+      <w:numFmt w:val="lowerRoman"/>
+      <w:lvlText w:val="%3."/>
+      <w:lvlJc w:val="right"/>
+      <w:pPr>
+        <w:ind w:left="2925" w:hanging="180"/>
+      </w:pPr>
+    </w:lvl>
+    <w:lvl w:ilvl="3" w:tplc="0409000F" w:tentative="1">
+      <w:start w:val="1"/>
+      <w:numFmt w:val="decimal"/>
+      <w:lvlText w:val="%4."/>
+      <w:lvlJc w:val="left"/>
+      <w:pPr>
+        <w:ind w:left="3645" w:hanging="360"/>
+      </w:pPr>
+    </w:lvl>
+    <w:lvl w:ilvl="4" w:tplc="04090019" w:tentative="1">
+      <w:start w:val="1"/>
+      <w:numFmt w:val="lowerLetter"/>
+      <w:lvlText w:val="%5."/>
+      <w:lvlJc w:val="left"/>
+      <w:pPr>
+        <w:ind w:left="4365" w:hanging="360"/>
+      </w:pPr>
+    </w:lvl>
+    <w:lvl w:ilvl="5" w:tplc="0409001B" w:tentative="1">
+      <w:start w:val="1"/>
+      <w:numFmt w:val="lowerRoman"/>
+      <w:lvlText w:val="%6."/>
+      <w:lvlJc w:val="right"/>
+      <w:pPr>
+        <w:ind w:left="5085" w:hanging="180"/>
+      </w:pPr>
+    </w:lvl>
+    <w:lvl w:ilvl="6" w:tplc="0409000F" w:tentative="1">
+      <w:start w:val="1"/>
+      <w:numFmt w:val="decimal"/>
+      <w:lvlText w:val="%7."/>
+      <w:lvlJc w:val="left"/>
+      <w:pPr>
+        <w:ind w:left="5805" w:hanging="360"/>
+      </w:pPr>
+    </w:lvl>
+    <w:lvl w:ilvl="7" w:tplc="04090019" w:tentative="1">
+      <w:start w:val="1"/>
+      <w:numFmt w:val="lowerLetter"/>
+      <w:lvlText w:val="%8."/>
+      <w:lvlJc w:val="left"/>
+      <w:pPr>
+        <w:ind w:left="6525" w:hanging="360"/>
+      </w:pPr>
+    </w:lvl>
+    <w:lvl w:ilvl="8" w:tplc="0409001B" w:tentative="1">
+      <w:start w:val="1"/>
+      <w:numFmt w:val="lowerRoman"/>
+      <w:lvlText w:val="%9."/>
+      <w:lvlJc w:val="right"/>
+      <w:pPr>
+        <w:ind w:left="7245" w:hanging="180"/>
+      </w:pPr>
+    </w:lvl>
+  </w:abstractNum>
+  <w:abstractNum w:abstractNumId="5" w15:restartNumberingAfterBreak="0">
     <w:nsid w:val="3D841E73"/>
     <w:multiLevelType w:val="hybridMultilevel"/>
     <w:tmpl w:val="BD82B55A"/>
@@ -2254,7 +2629,7 @@
       </w:rPr>
     </w:lvl>
   </w:abstractNum>
-  <w:abstractNum w:abstractNumId="4" w15:restartNumberingAfterBreak="0">
+  <w:abstractNum w:abstractNumId="6" w15:restartNumberingAfterBreak="0">
     <w:nsid w:val="42963C0F"/>
     <w:multiLevelType w:val="hybridMultilevel"/>
     <w:tmpl w:val="AEF43D50"/>
@@ -2367,7 +2742,7 @@
       </w:rPr>
     </w:lvl>
   </w:abstractNum>
-  <w:abstractNum w:abstractNumId="5" w15:restartNumberingAfterBreak="0">
+  <w:abstractNum w:abstractNumId="7" w15:restartNumberingAfterBreak="0">
     <w:nsid w:val="51183EA0"/>
     <w:multiLevelType w:val="hybridMultilevel"/>
     <w:tmpl w:val="A2DC844C"/>
@@ -2377,7 +2752,7 @@
       <w:lvlText w:val="%1-"/>
       <w:lvlJc w:val="left"/>
       <w:pPr>
-        <w:ind w:left="720" w:hanging="360"/>
+        <w:ind w:left="1440" w:hanging="360"/>
       </w:pPr>
       <w:rPr>
         <w:rFonts w:hint="default"/>
@@ -2389,7 +2764,7 @@
       <w:lvlText w:val="%2."/>
       <w:lvlJc w:val="left"/>
       <w:pPr>
-        <w:ind w:left="1440" w:hanging="360"/>
+        <w:ind w:left="2160" w:hanging="360"/>
       </w:pPr>
     </w:lvl>
     <w:lvl w:ilvl="2" w:tplc="0409001B" w:tentative="1">
@@ -2398,7 +2773,7 @@
       <w:lvlText w:val="%3."/>
       <w:lvlJc w:val="right"/>
       <w:pPr>
-        <w:ind w:left="2160" w:hanging="180"/>
+        <w:ind w:left="2880" w:hanging="180"/>
       </w:pPr>
     </w:lvl>
     <w:lvl w:ilvl="3" w:tplc="0409000F" w:tentative="1">
@@ -2407,7 +2782,7 @@
       <w:lvlText w:val="%4."/>
       <w:lvlJc w:val="left"/>
       <w:pPr>
-        <w:ind w:left="2880" w:hanging="360"/>
+        <w:ind w:left="3600" w:hanging="360"/>
       </w:pPr>
     </w:lvl>
     <w:lvl w:ilvl="4" w:tplc="04090019" w:tentative="1">
@@ -2416,7 +2791,7 @@
       <w:lvlText w:val="%5."/>
       <w:lvlJc w:val="left"/>
       <w:pPr>
-        <w:ind w:left="3600" w:hanging="360"/>
+        <w:ind w:left="4320" w:hanging="360"/>
       </w:pPr>
     </w:lvl>
     <w:lvl w:ilvl="5" w:tplc="0409001B" w:tentative="1">
@@ -2425,7 +2800,7 @@
       <w:lvlText w:val="%6."/>
       <w:lvlJc w:val="right"/>
       <w:pPr>
-        <w:ind w:left="4320" w:hanging="180"/>
+        <w:ind w:left="5040" w:hanging="180"/>
       </w:pPr>
     </w:lvl>
     <w:lvl w:ilvl="6" w:tplc="0409000F" w:tentative="1">
@@ -2434,7 +2809,7 @@
       <w:lvlText w:val="%7."/>
       <w:lvlJc w:val="left"/>
       <w:pPr>
-        <w:ind w:left="5040" w:hanging="360"/>
+        <w:ind w:left="5760" w:hanging="360"/>
       </w:pPr>
     </w:lvl>
     <w:lvl w:ilvl="7" w:tplc="04090019" w:tentative="1">
@@ -2443,7 +2818,7 @@
       <w:lvlText w:val="%8."/>
       <w:lvlJc w:val="left"/>
       <w:pPr>
-        <w:ind w:left="5760" w:hanging="360"/>
+        <w:ind w:left="6480" w:hanging="360"/>
       </w:pPr>
     </w:lvl>
     <w:lvl w:ilvl="8" w:tplc="0409001B" w:tentative="1">
@@ -2452,11 +2827,124 @@
       <w:lvlText w:val="%9."/>
       <w:lvlJc w:val="right"/>
       <w:pPr>
-        <w:ind w:left="6480" w:hanging="180"/>
+        <w:ind w:left="7200" w:hanging="180"/>
       </w:pPr>
     </w:lvl>
   </w:abstractNum>
-  <w:abstractNum w:abstractNumId="6" w15:restartNumberingAfterBreak="0">
+  <w:abstractNum w:abstractNumId="8" w15:restartNumberingAfterBreak="0">
+    <w:nsid w:val="632A02E2"/>
+    <w:multiLevelType w:val="hybridMultilevel"/>
+    <w:tmpl w:val="A30A4E5C"/>
+    <w:lvl w:ilvl="0" w:tplc="04090001">
+      <w:start w:val="1"/>
+      <w:numFmt w:val="bullet"/>
+      <w:lvlText w:val=""/>
+      <w:lvlJc w:val="left"/>
+      <w:pPr>
+        <w:ind w:left="720" w:hanging="360"/>
+      </w:pPr>
+      <w:rPr>
+        <w:rFonts w:ascii="Symbol" w:hAnsi="Symbol" w:hint="default"/>
+      </w:rPr>
+    </w:lvl>
+    <w:lvl w:ilvl="1" w:tplc="04090003" w:tentative="1">
+      <w:start w:val="1"/>
+      <w:numFmt w:val="bullet"/>
+      <w:lvlText w:val="o"/>
+      <w:lvlJc w:val="left"/>
+      <w:pPr>
+        <w:ind w:left="1440" w:hanging="360"/>
+      </w:pPr>
+      <w:rPr>
+        <w:rFonts w:ascii="Courier New" w:hAnsi="Courier New" w:cs="Courier New" w:hint="default"/>
+      </w:rPr>
+    </w:lvl>
+    <w:lvl w:ilvl="2" w:tplc="04090005" w:tentative="1">
+      <w:start w:val="1"/>
+      <w:numFmt w:val="bullet"/>
+      <w:lvlText w:val=""/>
+      <w:lvlJc w:val="left"/>
+      <w:pPr>
+        <w:ind w:left="2160" w:hanging="360"/>
+      </w:pPr>
+      <w:rPr>
+        <w:rFonts w:ascii="Wingdings" w:hAnsi="Wingdings" w:hint="default"/>
+      </w:rPr>
+    </w:lvl>
+    <w:lvl w:ilvl="3" w:tplc="04090001" w:tentative="1">
+      <w:start w:val="1"/>
+      <w:numFmt w:val="bullet"/>
+      <w:lvlText w:val=""/>
+      <w:lvlJc w:val="left"/>
+      <w:pPr>
+        <w:ind w:left="2880" w:hanging="360"/>
+      </w:pPr>
+      <w:rPr>
+        <w:rFonts w:ascii="Symbol" w:hAnsi="Symbol" w:hint="default"/>
+      </w:rPr>
+    </w:lvl>
+    <w:lvl w:ilvl="4" w:tplc="04090003" w:tentative="1">
+      <w:start w:val="1"/>
+      <w:numFmt w:val="bullet"/>
+      <w:lvlText w:val="o"/>
+      <w:lvlJc w:val="left"/>
+      <w:pPr>
+        <w:ind w:left="3600" w:hanging="360"/>
+      </w:pPr>
+      <w:rPr>
+        <w:rFonts w:ascii="Courier New" w:hAnsi="Courier New" w:cs="Courier New" w:hint="default"/>
+      </w:rPr>
+    </w:lvl>
+    <w:lvl w:ilvl="5" w:tplc="04090005" w:tentative="1">
+      <w:start w:val="1"/>
+      <w:numFmt w:val="bullet"/>
+      <w:lvlText w:val=""/>
+      <w:lvlJc w:val="left"/>
+      <w:pPr>
+        <w:ind w:left="4320" w:hanging="360"/>
+      </w:pPr>
+      <w:rPr>
+        <w:rFonts w:ascii="Wingdings" w:hAnsi="Wingdings" w:hint="default"/>
+      </w:rPr>
+    </w:lvl>
+    <w:lvl w:ilvl="6" w:tplc="04090001" w:tentative="1">
+      <w:start w:val="1"/>
+      <w:numFmt w:val="bullet"/>
+      <w:lvlText w:val=""/>
+      <w:lvlJc w:val="left"/>
+      <w:pPr>
+        <w:ind w:left="5040" w:hanging="360"/>
+      </w:pPr>
+      <w:rPr>
+        <w:rFonts w:ascii="Symbol" w:hAnsi="Symbol" w:hint="default"/>
+      </w:rPr>
+    </w:lvl>
+    <w:lvl w:ilvl="7" w:tplc="04090003" w:tentative="1">
+      <w:start w:val="1"/>
+      <w:numFmt w:val="bullet"/>
+      <w:lvlText w:val="o"/>
+      <w:lvlJc w:val="left"/>
+      <w:pPr>
+        <w:ind w:left="5760" w:hanging="360"/>
+      </w:pPr>
+      <w:rPr>
+        <w:rFonts w:ascii="Courier New" w:hAnsi="Courier New" w:cs="Courier New" w:hint="default"/>
+      </w:rPr>
+    </w:lvl>
+    <w:lvl w:ilvl="8" w:tplc="04090005" w:tentative="1">
+      <w:start w:val="1"/>
+      <w:numFmt w:val="bullet"/>
+      <w:lvlText w:val=""/>
+      <w:lvlJc w:val="left"/>
+      <w:pPr>
+        <w:ind w:left="6480" w:hanging="360"/>
+      </w:pPr>
+      <w:rPr>
+        <w:rFonts w:ascii="Wingdings" w:hAnsi="Wingdings" w:hint="default"/>
+      </w:rPr>
+    </w:lvl>
+  </w:abstractNum>
+  <w:abstractNum w:abstractNumId="9" w15:restartNumberingAfterBreak="0">
     <w:nsid w:val="69DC7116"/>
     <w:multiLevelType w:val="hybridMultilevel"/>
     <w:tmpl w:val="31282D18"/>
@@ -2569,7 +3057,7 @@
       </w:rPr>
     </w:lvl>
   </w:abstractNum>
-  <w:abstractNum w:abstractNumId="7" w15:restartNumberingAfterBreak="0">
+  <w:abstractNum w:abstractNumId="10" w15:restartNumberingAfterBreak="0">
     <w:nsid w:val="7C2F769B"/>
     <w:multiLevelType w:val="hybridMultilevel"/>
     <w:tmpl w:val="B4C09DE0"/>
@@ -2682,10 +3170,10 @@
       </w:rPr>
     </w:lvl>
   </w:abstractNum>
-  <w:abstractNum w:abstractNumId="8" w15:restartNumberingAfterBreak="0">
+  <w:abstractNum w:abstractNumId="11" w15:restartNumberingAfterBreak="0">
     <w:nsid w:val="7FC577D0"/>
     <w:multiLevelType w:val="hybridMultilevel"/>
-    <w:tmpl w:val="6CE030A4"/>
+    <w:tmpl w:val="3484347A"/>
     <w:lvl w:ilvl="0" w:tplc="0409000F">
       <w:start w:val="1"/>
       <w:numFmt w:val="decimal"/>
@@ -2695,7 +3183,7 @@
         <w:ind w:left="720" w:hanging="360"/>
       </w:pPr>
     </w:lvl>
-    <w:lvl w:ilvl="1" w:tplc="04090019" w:tentative="1">
+    <w:lvl w:ilvl="1" w:tplc="04090019">
       <w:start w:val="1"/>
       <w:numFmt w:val="lowerLetter"/>
       <w:lvlText w:val="%2."/>
@@ -2769,16 +3257,16 @@
     </w:lvl>
   </w:abstractNum>
   <w:num w:numId="1">
-    <w:abstractNumId w:val="8"/>
+    <w:abstractNumId w:val="11"/>
   </w:num>
   <w:num w:numId="2">
-    <w:abstractNumId w:val="6"/>
+    <w:abstractNumId w:val="9"/>
   </w:num>
   <w:num w:numId="3">
-    <w:abstractNumId w:val="7"/>
+    <w:abstractNumId w:val="10"/>
   </w:num>
   <w:num w:numId="4">
-    <w:abstractNumId w:val="5"/>
+    <w:abstractNumId w:val="7"/>
   </w:num>
   <w:num w:numId="5">
     <w:abstractNumId w:val="1"/>
@@ -2787,13 +3275,22 @@
     <w:abstractNumId w:val="0"/>
   </w:num>
   <w:num w:numId="7">
+    <w:abstractNumId w:val="5"/>
+  </w:num>
+  <w:num w:numId="8">
     <w:abstractNumId w:val="3"/>
   </w:num>
-  <w:num w:numId="8">
+  <w:num w:numId="9">
+    <w:abstractNumId w:val="6"/>
+  </w:num>
+  <w:num w:numId="10">
+    <w:abstractNumId w:val="8"/>
+  </w:num>
+  <w:num w:numId="11">
+    <w:abstractNumId w:val="4"/>
+  </w:num>
+  <w:num w:numId="12">
     <w:abstractNumId w:val="2"/>
-  </w:num>
-  <w:num w:numId="9">
-    <w:abstractNumId w:val="4"/>
   </w:num>
 </w:numbering>
 </file>
@@ -3499,7 +3996,7 @@
 </file>
 
 <file path=customXml/itemProps1.xml><?xml version="1.0" encoding="utf-8"?>
-<ds:datastoreItem xmlns:ds="http://schemas.openxmlformats.org/officeDocument/2006/customXml" ds:itemID="{C8B43FC5-5D53-44B0-9003-5F87AE30AFB8}">
+<ds:datastoreItem xmlns:ds="http://schemas.openxmlformats.org/officeDocument/2006/customXml" ds:itemID="{5652BE9D-5331-4093-9ECB-3D2994C73815}">
   <ds:schemaRefs>
     <ds:schemaRef ds:uri="http://schemas.openxmlformats.org/officeDocument/2006/bibliography"/>
   </ds:schemaRefs>

</xml_diff>

<commit_message>
feat (sendEmail): add send email with otp to (signup + login + forgot password + 2 step verification)
</commit_message>
<xml_diff>
--- a/Requirenments.docx
+++ b/Requirenments.docx
@@ -100,6 +100,196 @@
           <w:docGrid w:linePitch="360"/>
         </w:sectPr>
       </w:pPr>
+    </w:p>
+    <w:p>
+      <w:pPr>
+        <w:pStyle w:val="ListParagraph"/>
+        <w:numPr>
+          <w:ilvl w:val="0"/>
+          <w:numId w:val="2"/>
+        </w:numPr>
+        <w:rPr>
+          <w:sz w:val="32"/>
+          <w:szCs w:val="32"/>
+        </w:rPr>
+      </w:pPr>
+      <w:r>
+        <w:rPr>
+          <w:sz w:val="32"/>
+          <w:szCs w:val="32"/>
+        </w:rPr>
+        <w:lastRenderedPageBreak/>
+        <w:t>First n</w:t>
+      </w:r>
+      <w:r>
+        <w:rPr>
+          <w:sz w:val="32"/>
+          <w:szCs w:val="32"/>
+        </w:rPr>
+        <w:t>ame</w:t>
+      </w:r>
+    </w:p>
+    <w:p>
+      <w:pPr>
+        <w:pStyle w:val="ListParagraph"/>
+        <w:numPr>
+          <w:ilvl w:val="0"/>
+          <w:numId w:val="2"/>
+        </w:numPr>
+        <w:rPr>
+          <w:sz w:val="32"/>
+          <w:szCs w:val="32"/>
+        </w:rPr>
+      </w:pPr>
+      <w:r>
+        <w:rPr>
+          <w:sz w:val="32"/>
+          <w:szCs w:val="32"/>
+        </w:rPr>
+        <w:t>L</w:t>
+      </w:r>
+      <w:r>
+        <w:rPr>
+          <w:sz w:val="32"/>
+          <w:szCs w:val="32"/>
+        </w:rPr>
+        <w:t>ast</w:t>
+      </w:r>
+      <w:r>
+        <w:rPr>
+          <w:sz w:val="32"/>
+          <w:szCs w:val="32"/>
+        </w:rPr>
+        <w:t xml:space="preserve"> </w:t>
+      </w:r>
+      <w:r>
+        <w:rPr>
+          <w:sz w:val="32"/>
+          <w:szCs w:val="32"/>
+        </w:rPr>
+        <w:t>Name</w:t>
+      </w:r>
+    </w:p>
+    <w:p>
+      <w:pPr>
+        <w:pStyle w:val="ListParagraph"/>
+        <w:numPr>
+          <w:ilvl w:val="0"/>
+          <w:numId w:val="2"/>
+        </w:numPr>
+        <w:rPr>
+          <w:sz w:val="32"/>
+          <w:szCs w:val="32"/>
+        </w:rPr>
+      </w:pPr>
+      <w:r>
+        <w:rPr>
+          <w:sz w:val="32"/>
+          <w:szCs w:val="32"/>
+        </w:rPr>
+        <w:t>u</w:t>
+      </w:r>
+      <w:r>
+        <w:rPr>
+          <w:sz w:val="32"/>
+          <w:szCs w:val="32"/>
+        </w:rPr>
+        <w:t>sername</w:t>
+      </w:r>
+    </w:p>
+    <w:p>
+      <w:pPr>
+        <w:pStyle w:val="ListParagraph"/>
+        <w:numPr>
+          <w:ilvl w:val="0"/>
+          <w:numId w:val="2"/>
+        </w:numPr>
+        <w:rPr>
+          <w:sz w:val="32"/>
+          <w:szCs w:val="32"/>
+        </w:rPr>
+      </w:pPr>
+      <w:r>
+        <w:rPr>
+          <w:sz w:val="32"/>
+          <w:szCs w:val="32"/>
+        </w:rPr>
+        <w:t>e</w:t>
+      </w:r>
+      <w:r>
+        <w:rPr>
+          <w:sz w:val="32"/>
+          <w:szCs w:val="32"/>
+        </w:rPr>
+        <w:t>mail</w:t>
+      </w:r>
+    </w:p>
+    <w:p>
+      <w:pPr>
+        <w:pStyle w:val="ListParagraph"/>
+        <w:numPr>
+          <w:ilvl w:val="0"/>
+          <w:numId w:val="2"/>
+        </w:numPr>
+        <w:rPr>
+          <w:sz w:val="32"/>
+          <w:szCs w:val="32"/>
+        </w:rPr>
+      </w:pPr>
+      <w:r>
+        <w:rPr>
+          <w:sz w:val="32"/>
+          <w:szCs w:val="32"/>
+        </w:rPr>
+        <w:t>p</w:t>
+      </w:r>
+      <w:r>
+        <w:rPr>
+          <w:sz w:val="32"/>
+          <w:szCs w:val="32"/>
+        </w:rPr>
+        <w:t>assword</w:t>
+      </w:r>
+    </w:p>
+    <w:p>
+      <w:pPr>
+        <w:pStyle w:val="ListParagraph"/>
+        <w:numPr>
+          <w:ilvl w:val="0"/>
+          <w:numId w:val="2"/>
+        </w:numPr>
+        <w:rPr>
+          <w:sz w:val="32"/>
+          <w:szCs w:val="32"/>
+        </w:rPr>
+      </w:pPr>
+      <w:r>
+        <w:rPr>
+          <w:sz w:val="32"/>
+          <w:szCs w:val="32"/>
+        </w:rPr>
+        <w:t>phone</w:t>
+      </w:r>
+    </w:p>
+    <w:p>
+      <w:pPr>
+        <w:pStyle w:val="ListParagraph"/>
+        <w:numPr>
+          <w:ilvl w:val="0"/>
+          <w:numId w:val="2"/>
+        </w:numPr>
+        <w:rPr>
+          <w:sz w:val="32"/>
+          <w:szCs w:val="32"/>
+        </w:rPr>
+      </w:pPr>
+      <w:r>
+        <w:rPr>
+          <w:sz w:val="32"/>
+          <w:szCs w:val="32"/>
+        </w:rPr>
+        <w:t>DOB</w:t>
+      </w:r>
       <w:bookmarkStart w:id="0" w:name="_GoBack"/>
       <w:bookmarkEnd w:id="0"/>
     </w:p>
@@ -120,15 +310,137 @@
           <w:sz w:val="32"/>
           <w:szCs w:val="32"/>
         </w:rPr>
+        <w:t>C</w:t>
+      </w:r>
+      <w:r>
+        <w:rPr>
+          <w:sz w:val="32"/>
+          <w:szCs w:val="32"/>
+        </w:rPr>
+        <w:t>onfirm</w:t>
+      </w:r>
+      <w:r>
+        <w:rPr>
+          <w:sz w:val="32"/>
+          <w:szCs w:val="32"/>
+        </w:rPr>
+        <w:t xml:space="preserve"> </w:t>
+      </w:r>
+      <w:r>
+        <w:rPr>
+          <w:sz w:val="32"/>
+          <w:szCs w:val="32"/>
+        </w:rPr>
+        <w:t xml:space="preserve">Email </w:t>
+      </w:r>
+    </w:p>
+    <w:p>
+      <w:pPr>
+        <w:pStyle w:val="ListParagraph"/>
+        <w:numPr>
+          <w:ilvl w:val="0"/>
+          <w:numId w:val="2"/>
+        </w:numPr>
+        <w:rPr>
+          <w:sz w:val="32"/>
+          <w:szCs w:val="32"/>
+        </w:rPr>
+      </w:pPr>
+      <w:r>
+        <w:rPr>
+          <w:sz w:val="32"/>
+          <w:szCs w:val="32"/>
+        </w:rPr>
+        <w:t>image</w:t>
+      </w:r>
+    </w:p>
+    <w:p>
+      <w:pPr>
+        <w:pStyle w:val="ListParagraph"/>
+        <w:numPr>
+          <w:ilvl w:val="0"/>
+          <w:numId w:val="2"/>
+        </w:numPr>
+        <w:rPr>
+          <w:sz w:val="32"/>
+          <w:szCs w:val="32"/>
+        </w:rPr>
+      </w:pPr>
+      <w:r>
+        <w:rPr>
+          <w:sz w:val="32"/>
+          <w:szCs w:val="32"/>
+        </w:rPr>
+        <w:t>C</w:t>
+      </w:r>
+      <w:r>
+        <w:rPr>
+          <w:sz w:val="32"/>
+          <w:szCs w:val="32"/>
+        </w:rPr>
+        <w:t>over</w:t>
+      </w:r>
+      <w:r>
+        <w:rPr>
+          <w:sz w:val="32"/>
+          <w:szCs w:val="32"/>
+        </w:rPr>
+        <w:t xml:space="preserve"> </w:t>
+      </w:r>
+      <w:r>
+        <w:rPr>
+          <w:sz w:val="32"/>
+          <w:szCs w:val="32"/>
+        </w:rPr>
+        <w:t>Image</w:t>
+      </w:r>
+    </w:p>
+    <w:p>
+      <w:pPr>
+        <w:pStyle w:val="ListParagraph"/>
+        <w:numPr>
+          <w:ilvl w:val="0"/>
+          <w:numId w:val="2"/>
+        </w:numPr>
+        <w:rPr>
+          <w:sz w:val="32"/>
+          <w:szCs w:val="32"/>
+        </w:rPr>
+      </w:pPr>
+      <w:r>
+        <w:rPr>
+          <w:sz w:val="32"/>
+          <w:szCs w:val="32"/>
+        </w:rPr>
+        <w:t>gender (0=&gt; male, 1 =&gt; female)</w:t>
+      </w:r>
+    </w:p>
+    <w:p>
+      <w:pPr>
+        <w:pStyle w:val="ListParagraph"/>
+        <w:numPr>
+          <w:ilvl w:val="0"/>
+          <w:numId w:val="2"/>
+        </w:numPr>
+        <w:rPr>
+          <w:sz w:val="32"/>
+          <w:szCs w:val="32"/>
+        </w:rPr>
+      </w:pPr>
+      <w:r>
+        <w:rPr>
+          <w:sz w:val="32"/>
+          <w:szCs w:val="32"/>
+        </w:rPr>
         <w:lastRenderedPageBreak/>
-        <w:t>First n</w:t>
-      </w:r>
-      <w:r>
-        <w:rPr>
-          <w:sz w:val="32"/>
-          <w:szCs w:val="32"/>
-        </w:rPr>
-        <w:t>ame</w:t>
+        <w:t>role</w:t>
+      </w:r>
+      <w:r>
+        <w:rPr>
+          <w:sz w:val="32"/>
+          <w:szCs w:val="32"/>
+        </w:rPr>
+        <w:t xml:space="preserve"> (0=&gt; user, 1=&gt; admin)</w:t>
       </w:r>
     </w:p>
     <w:p>
@@ -148,14 +460,27 @@
           <w:sz w:val="32"/>
           <w:szCs w:val="32"/>
         </w:rPr>
-        <w:t>L</w:t>
-      </w:r>
-      <w:r>
-        <w:rPr>
-          <w:sz w:val="32"/>
-          <w:szCs w:val="32"/>
-        </w:rPr>
-        <w:t>ast</w:t>
+        <w:t>provider (0=&gt; System, 1=&gt; google)</w:t>
+      </w:r>
+    </w:p>
+    <w:p>
+      <w:pPr>
+        <w:pStyle w:val="ListParagraph"/>
+        <w:numPr>
+          <w:ilvl w:val="0"/>
+          <w:numId w:val="2"/>
+        </w:numPr>
+        <w:rPr>
+          <w:sz w:val="32"/>
+          <w:szCs w:val="32"/>
+        </w:rPr>
+      </w:pPr>
+      <w:r>
+        <w:rPr>
+          <w:sz w:val="32"/>
+          <w:szCs w:val="32"/>
+        </w:rPr>
+        <w:t>change</w:t>
       </w:r>
       <w:r>
         <w:rPr>
@@ -169,7 +494,21 @@
           <w:sz w:val="32"/>
           <w:szCs w:val="32"/>
         </w:rPr>
-        <w:t>Name</w:t>
+        <w:t>Credentials</w:t>
+      </w:r>
+      <w:r>
+        <w:rPr>
+          <w:sz w:val="32"/>
+          <w:szCs w:val="32"/>
+        </w:rPr>
+        <w:t xml:space="preserve"> </w:t>
+      </w:r>
+      <w:r>
+        <w:rPr>
+          <w:sz w:val="32"/>
+          <w:szCs w:val="32"/>
+        </w:rPr>
+        <w:t>Time</w:t>
       </w:r>
     </w:p>
     <w:p>
@@ -189,135 +528,7 @@
           <w:sz w:val="32"/>
           <w:szCs w:val="32"/>
         </w:rPr>
-        <w:t>u</w:t>
-      </w:r>
-      <w:r>
-        <w:rPr>
-          <w:sz w:val="32"/>
-          <w:szCs w:val="32"/>
-        </w:rPr>
-        <w:t>sername</w:t>
-      </w:r>
-    </w:p>
-    <w:p>
-      <w:pPr>
-        <w:pStyle w:val="ListParagraph"/>
-        <w:numPr>
-          <w:ilvl w:val="0"/>
-          <w:numId w:val="2"/>
-        </w:numPr>
-        <w:rPr>
-          <w:sz w:val="32"/>
-          <w:szCs w:val="32"/>
-        </w:rPr>
-      </w:pPr>
-      <w:r>
-        <w:rPr>
-          <w:sz w:val="32"/>
-          <w:szCs w:val="32"/>
-        </w:rPr>
-        <w:t>e</w:t>
-      </w:r>
-      <w:r>
-        <w:rPr>
-          <w:sz w:val="32"/>
-          <w:szCs w:val="32"/>
-        </w:rPr>
-        <w:t>mail</w:t>
-      </w:r>
-    </w:p>
-    <w:p>
-      <w:pPr>
-        <w:pStyle w:val="ListParagraph"/>
-        <w:numPr>
-          <w:ilvl w:val="0"/>
-          <w:numId w:val="2"/>
-        </w:numPr>
-        <w:rPr>
-          <w:sz w:val="32"/>
-          <w:szCs w:val="32"/>
-        </w:rPr>
-      </w:pPr>
-      <w:r>
-        <w:rPr>
-          <w:sz w:val="32"/>
-          <w:szCs w:val="32"/>
-        </w:rPr>
-        <w:t>p</w:t>
-      </w:r>
-      <w:r>
-        <w:rPr>
-          <w:sz w:val="32"/>
-          <w:szCs w:val="32"/>
-        </w:rPr>
-        <w:t>assword</w:t>
-      </w:r>
-    </w:p>
-    <w:p>
-      <w:pPr>
-        <w:pStyle w:val="ListParagraph"/>
-        <w:numPr>
-          <w:ilvl w:val="0"/>
-          <w:numId w:val="2"/>
-        </w:numPr>
-        <w:rPr>
-          <w:sz w:val="32"/>
-          <w:szCs w:val="32"/>
-        </w:rPr>
-      </w:pPr>
-      <w:r>
-        <w:rPr>
-          <w:sz w:val="32"/>
-          <w:szCs w:val="32"/>
-        </w:rPr>
-        <w:t>phone</w:t>
-      </w:r>
-    </w:p>
-    <w:p>
-      <w:pPr>
-        <w:pStyle w:val="ListParagraph"/>
-        <w:numPr>
-          <w:ilvl w:val="0"/>
-          <w:numId w:val="2"/>
-        </w:numPr>
-        <w:rPr>
-          <w:sz w:val="32"/>
-          <w:szCs w:val="32"/>
-        </w:rPr>
-      </w:pPr>
-      <w:r>
-        <w:rPr>
-          <w:sz w:val="32"/>
-          <w:szCs w:val="32"/>
-        </w:rPr>
-        <w:t>DOB</w:t>
-      </w:r>
-    </w:p>
-    <w:p>
-      <w:pPr>
-        <w:pStyle w:val="ListParagraph"/>
-        <w:numPr>
-          <w:ilvl w:val="0"/>
-          <w:numId w:val="2"/>
-        </w:numPr>
-        <w:rPr>
-          <w:sz w:val="32"/>
-          <w:szCs w:val="32"/>
-        </w:rPr>
-      </w:pPr>
-      <w:r>
-        <w:rPr>
-          <w:sz w:val="32"/>
-          <w:szCs w:val="32"/>
-        </w:rPr>
-        <w:t>C</w:t>
-      </w:r>
-      <w:r>
-        <w:rPr>
-          <w:sz w:val="32"/>
-          <w:szCs w:val="32"/>
-        </w:rPr>
-        <w:t>onfirm</w:t>
+        <w:t>two</w:t>
       </w:r>
       <w:r>
         <w:rPr>
@@ -331,54 +542,7 @@
           <w:sz w:val="32"/>
           <w:szCs w:val="32"/>
         </w:rPr>
-        <w:t xml:space="preserve">Email </w:t>
-      </w:r>
-    </w:p>
-    <w:p>
-      <w:pPr>
-        <w:pStyle w:val="ListParagraph"/>
-        <w:numPr>
-          <w:ilvl w:val="0"/>
-          <w:numId w:val="2"/>
-        </w:numPr>
-        <w:rPr>
-          <w:sz w:val="32"/>
-          <w:szCs w:val="32"/>
-        </w:rPr>
-      </w:pPr>
-      <w:r>
-        <w:rPr>
-          <w:sz w:val="32"/>
-          <w:szCs w:val="32"/>
-        </w:rPr>
-        <w:t>image</w:t>
-      </w:r>
-    </w:p>
-    <w:p>
-      <w:pPr>
-        <w:pStyle w:val="ListParagraph"/>
-        <w:numPr>
-          <w:ilvl w:val="0"/>
-          <w:numId w:val="2"/>
-        </w:numPr>
-        <w:rPr>
-          <w:sz w:val="32"/>
-          <w:szCs w:val="32"/>
-        </w:rPr>
-      </w:pPr>
-      <w:r>
-        <w:rPr>
-          <w:sz w:val="32"/>
-          <w:szCs w:val="32"/>
-        </w:rPr>
-        <w:t>C</w:t>
-      </w:r>
-      <w:r>
-        <w:rPr>
-          <w:sz w:val="32"/>
-          <w:szCs w:val="32"/>
-        </w:rPr>
-        <w:t>over</w:t>
+        <w:t>Step</w:t>
       </w:r>
       <w:r>
         <w:rPr>
@@ -392,123 +556,7 @@
           <w:sz w:val="32"/>
           <w:szCs w:val="32"/>
         </w:rPr>
-        <w:t>Image</w:t>
-      </w:r>
-    </w:p>
-    <w:p>
-      <w:pPr>
-        <w:pStyle w:val="ListParagraph"/>
-        <w:numPr>
-          <w:ilvl w:val="0"/>
-          <w:numId w:val="2"/>
-        </w:numPr>
-        <w:rPr>
-          <w:sz w:val="32"/>
-          <w:szCs w:val="32"/>
-        </w:rPr>
-      </w:pPr>
-      <w:r>
-        <w:rPr>
-          <w:sz w:val="32"/>
-          <w:szCs w:val="32"/>
-        </w:rPr>
-        <w:lastRenderedPageBreak/>
-        <w:t>gender (0=&gt; male, 1 =&gt; female)</w:t>
-      </w:r>
-    </w:p>
-    <w:p>
-      <w:pPr>
-        <w:pStyle w:val="ListParagraph"/>
-        <w:numPr>
-          <w:ilvl w:val="0"/>
-          <w:numId w:val="2"/>
-        </w:numPr>
-        <w:rPr>
-          <w:sz w:val="32"/>
-          <w:szCs w:val="32"/>
-        </w:rPr>
-      </w:pPr>
-      <w:r>
-        <w:rPr>
-          <w:sz w:val="32"/>
-          <w:szCs w:val="32"/>
-        </w:rPr>
-        <w:t>role</w:t>
-      </w:r>
-      <w:r>
-        <w:rPr>
-          <w:sz w:val="32"/>
-          <w:szCs w:val="32"/>
-        </w:rPr>
-        <w:t xml:space="preserve"> (0=&gt; user, 1=&gt; admin)</w:t>
-      </w:r>
-    </w:p>
-    <w:p>
-      <w:pPr>
-        <w:pStyle w:val="ListParagraph"/>
-        <w:numPr>
-          <w:ilvl w:val="0"/>
-          <w:numId w:val="2"/>
-        </w:numPr>
-        <w:rPr>
-          <w:sz w:val="32"/>
-          <w:szCs w:val="32"/>
-        </w:rPr>
-      </w:pPr>
-      <w:r>
-        <w:rPr>
-          <w:sz w:val="32"/>
-          <w:szCs w:val="32"/>
-        </w:rPr>
-        <w:t>provider (0=&gt; System, 1=&gt; google)</w:t>
-      </w:r>
-    </w:p>
-    <w:p>
-      <w:pPr>
-        <w:pStyle w:val="ListParagraph"/>
-        <w:numPr>
-          <w:ilvl w:val="0"/>
-          <w:numId w:val="2"/>
-        </w:numPr>
-        <w:rPr>
-          <w:sz w:val="32"/>
-          <w:szCs w:val="32"/>
-        </w:rPr>
-      </w:pPr>
-      <w:r>
-        <w:rPr>
-          <w:sz w:val="32"/>
-          <w:szCs w:val="32"/>
-        </w:rPr>
-        <w:t>change</w:t>
-      </w:r>
-      <w:r>
-        <w:rPr>
-          <w:sz w:val="32"/>
-          <w:szCs w:val="32"/>
-        </w:rPr>
-        <w:t xml:space="preserve"> </w:t>
-      </w:r>
-      <w:r>
-        <w:rPr>
-          <w:sz w:val="32"/>
-          <w:szCs w:val="32"/>
-        </w:rPr>
-        <w:t>Credentials</w:t>
-      </w:r>
-      <w:r>
-        <w:rPr>
-          <w:sz w:val="32"/>
-          <w:szCs w:val="32"/>
-        </w:rPr>
-        <w:t xml:space="preserve"> </w:t>
-      </w:r>
-      <w:r>
-        <w:rPr>
-          <w:sz w:val="32"/>
-          <w:szCs w:val="32"/>
-        </w:rPr>
-        <w:t>Time</w:t>
+        <w:t>Verification</w:t>
       </w:r>
       <w:r>
         <w:rPr>
@@ -3996,7 +4044,7 @@
 </file>
 
 <file path=customXml/itemProps1.xml><?xml version="1.0" encoding="utf-8"?>
-<ds:datastoreItem xmlns:ds="http://schemas.openxmlformats.org/officeDocument/2006/customXml" ds:itemID="{5652BE9D-5331-4093-9ECB-3D2994C73815}">
+<ds:datastoreItem xmlns:ds="http://schemas.openxmlformats.org/officeDocument/2006/customXml" ds:itemID="{0D847A52-A3E0-44AC-95E2-5AE48D82D7FE}">
   <ds:schemaRefs>
     <ds:schemaRef ds:uri="http://schemas.openxmlformats.org/officeDocument/2006/bibliography"/>
   </ds:schemaRefs>

</xml_diff>

<commit_message>
fix (deployment): remove all comments
</commit_message>
<xml_diff>
--- a/Requirenments.docx
+++ b/Requirenments.docx
@@ -13,7 +13,6 @@
           <w:u w:val="single"/>
         </w:rPr>
       </w:pPr>
-      <w:proofErr w:type="spellStart"/>
       <w:r>
         <w:rPr>
           <w:b/>
@@ -22,9 +21,8 @@
           <w:szCs w:val="56"/>
           <w:u w:val="single"/>
         </w:rPr>
-        <w:t>Gohst</w:t>
-      </w:r>
-      <w:proofErr w:type="spellEnd"/>
+        <w:t>Ghost</w:t>
+      </w:r>
       <w:r>
         <w:rPr>
           <w:b/>
@@ -49,7 +47,23 @@
           <w:sz w:val="32"/>
           <w:szCs w:val="32"/>
         </w:rPr>
-        <w:t>This app contains 2 modules user and message user can send message anonymous to the receiver</w:t>
+        <w:t>user can send message anonymous to the receiver</w:t>
+      </w:r>
+    </w:p>
+    <w:p>
+      <w:pPr>
+        <w:jc w:val="center"/>
+        <w:rPr>
+          <w:sz w:val="32"/>
+          <w:szCs w:val="32"/>
+        </w:rPr>
+      </w:pPr>
+      <w:r>
+        <w:rPr>
+          <w:sz w:val="32"/>
+          <w:szCs w:val="32"/>
+        </w:rPr>
+        <w:t>Bilingual support: all responses, validation messages and emails (Arabic / English) based on request language</w:t>
       </w:r>
     </w:p>
     <w:p>
@@ -100,7 +114,9 @@
           <w:docGrid w:linePitch="360"/>
         </w:sectPr>
       </w:pPr>
-    </w:p>
+      <w:bookmarkStart w:id="0" w:name="_GoBack"/>
+    </w:p>
+    <w:bookmarkEnd w:id="0"/>
     <w:p>
       <w:pPr>
         <w:pStyle w:val="ListParagraph"/>
@@ -187,7 +203,7 @@
           <w:sz w:val="32"/>
           <w:szCs w:val="32"/>
         </w:rPr>
-        <w:t>u</w:t>
+        <w:t>U</w:t>
       </w:r>
       <w:r>
         <w:rPr>
@@ -196,6 +212,13 @@
         </w:rPr>
         <w:t>sername</w:t>
       </w:r>
+      <w:r>
+        <w:rPr>
+          <w:sz w:val="32"/>
+          <w:szCs w:val="32"/>
+        </w:rPr>
+        <w:t xml:space="preserve"> (virtual)</w:t>
+      </w:r>
     </w:p>
     <w:p>
       <w:pPr>
@@ -290,8 +313,6 @@
         </w:rPr>
         <w:t>DOB</w:t>
       </w:r>
-      <w:bookmarkStart w:id="0" w:name="_GoBack"/>
-      <w:bookmarkEnd w:id="0"/>
     </w:p>
     <w:p>
       <w:pPr>
@@ -412,6 +433,7 @@
           <w:sz w:val="32"/>
           <w:szCs w:val="32"/>
         </w:rPr>
+        <w:lastRenderedPageBreak/>
         <w:t>gender (0=&gt; male, 1 =&gt; female)</w:t>
       </w:r>
     </w:p>
@@ -432,7 +454,6 @@
           <w:sz w:val="32"/>
           <w:szCs w:val="32"/>
         </w:rPr>
-        <w:lastRenderedPageBreak/>
         <w:t>role</w:t>
       </w:r>
       <w:r>
@@ -604,26 +625,6 @@
           <w:szCs w:val="32"/>
         </w:rPr>
         <w:t>Updated At</w:t>
-      </w:r>
-    </w:p>
-    <w:p>
-      <w:pPr>
-        <w:pStyle w:val="ListParagraph"/>
-        <w:numPr>
-          <w:ilvl w:val="0"/>
-          <w:numId w:val="2"/>
-        </w:numPr>
-        <w:rPr>
-          <w:sz w:val="32"/>
-          <w:szCs w:val="32"/>
-        </w:rPr>
-      </w:pPr>
-      <w:r>
-        <w:rPr>
-          <w:sz w:val="32"/>
-          <w:szCs w:val="32"/>
-        </w:rPr>
-        <w:t>Deleted At</w:t>
       </w:r>
     </w:p>
     <w:p>
@@ -671,7 +672,16 @@
           <w:szCs w:val="44"/>
         </w:rPr>
         <w:lastRenderedPageBreak/>
-        <w:t>message</w:t>
+        <w:t>M</w:t>
+      </w:r>
+      <w:r>
+        <w:rPr>
+          <w:b/>
+          <w:bCs/>
+          <w:sz w:val="44"/>
+          <w:szCs w:val="44"/>
+        </w:rPr>
+        <w:t>essage</w:t>
       </w:r>
     </w:p>
     <w:p>
@@ -738,7 +748,7 @@
           <w:sz w:val="32"/>
           <w:szCs w:val="32"/>
         </w:rPr>
-        <w:t>Image</w:t>
+        <w:t>attachments</w:t>
       </w:r>
     </w:p>
     <w:p>
@@ -804,12 +814,14 @@
     </w:p>
     <w:p>
       <w:pPr>
-        <w:rPr>
-          <w:b/>
-          <w:bCs/>
-          <w:sz w:val="44"/>
-          <w:szCs w:val="44"/>
-          <w:u w:val="single"/>
+        <w:pStyle w:val="ListParagraph"/>
+        <w:numPr>
+          <w:ilvl w:val="0"/>
+          <w:numId w:val="3"/>
+        </w:numPr>
+        <w:rPr>
+          <w:sz w:val="32"/>
+          <w:szCs w:val="32"/>
         </w:rPr>
         <w:sectPr>
           <w:type w:val="continuous"/>
@@ -825,15 +837,40 @@
           <w:docGrid w:linePitch="360"/>
         </w:sectPr>
       </w:pPr>
-    </w:p>
-    <w:p>
-      <w:pPr>
+      <w:r>
+        <w:rPr>
+          <w:sz w:val="32"/>
+          <w:szCs w:val="32"/>
+        </w:rPr>
+        <w:t>Conversation</w:t>
+      </w:r>
+      <w:r>
+        <w:rPr>
+          <w:sz w:val="32"/>
+          <w:szCs w:val="32"/>
+        </w:rPr>
+        <w:t xml:space="preserve"> </w:t>
+      </w:r>
+      <w:r>
+        <w:rPr>
+          <w:sz w:val="32"/>
+          <w:szCs w:val="32"/>
+        </w:rPr>
+        <w:t>Id</w:t>
+      </w:r>
+    </w:p>
+    <w:p>
+      <w:pPr>
+        <w:pStyle w:val="ListParagraph"/>
+        <w:numPr>
+          <w:ilvl w:val="0"/>
+          <w:numId w:val="1"/>
+        </w:numPr>
         <w:rPr>
           <w:b/>
           <w:bCs/>
           <w:sz w:val="44"/>
           <w:szCs w:val="44"/>
-          <w:u w:val="single"/>
         </w:rPr>
       </w:pPr>
       <w:r>
@@ -842,28 +879,17 @@
           <w:bCs/>
           <w:sz w:val="44"/>
           <w:szCs w:val="44"/>
-          <w:u w:val="single"/>
         </w:rPr>
         <w:lastRenderedPageBreak/>
-        <w:t>Functions</w:t>
-      </w:r>
-      <w:r>
-        <w:rPr>
-          <w:b/>
-          <w:bCs/>
-          <w:sz w:val="44"/>
-          <w:szCs w:val="44"/>
-          <w:u w:val="single"/>
-        </w:rPr>
-        <w:t>:</w:t>
-      </w:r>
-    </w:p>
-    <w:p>
-      <w:pPr>
-        <w:pStyle w:val="ListParagraph"/>
-        <w:numPr>
-          <w:ilvl w:val="0"/>
-          <w:numId w:val="10"/>
+        <w:t>Request</w:t>
+      </w:r>
+    </w:p>
+    <w:p>
+      <w:pPr>
+        <w:pStyle w:val="ListParagraph"/>
+        <w:numPr>
+          <w:ilvl w:val="0"/>
+          <w:numId w:val="3"/>
         </w:numPr>
         <w:rPr>
           <w:sz w:val="32"/>
@@ -883,20 +909,13 @@
           <w:docGrid w:linePitch="360"/>
         </w:sectPr>
       </w:pPr>
-      <w:r>
-        <w:rPr>
-          <w:sz w:val="32"/>
-          <w:szCs w:val="32"/>
-        </w:rPr>
-        <w:t>Authentication:</w:t>
-      </w:r>
-    </w:p>
-    <w:p>
-      <w:pPr>
-        <w:pStyle w:val="ListParagraph"/>
-        <w:numPr>
-          <w:ilvl w:val="0"/>
-          <w:numId w:val="4"/>
+    </w:p>
+    <w:p>
+      <w:pPr>
+        <w:pStyle w:val="ListParagraph"/>
+        <w:numPr>
+          <w:ilvl w:val="0"/>
+          <w:numId w:val="3"/>
         </w:numPr>
         <w:rPr>
           <w:sz w:val="32"/>
@@ -909,64 +928,35 @@
           <w:szCs w:val="32"/>
         </w:rPr>
         <w:lastRenderedPageBreak/>
-        <w:t>Signup</w:t>
-      </w:r>
-    </w:p>
-    <w:p>
-      <w:pPr>
-        <w:pStyle w:val="ListParagraph"/>
-        <w:numPr>
-          <w:ilvl w:val="0"/>
-          <w:numId w:val="4"/>
-        </w:numPr>
-        <w:rPr>
-          <w:sz w:val="32"/>
-          <w:szCs w:val="32"/>
-        </w:rPr>
-      </w:pPr>
-      <w:r>
-        <w:rPr>
-          <w:sz w:val="32"/>
-          <w:szCs w:val="32"/>
-        </w:rPr>
-        <w:t>Login</w:t>
-      </w:r>
-    </w:p>
-    <w:p>
-      <w:pPr>
-        <w:pStyle w:val="ListParagraph"/>
-        <w:numPr>
-          <w:ilvl w:val="0"/>
-          <w:numId w:val="4"/>
-        </w:numPr>
-        <w:rPr>
-          <w:sz w:val="32"/>
-          <w:szCs w:val="32"/>
-        </w:rPr>
-      </w:pPr>
-      <w:r>
-        <w:rPr>
-          <w:sz w:val="32"/>
-          <w:szCs w:val="32"/>
-        </w:rPr>
-        <w:t xml:space="preserve">Login and signup with </w:t>
-      </w:r>
-      <w:proofErr w:type="spellStart"/>
-      <w:r>
-        <w:rPr>
-          <w:sz w:val="32"/>
-          <w:szCs w:val="32"/>
-        </w:rPr>
-        <w:t>gmail</w:t>
-      </w:r>
-      <w:proofErr w:type="spellEnd"/>
-    </w:p>
-    <w:p>
-      <w:pPr>
-        <w:pStyle w:val="ListParagraph"/>
-        <w:numPr>
-          <w:ilvl w:val="0"/>
-          <w:numId w:val="4"/>
+        <w:t>Status (pending, rejected, accepted)</w:t>
+      </w:r>
+    </w:p>
+    <w:p>
+      <w:pPr>
+        <w:pStyle w:val="ListParagraph"/>
+        <w:numPr>
+          <w:ilvl w:val="0"/>
+          <w:numId w:val="3"/>
+        </w:numPr>
+        <w:rPr>
+          <w:sz w:val="32"/>
+          <w:szCs w:val="32"/>
+        </w:rPr>
+      </w:pPr>
+      <w:r>
+        <w:rPr>
+          <w:sz w:val="32"/>
+          <w:szCs w:val="32"/>
+        </w:rPr>
+        <w:t>Target user Id</w:t>
+      </w:r>
+    </w:p>
+    <w:p>
+      <w:pPr>
+        <w:pStyle w:val="ListParagraph"/>
+        <w:numPr>
+          <w:ilvl w:val="0"/>
+          <w:numId w:val="3"/>
         </w:numPr>
         <w:rPr>
           <w:sz w:val="32"/>
@@ -979,32 +969,53 @@
           <w:szCs w:val="32"/>
         </w:rPr>
         <w:lastRenderedPageBreak/>
-        <w:t>Rotate token</w:t>
-      </w:r>
-    </w:p>
-    <w:p>
-      <w:pPr>
-        <w:pStyle w:val="ListParagraph"/>
-        <w:numPr>
-          <w:ilvl w:val="0"/>
-          <w:numId w:val="4"/>
-        </w:numPr>
-        <w:rPr>
-          <w:sz w:val="32"/>
-          <w:szCs w:val="32"/>
-        </w:rPr>
-      </w:pPr>
-      <w:r>
-        <w:rPr>
-          <w:sz w:val="32"/>
-          <w:szCs w:val="32"/>
-        </w:rPr>
-        <w:t>Logout</w:t>
-      </w:r>
-    </w:p>
-    <w:p>
-      <w:pPr>
-        <w:pStyle w:val="ListParagraph"/>
+        <w:t>Requester Id</w:t>
+      </w:r>
+    </w:p>
+    <w:p>
+      <w:pPr>
+        <w:pStyle w:val="ListParagraph"/>
+        <w:numPr>
+          <w:ilvl w:val="0"/>
+          <w:numId w:val="3"/>
+        </w:numPr>
+        <w:rPr>
+          <w:sz w:val="32"/>
+          <w:szCs w:val="32"/>
+        </w:rPr>
+      </w:pPr>
+      <w:r>
+        <w:rPr>
+          <w:sz w:val="32"/>
+          <w:szCs w:val="32"/>
+        </w:rPr>
+        <w:t>Message Id</w:t>
+      </w:r>
+    </w:p>
+    <w:p>
+      <w:pPr>
+        <w:pStyle w:val="ListParagraph"/>
+        <w:numPr>
+          <w:ilvl w:val="0"/>
+          <w:numId w:val="3"/>
+        </w:numPr>
+        <w:rPr>
+          <w:sz w:val="32"/>
+          <w:szCs w:val="32"/>
+        </w:rPr>
+      </w:pPr>
+      <w:r>
+        <w:rPr>
+          <w:sz w:val="32"/>
+          <w:szCs w:val="32"/>
+        </w:rPr>
+        <w:t>Created At</w:t>
+      </w:r>
+    </w:p>
+    <w:p>
+      <w:pPr>
+        <w:pStyle w:val="ListParagraph"/>
+        <w:ind w:left="1440"/>
         <w:rPr>
           <w:sz w:val="32"/>
           <w:szCs w:val="32"/>
@@ -1029,28 +1040,32 @@
         <w:pStyle w:val="ListParagraph"/>
         <w:numPr>
           <w:ilvl w:val="0"/>
-          <w:numId w:val="10"/>
-        </w:numPr>
-        <w:rPr>
-          <w:sz w:val="32"/>
-          <w:szCs w:val="32"/>
-        </w:rPr>
-      </w:pPr>
-      <w:r>
-        <w:rPr>
-          <w:sz w:val="32"/>
-          <w:szCs w:val="32"/>
+          <w:numId w:val="1"/>
+        </w:numPr>
+        <w:rPr>
+          <w:b/>
+          <w:bCs/>
+          <w:sz w:val="44"/>
+          <w:szCs w:val="44"/>
+        </w:rPr>
+      </w:pPr>
+      <w:r>
+        <w:rPr>
+          <w:b/>
+          <w:bCs/>
+          <w:sz w:val="44"/>
+          <w:szCs w:val="44"/>
         </w:rPr>
         <w:lastRenderedPageBreak/>
-        <w:t>User:</w:t>
-      </w:r>
-    </w:p>
-    <w:p>
-      <w:pPr>
-        <w:pStyle w:val="ListParagraph"/>
-        <w:numPr>
-          <w:ilvl w:val="0"/>
-          <w:numId w:val="11"/>
+        <w:t>Conversation</w:t>
+      </w:r>
+    </w:p>
+    <w:p>
+      <w:pPr>
+        <w:pStyle w:val="ListParagraph"/>
+        <w:numPr>
+          <w:ilvl w:val="0"/>
+          <w:numId w:val="3"/>
         </w:numPr>
         <w:rPr>
           <w:sz w:val="32"/>
@@ -1076,7 +1091,7 @@
         <w:pStyle w:val="ListParagraph"/>
         <w:numPr>
           <w:ilvl w:val="0"/>
-          <w:numId w:val="11"/>
+          <w:numId w:val="3"/>
         </w:numPr>
         <w:rPr>
           <w:sz w:val="32"/>
@@ -1089,42 +1104,15 @@
           <w:szCs w:val="32"/>
         </w:rPr>
         <w:lastRenderedPageBreak/>
-        <w:t>P</w:t>
-      </w:r>
-      <w:r>
-        <w:rPr>
-          <w:sz w:val="32"/>
-          <w:szCs w:val="32"/>
-        </w:rPr>
-        <w:t>rofile</w:t>
-      </w:r>
-    </w:p>
-    <w:p>
-      <w:pPr>
-        <w:pStyle w:val="ListParagraph"/>
-        <w:numPr>
-          <w:ilvl w:val="0"/>
-          <w:numId w:val="11"/>
-        </w:numPr>
-        <w:rPr>
-          <w:sz w:val="32"/>
-          <w:szCs w:val="32"/>
-        </w:rPr>
-      </w:pPr>
-      <w:r>
-        <w:rPr>
-          <w:sz w:val="32"/>
-          <w:szCs w:val="32"/>
-        </w:rPr>
-        <w:t>Get all users</w:t>
-      </w:r>
-    </w:p>
-    <w:p>
-      <w:pPr>
-        <w:pStyle w:val="ListParagraph"/>
-        <w:numPr>
-          <w:ilvl w:val="0"/>
-          <w:numId w:val="11"/>
+        <w:t>Message Id</w:t>
+      </w:r>
+    </w:p>
+    <w:p>
+      <w:pPr>
+        <w:pStyle w:val="ListParagraph"/>
+        <w:numPr>
+          <w:ilvl w:val="0"/>
+          <w:numId w:val="3"/>
         </w:numPr>
         <w:rPr>
           <w:sz w:val="32"/>
@@ -1137,15 +1125,56 @@
           <w:szCs w:val="32"/>
         </w:rPr>
         <w:lastRenderedPageBreak/>
-        <w:t>Update Profile</w:t>
-      </w:r>
-    </w:p>
-    <w:p>
-      <w:pPr>
-        <w:pStyle w:val="ListParagraph"/>
-        <w:numPr>
-          <w:ilvl w:val="0"/>
-          <w:numId w:val="11"/>
+        <w:t>Target user Id</w:t>
+      </w:r>
+    </w:p>
+    <w:p>
+      <w:pPr>
+        <w:pStyle w:val="ListParagraph"/>
+        <w:numPr>
+          <w:ilvl w:val="0"/>
+          <w:numId w:val="3"/>
+        </w:numPr>
+        <w:rPr>
+          <w:sz w:val="32"/>
+          <w:szCs w:val="32"/>
+        </w:rPr>
+      </w:pPr>
+      <w:r>
+        <w:rPr>
+          <w:sz w:val="32"/>
+          <w:szCs w:val="32"/>
+        </w:rPr>
+        <w:lastRenderedPageBreak/>
+        <w:t>Requester Id</w:t>
+      </w:r>
+    </w:p>
+    <w:p>
+      <w:pPr>
+        <w:pStyle w:val="ListParagraph"/>
+        <w:numPr>
+          <w:ilvl w:val="0"/>
+          <w:numId w:val="3"/>
+        </w:numPr>
+        <w:rPr>
+          <w:sz w:val="32"/>
+          <w:szCs w:val="32"/>
+        </w:rPr>
+      </w:pPr>
+      <w:r>
+        <w:rPr>
+          <w:sz w:val="32"/>
+          <w:szCs w:val="32"/>
+        </w:rPr>
+        <w:t>messages</w:t>
+      </w:r>
+    </w:p>
+    <w:p>
+      <w:pPr>
+        <w:pStyle w:val="ListParagraph"/>
+        <w:numPr>
+          <w:ilvl w:val="0"/>
+          <w:numId w:val="3"/>
         </w:numPr>
         <w:rPr>
           <w:sz w:val="32"/>
@@ -1170,11 +1199,59 @@
           <w:sz w:val="32"/>
           <w:szCs w:val="32"/>
         </w:rPr>
-        <w:t>Share Profile</w:t>
-      </w:r>
-    </w:p>
-    <w:p>
-      <w:pPr>
+        <w:lastRenderedPageBreak/>
+        <w:t>Created At</w:t>
+      </w:r>
+    </w:p>
+    <w:p>
+      <w:pPr>
+        <w:rPr>
+          <w:b/>
+          <w:bCs/>
+          <w:sz w:val="44"/>
+          <w:szCs w:val="44"/>
+          <w:u w:val="single"/>
+        </w:rPr>
+      </w:pPr>
+    </w:p>
+    <w:p>
+      <w:pPr>
+        <w:rPr>
+          <w:b/>
+          <w:bCs/>
+          <w:sz w:val="44"/>
+          <w:szCs w:val="44"/>
+          <w:u w:val="single"/>
+        </w:rPr>
+      </w:pPr>
+      <w:r>
+        <w:rPr>
+          <w:b/>
+          <w:bCs/>
+          <w:sz w:val="44"/>
+          <w:szCs w:val="44"/>
+          <w:u w:val="single"/>
+        </w:rPr>
+        <w:t>Functions</w:t>
+      </w:r>
+      <w:r>
+        <w:rPr>
+          <w:b/>
+          <w:bCs/>
+          <w:sz w:val="44"/>
+          <w:szCs w:val="44"/>
+          <w:u w:val="single"/>
+        </w:rPr>
+        <w:t>:</w:t>
+      </w:r>
+    </w:p>
+    <w:p>
+      <w:pPr>
+        <w:pStyle w:val="ListParagraph"/>
+        <w:numPr>
+          <w:ilvl w:val="0"/>
+          <w:numId w:val="10"/>
+        </w:numPr>
         <w:rPr>
           <w:sz w:val="32"/>
           <w:szCs w:val="32"/>
@@ -1193,117 +1270,326 @@
           <w:docGrid w:linePitch="360"/>
         </w:sectPr>
       </w:pPr>
-    </w:p>
-    <w:p>
-      <w:pPr>
-        <w:rPr>
-          <w:sz w:val="32"/>
-          <w:szCs w:val="32"/>
-        </w:rPr>
-      </w:pPr>
-    </w:p>
-    <w:p>
-      <w:pPr>
-        <w:pStyle w:val="ListParagraph"/>
-        <w:numPr>
-          <w:ilvl w:val="0"/>
-          <w:numId w:val="12"/>
-        </w:numPr>
-        <w:rPr>
-          <w:sz w:val="32"/>
-          <w:szCs w:val="32"/>
-        </w:rPr>
-      </w:pPr>
-      <w:r>
-        <w:rPr>
-          <w:sz w:val="32"/>
-          <w:szCs w:val="32"/>
-        </w:rPr>
-        <w:t>Send Email</w:t>
-      </w:r>
-    </w:p>
-    <w:p>
-      <w:pPr>
-        <w:pStyle w:val="ListParagraph"/>
-        <w:numPr>
-          <w:ilvl w:val="0"/>
-          <w:numId w:val="12"/>
-        </w:numPr>
-        <w:rPr>
-          <w:sz w:val="32"/>
-          <w:szCs w:val="32"/>
-        </w:rPr>
-      </w:pPr>
-      <w:r>
-        <w:rPr>
-          <w:sz w:val="32"/>
-          <w:szCs w:val="32"/>
-        </w:rPr>
-        <w:t>Forget Password</w:t>
-      </w:r>
-    </w:p>
-    <w:p>
-      <w:pPr>
-        <w:pStyle w:val="ListParagraph"/>
-        <w:numPr>
-          <w:ilvl w:val="0"/>
-          <w:numId w:val="12"/>
-        </w:numPr>
-        <w:rPr>
-          <w:sz w:val="32"/>
-          <w:szCs w:val="32"/>
-        </w:rPr>
-      </w:pPr>
-      <w:r>
-        <w:rPr>
-          <w:sz w:val="32"/>
-          <w:szCs w:val="32"/>
-        </w:rPr>
-        <w:t>Update Password</w:t>
-      </w:r>
-    </w:p>
-    <w:p>
-      <w:pPr>
-        <w:pStyle w:val="ListParagraph"/>
-        <w:numPr>
-          <w:ilvl w:val="0"/>
-          <w:numId w:val="12"/>
-        </w:numPr>
-        <w:rPr>
-          <w:sz w:val="32"/>
-          <w:szCs w:val="32"/>
-        </w:rPr>
-      </w:pPr>
-      <w:r>
-        <w:rPr>
-          <w:sz w:val="32"/>
-          <w:szCs w:val="32"/>
-        </w:rPr>
-        <w:t>Freeze Profile</w:t>
-      </w:r>
-    </w:p>
-    <w:p>
-      <w:pPr>
-        <w:pStyle w:val="ListParagraph"/>
-        <w:numPr>
-          <w:ilvl w:val="0"/>
-          <w:numId w:val="12"/>
-        </w:numPr>
-        <w:rPr>
-          <w:sz w:val="32"/>
-          <w:szCs w:val="32"/>
-        </w:rPr>
-      </w:pPr>
-      <w:r>
-        <w:rPr>
-          <w:sz w:val="32"/>
-          <w:szCs w:val="32"/>
-        </w:rPr>
-        <w:t>CRUD Operations to Message model</w:t>
-      </w:r>
-    </w:p>
-    <w:p>
-      <w:pPr>
+      <w:r>
+        <w:rPr>
+          <w:sz w:val="32"/>
+          <w:szCs w:val="32"/>
+        </w:rPr>
+        <w:t>Authentication:</w:t>
+      </w:r>
+    </w:p>
+    <w:p>
+      <w:pPr>
+        <w:pStyle w:val="ListParagraph"/>
+        <w:numPr>
+          <w:ilvl w:val="0"/>
+          <w:numId w:val="4"/>
+        </w:numPr>
+        <w:rPr>
+          <w:sz w:val="32"/>
+          <w:szCs w:val="32"/>
+        </w:rPr>
+      </w:pPr>
+      <w:r>
+        <w:rPr>
+          <w:sz w:val="32"/>
+          <w:szCs w:val="32"/>
+        </w:rPr>
+        <w:lastRenderedPageBreak/>
+        <w:t>Login and signup with Gmail</w:t>
+      </w:r>
+    </w:p>
+    <w:p>
+      <w:pPr>
+        <w:pStyle w:val="ListParagraph"/>
+        <w:numPr>
+          <w:ilvl w:val="0"/>
+          <w:numId w:val="4"/>
+        </w:numPr>
+        <w:rPr>
+          <w:sz w:val="32"/>
+          <w:szCs w:val="32"/>
+        </w:rPr>
+      </w:pPr>
+      <w:r>
+        <w:rPr>
+          <w:sz w:val="32"/>
+          <w:szCs w:val="32"/>
+        </w:rPr>
+        <w:t>Signup</w:t>
+      </w:r>
+    </w:p>
+    <w:p>
+      <w:pPr>
+        <w:pStyle w:val="ListParagraph"/>
+        <w:numPr>
+          <w:ilvl w:val="0"/>
+          <w:numId w:val="4"/>
+        </w:numPr>
+        <w:rPr>
+          <w:sz w:val="32"/>
+          <w:szCs w:val="32"/>
+        </w:rPr>
+      </w:pPr>
+      <w:r>
+        <w:rPr>
+          <w:sz w:val="32"/>
+          <w:szCs w:val="32"/>
+        </w:rPr>
+        <w:t>Confirm email</w:t>
+      </w:r>
+    </w:p>
+    <w:p>
+      <w:pPr>
+        <w:pStyle w:val="ListParagraph"/>
+        <w:numPr>
+          <w:ilvl w:val="0"/>
+          <w:numId w:val="4"/>
+        </w:numPr>
+        <w:rPr>
+          <w:sz w:val="32"/>
+          <w:szCs w:val="32"/>
+        </w:rPr>
+      </w:pPr>
+      <w:r>
+        <w:rPr>
+          <w:sz w:val="32"/>
+          <w:szCs w:val="32"/>
+        </w:rPr>
+        <w:t>Resend confirm email</w:t>
+      </w:r>
+    </w:p>
+    <w:p>
+      <w:pPr>
+        <w:pStyle w:val="ListParagraph"/>
+        <w:numPr>
+          <w:ilvl w:val="0"/>
+          <w:numId w:val="4"/>
+        </w:numPr>
+        <w:rPr>
+          <w:sz w:val="32"/>
+          <w:szCs w:val="32"/>
+        </w:rPr>
+      </w:pPr>
+      <w:r>
+        <w:rPr>
+          <w:sz w:val="32"/>
+          <w:szCs w:val="32"/>
+        </w:rPr>
+        <w:t>Login</w:t>
+      </w:r>
+    </w:p>
+    <w:p>
+      <w:pPr>
+        <w:pStyle w:val="ListParagraph"/>
+        <w:numPr>
+          <w:ilvl w:val="0"/>
+          <w:numId w:val="4"/>
+        </w:numPr>
+        <w:rPr>
+          <w:sz w:val="32"/>
+          <w:szCs w:val="32"/>
+        </w:rPr>
+      </w:pPr>
+      <w:r>
+        <w:rPr>
+          <w:sz w:val="32"/>
+          <w:szCs w:val="32"/>
+        </w:rPr>
+        <w:t>Login confirmation</w:t>
+      </w:r>
+    </w:p>
+    <w:p>
+      <w:pPr>
+        <w:pStyle w:val="ListParagraph"/>
+        <w:numPr>
+          <w:ilvl w:val="0"/>
+          <w:numId w:val="4"/>
+        </w:numPr>
+        <w:rPr>
+          <w:sz w:val="32"/>
+          <w:szCs w:val="32"/>
+        </w:rPr>
+      </w:pPr>
+      <w:r>
+        <w:rPr>
+          <w:sz w:val="32"/>
+          <w:szCs w:val="32"/>
+        </w:rPr>
+        <w:t>Enable two step verification</w:t>
+      </w:r>
+    </w:p>
+    <w:p>
+      <w:pPr>
+        <w:pStyle w:val="ListParagraph"/>
+        <w:numPr>
+          <w:ilvl w:val="0"/>
+          <w:numId w:val="4"/>
+        </w:numPr>
+        <w:rPr>
+          <w:sz w:val="32"/>
+          <w:szCs w:val="32"/>
+        </w:rPr>
+      </w:pPr>
+      <w:r>
+        <w:rPr>
+          <w:sz w:val="32"/>
+          <w:szCs w:val="32"/>
+        </w:rPr>
+        <w:lastRenderedPageBreak/>
+        <w:t>Confirm two step verification</w:t>
+      </w:r>
+    </w:p>
+    <w:p>
+      <w:pPr>
+        <w:pStyle w:val="ListParagraph"/>
+        <w:numPr>
+          <w:ilvl w:val="0"/>
+          <w:numId w:val="4"/>
+        </w:numPr>
+        <w:rPr>
+          <w:sz w:val="32"/>
+          <w:szCs w:val="32"/>
+        </w:rPr>
+      </w:pPr>
+      <w:r>
+        <w:rPr>
+          <w:sz w:val="32"/>
+          <w:szCs w:val="32"/>
+        </w:rPr>
+        <w:t>Request forgot password code</w:t>
+      </w:r>
+    </w:p>
+    <w:p>
+      <w:pPr>
+        <w:pStyle w:val="ListParagraph"/>
+        <w:numPr>
+          <w:ilvl w:val="0"/>
+          <w:numId w:val="4"/>
+        </w:numPr>
+        <w:rPr>
+          <w:sz w:val="32"/>
+          <w:szCs w:val="32"/>
+        </w:rPr>
+      </w:pPr>
+      <w:r>
+        <w:rPr>
+          <w:sz w:val="32"/>
+          <w:szCs w:val="32"/>
+        </w:rPr>
+        <w:t>Verify forgot password code</w:t>
+      </w:r>
+    </w:p>
+    <w:p>
+      <w:pPr>
+        <w:pStyle w:val="ListParagraph"/>
+        <w:numPr>
+          <w:ilvl w:val="0"/>
+          <w:numId w:val="4"/>
+        </w:numPr>
+        <w:rPr>
+          <w:sz w:val="32"/>
+          <w:szCs w:val="32"/>
+        </w:rPr>
+      </w:pPr>
+      <w:r>
+        <w:rPr>
+          <w:sz w:val="32"/>
+          <w:szCs w:val="32"/>
+        </w:rPr>
+        <w:t>Reset password</w:t>
+      </w:r>
+    </w:p>
+    <w:p>
+      <w:pPr>
+        <w:pStyle w:val="ListParagraph"/>
+        <w:numPr>
+          <w:ilvl w:val="0"/>
+          <w:numId w:val="4"/>
+        </w:numPr>
+        <w:rPr>
+          <w:sz w:val="32"/>
+          <w:szCs w:val="32"/>
+        </w:rPr>
+      </w:pPr>
+      <w:r>
+        <w:rPr>
+          <w:sz w:val="32"/>
+          <w:szCs w:val="32"/>
+        </w:rPr>
+        <w:t>Rotate token</w:t>
+      </w:r>
+    </w:p>
+    <w:p>
+      <w:pPr>
+        <w:pStyle w:val="ListParagraph"/>
+        <w:numPr>
+          <w:ilvl w:val="0"/>
+          <w:numId w:val="4"/>
+        </w:numPr>
+        <w:rPr>
+          <w:sz w:val="32"/>
+          <w:szCs w:val="32"/>
+        </w:rPr>
+      </w:pPr>
+      <w:r>
+        <w:rPr>
+          <w:sz w:val="32"/>
+          <w:szCs w:val="32"/>
+        </w:rPr>
+        <w:t>Logout</w:t>
+      </w:r>
+    </w:p>
+    <w:p>
+      <w:pPr>
+        <w:pStyle w:val="ListParagraph"/>
+        <w:rPr>
+          <w:sz w:val="32"/>
+          <w:szCs w:val="32"/>
+        </w:rPr>
+        <w:sectPr>
+          <w:type w:val="continuous"/>
+          <w:pgSz w:w="12240" w:h="15840"/>
+          <w:pgMar w:top="1440" w:right="1440" w:bottom="1440" w:left="1440" w:header="720" w:footer="720" w:gutter="0"/>
+          <w:pgBorders w:offsetFrom="page">
+            <w:top w:val="thinThickThinSmallGap" w:sz="12" w:space="24" w:color="auto"/>
+            <w:left w:val="thinThickThinSmallGap" w:sz="12" w:space="24" w:color="auto"/>
+            <w:bottom w:val="thinThickThinSmallGap" w:sz="12" w:space="24" w:color="auto"/>
+            <w:right w:val="thinThickThinSmallGap" w:sz="12" w:space="24" w:color="auto"/>
+          </w:pgBorders>
+          <w:cols w:num="2" w:space="720"/>
+          <w:docGrid w:linePitch="360"/>
+        </w:sectPr>
+      </w:pPr>
+    </w:p>
+    <w:p>
+      <w:pPr>
+        <w:pStyle w:val="ListParagraph"/>
+        <w:numPr>
+          <w:ilvl w:val="0"/>
+          <w:numId w:val="10"/>
+        </w:numPr>
+        <w:rPr>
+          <w:sz w:val="32"/>
+          <w:szCs w:val="32"/>
+        </w:rPr>
+      </w:pPr>
+      <w:r>
+        <w:rPr>
+          <w:sz w:val="32"/>
+          <w:szCs w:val="32"/>
+        </w:rPr>
+        <w:lastRenderedPageBreak/>
+        <w:t>User:</w:t>
+      </w:r>
+    </w:p>
+    <w:p>
+      <w:pPr>
+        <w:pStyle w:val="ListParagraph"/>
+        <w:numPr>
+          <w:ilvl w:val="0"/>
+          <w:numId w:val="11"/>
+        </w:numPr>
         <w:rPr>
           <w:sz w:val="32"/>
           <w:szCs w:val="32"/>
@@ -1325,12 +1611,103 @@
     </w:p>
     <w:p>
       <w:pPr>
-        <w:rPr>
-          <w:b/>
-          <w:bCs/>
-          <w:sz w:val="44"/>
-          <w:szCs w:val="44"/>
-          <w:u w:val="single"/>
+        <w:pStyle w:val="ListParagraph"/>
+        <w:numPr>
+          <w:ilvl w:val="0"/>
+          <w:numId w:val="11"/>
+        </w:numPr>
+        <w:rPr>
+          <w:sz w:val="32"/>
+          <w:szCs w:val="32"/>
+        </w:rPr>
+      </w:pPr>
+      <w:r>
+        <w:rPr>
+          <w:sz w:val="32"/>
+          <w:szCs w:val="32"/>
+        </w:rPr>
+        <w:lastRenderedPageBreak/>
+        <w:t>P</w:t>
+      </w:r>
+      <w:r>
+        <w:rPr>
+          <w:sz w:val="32"/>
+          <w:szCs w:val="32"/>
+        </w:rPr>
+        <w:t>rofile</w:t>
+      </w:r>
+    </w:p>
+    <w:p>
+      <w:pPr>
+        <w:pStyle w:val="ListParagraph"/>
+        <w:numPr>
+          <w:ilvl w:val="0"/>
+          <w:numId w:val="11"/>
+        </w:numPr>
+        <w:rPr>
+          <w:sz w:val="32"/>
+          <w:szCs w:val="32"/>
+        </w:rPr>
+      </w:pPr>
+      <w:r>
+        <w:rPr>
+          <w:sz w:val="32"/>
+          <w:szCs w:val="32"/>
+        </w:rPr>
+        <w:t>Get all users</w:t>
+      </w:r>
+    </w:p>
+    <w:p>
+      <w:pPr>
+        <w:pStyle w:val="ListParagraph"/>
+        <w:numPr>
+          <w:ilvl w:val="0"/>
+          <w:numId w:val="11"/>
+        </w:numPr>
+        <w:rPr>
+          <w:sz w:val="32"/>
+          <w:szCs w:val="32"/>
+        </w:rPr>
+      </w:pPr>
+      <w:r>
+        <w:rPr>
+          <w:sz w:val="32"/>
+          <w:szCs w:val="32"/>
+        </w:rPr>
+        <w:t>Update Profile</w:t>
+      </w:r>
+    </w:p>
+    <w:p>
+      <w:pPr>
+        <w:pStyle w:val="ListParagraph"/>
+        <w:numPr>
+          <w:ilvl w:val="0"/>
+          <w:numId w:val="11"/>
+        </w:numPr>
+        <w:rPr>
+          <w:sz w:val="32"/>
+          <w:szCs w:val="32"/>
+        </w:rPr>
+      </w:pPr>
+      <w:r>
+        <w:rPr>
+          <w:sz w:val="32"/>
+          <w:szCs w:val="32"/>
+        </w:rPr>
+        <w:lastRenderedPageBreak/>
+        <w:t>Share Profile</w:t>
+      </w:r>
+    </w:p>
+    <w:p>
+      <w:pPr>
+        <w:pStyle w:val="ListParagraph"/>
+        <w:numPr>
+          <w:ilvl w:val="0"/>
+          <w:numId w:val="11"/>
+        </w:numPr>
+        <w:rPr>
+          <w:sz w:val="32"/>
+          <w:szCs w:val="32"/>
         </w:rPr>
         <w:sectPr>
           <w:type w:val="continuous"/>
@@ -1346,46 +1723,16 @@
           <w:docGrid w:linePitch="360"/>
         </w:sectPr>
       </w:pPr>
-    </w:p>
-    <w:p>
-      <w:pPr>
-        <w:rPr>
-          <w:b/>
-          <w:bCs/>
-          <w:sz w:val="44"/>
-          <w:szCs w:val="44"/>
-          <w:u w:val="single"/>
-        </w:rPr>
-      </w:pPr>
-      <w:r>
-        <w:rPr>
-          <w:b/>
-          <w:bCs/>
-          <w:sz w:val="44"/>
-          <w:szCs w:val="44"/>
-          <w:u w:val="single"/>
-        </w:rPr>
-        <w:lastRenderedPageBreak/>
-        <w:t>Sprints</w:t>
-      </w:r>
-      <w:r>
-        <w:rPr>
-          <w:b/>
-          <w:bCs/>
-          <w:sz w:val="44"/>
-          <w:szCs w:val="44"/>
-          <w:u w:val="single"/>
-        </w:rPr>
-        <w:t>:</w:t>
-      </w:r>
-    </w:p>
-    <w:p>
-      <w:pPr>
-        <w:pStyle w:val="ListParagraph"/>
-        <w:numPr>
-          <w:ilvl w:val="0"/>
-          <w:numId w:val="5"/>
-        </w:numPr>
+      <w:r>
+        <w:rPr>
+          <w:sz w:val="32"/>
+          <w:szCs w:val="32"/>
+        </w:rPr>
+        <w:t>Change profile image</w:t>
+      </w:r>
+    </w:p>
+    <w:p>
+      <w:pPr>
         <w:rPr>
           <w:sz w:val="32"/>
           <w:szCs w:val="32"/>
@@ -1410,7 +1757,7 @@
         <w:pStyle w:val="ListParagraph"/>
         <w:numPr>
           <w:ilvl w:val="0"/>
-          <w:numId w:val="5"/>
+          <w:numId w:val="10"/>
         </w:numPr>
         <w:rPr>
           <w:sz w:val="32"/>
@@ -1423,22 +1770,22 @@
           <w:szCs w:val="32"/>
         </w:rPr>
         <w:lastRenderedPageBreak/>
-        <w:t xml:space="preserve">Sprint one </w:t>
-      </w:r>
-      <w:r>
-        <w:rPr>
-          <w:sz w:val="32"/>
-          <w:szCs w:val="32"/>
-        </w:rPr>
-        <w:t>(5/09/2026 – 11/09/2026)</w:t>
-      </w:r>
-    </w:p>
-    <w:p>
-      <w:pPr>
-        <w:pStyle w:val="ListParagraph"/>
-        <w:numPr>
-          <w:ilvl w:val="0"/>
-          <w:numId w:val="6"/>
+        <w:t>Message</w:t>
+      </w:r>
+      <w:r>
+        <w:rPr>
+          <w:sz w:val="32"/>
+          <w:szCs w:val="32"/>
+        </w:rPr>
+        <w:t>:</w:t>
+      </w:r>
+    </w:p>
+    <w:p>
+      <w:pPr>
+        <w:pStyle w:val="ListParagraph"/>
+        <w:numPr>
+          <w:ilvl w:val="0"/>
+          <w:numId w:val="11"/>
         </w:numPr>
         <w:rPr>
           <w:sz w:val="32"/>
@@ -1464,7 +1811,7 @@
         <w:pStyle w:val="ListParagraph"/>
         <w:numPr>
           <w:ilvl w:val="0"/>
-          <w:numId w:val="6"/>
+          <w:numId w:val="14"/>
         </w:numPr>
         <w:rPr>
           <w:sz w:val="32"/>
@@ -1477,136 +1824,62 @@
           <w:szCs w:val="32"/>
         </w:rPr>
         <w:lastRenderedPageBreak/>
-        <w:t>Setup application structure</w:t>
-      </w:r>
-    </w:p>
-    <w:p>
-      <w:pPr>
-        <w:pStyle w:val="ListParagraph"/>
-        <w:numPr>
-          <w:ilvl w:val="0"/>
-          <w:numId w:val="6"/>
-        </w:numPr>
-        <w:rPr>
-          <w:sz w:val="32"/>
-          <w:szCs w:val="32"/>
-        </w:rPr>
-      </w:pPr>
-      <w:r>
-        <w:rPr>
-          <w:sz w:val="32"/>
-          <w:szCs w:val="32"/>
-        </w:rPr>
-        <w:t>Connect DB</w:t>
-      </w:r>
-    </w:p>
-    <w:p>
-      <w:pPr>
-        <w:pStyle w:val="ListParagraph"/>
-        <w:numPr>
-          <w:ilvl w:val="0"/>
-          <w:numId w:val="6"/>
-        </w:numPr>
-        <w:rPr>
-          <w:sz w:val="32"/>
-          <w:szCs w:val="32"/>
-        </w:rPr>
-      </w:pPr>
-      <w:r>
-        <w:rPr>
-          <w:sz w:val="32"/>
-          <w:szCs w:val="32"/>
-        </w:rPr>
-        <w:t>MODEL</w:t>
-      </w:r>
-    </w:p>
-    <w:p>
-      <w:pPr>
-        <w:pStyle w:val="ListParagraph"/>
-        <w:numPr>
-          <w:ilvl w:val="0"/>
-          <w:numId w:val="6"/>
-        </w:numPr>
-        <w:rPr>
-          <w:sz w:val="32"/>
-          <w:szCs w:val="32"/>
-        </w:rPr>
-      </w:pPr>
-      <w:r>
-        <w:rPr>
-          <w:sz w:val="32"/>
-          <w:szCs w:val="32"/>
-        </w:rPr>
-        <w:lastRenderedPageBreak/>
-        <w:t>Repository</w:t>
-      </w:r>
-    </w:p>
-    <w:p>
-      <w:pPr>
-        <w:pStyle w:val="ListParagraph"/>
-        <w:numPr>
-          <w:ilvl w:val="0"/>
-          <w:numId w:val="6"/>
-        </w:numPr>
-        <w:rPr>
-          <w:sz w:val="32"/>
-          <w:szCs w:val="32"/>
-        </w:rPr>
-      </w:pPr>
-      <w:r>
-        <w:rPr>
-          <w:sz w:val="32"/>
-          <w:szCs w:val="32"/>
-        </w:rPr>
-        <w:t>Signup</w:t>
-      </w:r>
-    </w:p>
-    <w:p>
-      <w:pPr>
-        <w:pStyle w:val="ListParagraph"/>
-        <w:numPr>
-          <w:ilvl w:val="0"/>
-          <w:numId w:val="6"/>
-        </w:numPr>
-        <w:rPr>
-          <w:sz w:val="32"/>
-          <w:szCs w:val="32"/>
-        </w:rPr>
-      </w:pPr>
-      <w:r>
-        <w:rPr>
-          <w:sz w:val="32"/>
-          <w:szCs w:val="32"/>
-        </w:rPr>
-        <w:t>login</w:t>
-      </w:r>
-    </w:p>
-    <w:p>
-      <w:pPr>
-        <w:pStyle w:val="ListParagraph"/>
-        <w:numPr>
-          <w:ilvl w:val="0"/>
-          <w:numId w:val="6"/>
-        </w:numPr>
-        <w:rPr>
-          <w:sz w:val="32"/>
-          <w:szCs w:val="32"/>
-        </w:rPr>
-      </w:pPr>
-      <w:r>
-        <w:rPr>
-          <w:sz w:val="32"/>
-          <w:szCs w:val="32"/>
-        </w:rPr>
-        <w:t>Hash and encryption</w:t>
-      </w:r>
-    </w:p>
-    <w:p>
-      <w:pPr>
-        <w:pStyle w:val="ListParagraph"/>
-        <w:numPr>
-          <w:ilvl w:val="0"/>
-          <w:numId w:val="5"/>
+        <w:t>Send message</w:t>
+      </w:r>
+    </w:p>
+    <w:p>
+      <w:pPr>
+        <w:pStyle w:val="ListParagraph"/>
+        <w:numPr>
+          <w:ilvl w:val="0"/>
+          <w:numId w:val="14"/>
+        </w:numPr>
+        <w:rPr>
+          <w:sz w:val="32"/>
+          <w:szCs w:val="32"/>
+        </w:rPr>
+      </w:pPr>
+      <w:r>
+        <w:rPr>
+          <w:sz w:val="32"/>
+          <w:szCs w:val="32"/>
+        </w:rPr>
+        <w:t xml:space="preserve">Get all </w:t>
+      </w:r>
+      <w:r>
+        <w:rPr>
+          <w:sz w:val="32"/>
+          <w:szCs w:val="32"/>
+        </w:rPr>
+        <w:t>messages</w:t>
+      </w:r>
+    </w:p>
+    <w:p>
+      <w:pPr>
+        <w:pStyle w:val="ListParagraph"/>
+        <w:numPr>
+          <w:ilvl w:val="0"/>
+          <w:numId w:val="14"/>
+        </w:numPr>
+        <w:rPr>
+          <w:sz w:val="32"/>
+          <w:szCs w:val="32"/>
+        </w:rPr>
+      </w:pPr>
+      <w:r>
+        <w:rPr>
+          <w:sz w:val="32"/>
+          <w:szCs w:val="32"/>
+        </w:rPr>
+        <w:t>Get certain message</w:t>
+      </w:r>
+    </w:p>
+    <w:p>
+      <w:pPr>
+        <w:pStyle w:val="ListParagraph"/>
+        <w:numPr>
+          <w:ilvl w:val="0"/>
+          <w:numId w:val="14"/>
         </w:numPr>
         <w:rPr>
           <w:sz w:val="32"/>
@@ -1626,34 +1899,49 @@
           <w:docGrid w:linePitch="360"/>
         </w:sectPr>
       </w:pPr>
-    </w:p>
-    <w:p>
-      <w:pPr>
-        <w:pStyle w:val="ListParagraph"/>
-        <w:numPr>
-          <w:ilvl w:val="0"/>
-          <w:numId w:val="5"/>
-        </w:numPr>
-        <w:rPr>
-          <w:sz w:val="32"/>
-          <w:szCs w:val="32"/>
-        </w:rPr>
-      </w:pPr>
       <w:r>
         <w:rPr>
           <w:sz w:val="32"/>
           <w:szCs w:val="32"/>
         </w:rPr>
         <w:lastRenderedPageBreak/>
-        <w:t>Sprint two (12/09/2026 – 18/09/2026)</w:t>
-      </w:r>
-    </w:p>
-    <w:p>
-      <w:pPr>
-        <w:pStyle w:val="ListParagraph"/>
-        <w:numPr>
-          <w:ilvl w:val="0"/>
-          <w:numId w:val="7"/>
+        <w:t>Delete certain message</w:t>
+      </w:r>
+    </w:p>
+    <w:p>
+      <w:pPr>
+        <w:pStyle w:val="ListParagraph"/>
+        <w:numPr>
+          <w:ilvl w:val="0"/>
+          <w:numId w:val="10"/>
+        </w:numPr>
+        <w:rPr>
+          <w:sz w:val="32"/>
+          <w:szCs w:val="32"/>
+        </w:rPr>
+      </w:pPr>
+      <w:r>
+        <w:rPr>
+          <w:sz w:val="32"/>
+          <w:szCs w:val="32"/>
+        </w:rPr>
+        <w:lastRenderedPageBreak/>
+        <w:t>Conversation</w:t>
+      </w:r>
+      <w:r>
+        <w:rPr>
+          <w:sz w:val="32"/>
+          <w:szCs w:val="32"/>
+        </w:rPr>
+        <w:t>:</w:t>
+      </w:r>
+    </w:p>
+    <w:p>
+      <w:pPr>
+        <w:pStyle w:val="ListParagraph"/>
+        <w:numPr>
+          <w:ilvl w:val="0"/>
+          <w:numId w:val="11"/>
         </w:numPr>
         <w:rPr>
           <w:sz w:val="32"/>
@@ -1679,7 +1967,7 @@
         <w:pStyle w:val="ListParagraph"/>
         <w:numPr>
           <w:ilvl w:val="0"/>
-          <w:numId w:val="7"/>
+          <w:numId w:val="16"/>
         </w:numPr>
         <w:rPr>
           <w:sz w:val="32"/>
@@ -1692,55 +1980,15 @@
           <w:szCs w:val="32"/>
         </w:rPr>
         <w:lastRenderedPageBreak/>
-        <w:t>Error-exception</w:t>
-      </w:r>
-    </w:p>
-    <w:p>
-      <w:pPr>
-        <w:pStyle w:val="ListParagraph"/>
-        <w:numPr>
-          <w:ilvl w:val="0"/>
-          <w:numId w:val="7"/>
-        </w:numPr>
-        <w:rPr>
-          <w:sz w:val="32"/>
-          <w:szCs w:val="32"/>
-        </w:rPr>
-      </w:pPr>
-      <w:r>
-        <w:rPr>
-          <w:sz w:val="32"/>
-          <w:szCs w:val="32"/>
-        </w:rPr>
-        <w:t>Token</w:t>
-      </w:r>
-    </w:p>
-    <w:p>
-      <w:pPr>
-        <w:pStyle w:val="ListParagraph"/>
-        <w:numPr>
-          <w:ilvl w:val="0"/>
-          <w:numId w:val="7"/>
-        </w:numPr>
-        <w:rPr>
-          <w:sz w:val="32"/>
-          <w:szCs w:val="32"/>
-        </w:rPr>
-      </w:pPr>
-      <w:r>
-        <w:rPr>
-          <w:sz w:val="32"/>
-          <w:szCs w:val="32"/>
-        </w:rPr>
-        <w:t>Authentication</w:t>
-      </w:r>
-    </w:p>
-    <w:p>
-      <w:pPr>
-        <w:pStyle w:val="ListParagraph"/>
-        <w:numPr>
-          <w:ilvl w:val="0"/>
-          <w:numId w:val="7"/>
+        <w:t>Get all conversations</w:t>
+      </w:r>
+    </w:p>
+    <w:p>
+      <w:pPr>
+        <w:pStyle w:val="ListParagraph"/>
+        <w:numPr>
+          <w:ilvl w:val="0"/>
+          <w:numId w:val="16"/>
         </w:numPr>
         <w:rPr>
           <w:sz w:val="32"/>
@@ -1753,36 +2001,11 @@
           <w:szCs w:val="32"/>
         </w:rPr>
         <w:lastRenderedPageBreak/>
-        <w:t>Authorization</w:t>
-      </w:r>
-    </w:p>
-    <w:p>
-      <w:pPr>
-        <w:pStyle w:val="ListParagraph"/>
-        <w:numPr>
-          <w:ilvl w:val="0"/>
-          <w:numId w:val="7"/>
-        </w:numPr>
-        <w:rPr>
-          <w:sz w:val="32"/>
-          <w:szCs w:val="32"/>
-        </w:rPr>
-      </w:pPr>
-      <w:r>
-        <w:rPr>
-          <w:sz w:val="32"/>
-          <w:szCs w:val="32"/>
-        </w:rPr>
-        <w:t>Validation</w:t>
-      </w:r>
-    </w:p>
-    <w:p>
-      <w:pPr>
-        <w:pStyle w:val="ListParagraph"/>
-        <w:numPr>
-          <w:ilvl w:val="0"/>
-          <w:numId w:val="5"/>
-        </w:numPr>
+        <w:t>Create conversation</w:t>
+      </w:r>
+    </w:p>
+    <w:p>
+      <w:pPr>
         <w:rPr>
           <w:sz w:val="32"/>
           <w:szCs w:val="32"/>
@@ -1807,7 +2030,7 @@
         <w:pStyle w:val="ListParagraph"/>
         <w:numPr>
           <w:ilvl w:val="0"/>
-          <w:numId w:val="5"/>
+          <w:numId w:val="10"/>
         </w:numPr>
         <w:rPr>
           <w:sz w:val="32"/>
@@ -1820,15 +2043,22 @@
           <w:szCs w:val="32"/>
         </w:rPr>
         <w:lastRenderedPageBreak/>
-        <w:t>Sprint three (19/09/2026 – 25/09/2026)</w:t>
-      </w:r>
-    </w:p>
-    <w:p>
-      <w:pPr>
-        <w:pStyle w:val="ListParagraph"/>
-        <w:numPr>
-          <w:ilvl w:val="0"/>
-          <w:numId w:val="8"/>
+        <w:t>Request</w:t>
+      </w:r>
+      <w:r>
+        <w:rPr>
+          <w:sz w:val="32"/>
+          <w:szCs w:val="32"/>
+        </w:rPr>
+        <w:t>:</w:t>
+      </w:r>
+    </w:p>
+    <w:p>
+      <w:pPr>
+        <w:pStyle w:val="ListParagraph"/>
+        <w:numPr>
+          <w:ilvl w:val="0"/>
+          <w:numId w:val="11"/>
         </w:numPr>
         <w:rPr>
           <w:sz w:val="32"/>
@@ -1854,7 +2084,7 @@
         <w:pStyle w:val="ListParagraph"/>
         <w:numPr>
           <w:ilvl w:val="0"/>
-          <w:numId w:val="8"/>
+          <w:numId w:val="17"/>
         </w:numPr>
         <w:rPr>
           <w:sz w:val="32"/>
@@ -1867,82 +2097,77 @@
           <w:szCs w:val="32"/>
         </w:rPr>
         <w:lastRenderedPageBreak/>
-        <w:t>Send email</w:t>
-      </w:r>
-    </w:p>
-    <w:p>
-      <w:pPr>
-        <w:pStyle w:val="ListParagraph"/>
-        <w:numPr>
-          <w:ilvl w:val="0"/>
-          <w:numId w:val="8"/>
-        </w:numPr>
-        <w:rPr>
-          <w:sz w:val="32"/>
-          <w:szCs w:val="32"/>
-        </w:rPr>
-      </w:pPr>
-      <w:proofErr w:type="spellStart"/>
-      <w:r>
-        <w:rPr>
-          <w:sz w:val="32"/>
-          <w:szCs w:val="32"/>
-        </w:rPr>
-        <w:t>Otp</w:t>
-      </w:r>
-      <w:proofErr w:type="spellEnd"/>
-    </w:p>
-    <w:p>
-      <w:pPr>
-        <w:pStyle w:val="ListParagraph"/>
-        <w:numPr>
-          <w:ilvl w:val="0"/>
-          <w:numId w:val="8"/>
-        </w:numPr>
-        <w:rPr>
-          <w:sz w:val="32"/>
-          <w:szCs w:val="32"/>
-        </w:rPr>
-      </w:pPr>
-      <w:proofErr w:type="spellStart"/>
+        <w:t xml:space="preserve">Get all </w:t>
+      </w:r>
+      <w:r>
+        <w:rPr>
+          <w:sz w:val="32"/>
+          <w:szCs w:val="32"/>
+        </w:rPr>
+        <w:t>requests</w:t>
+      </w:r>
+    </w:p>
+    <w:p>
+      <w:pPr>
+        <w:pStyle w:val="ListParagraph"/>
+        <w:numPr>
+          <w:ilvl w:val="0"/>
+          <w:numId w:val="17"/>
+        </w:numPr>
+        <w:rPr>
+          <w:sz w:val="32"/>
+          <w:szCs w:val="32"/>
+        </w:rPr>
+      </w:pPr>
       <w:r>
         <w:rPr>
           <w:sz w:val="32"/>
           <w:szCs w:val="32"/>
         </w:rPr>
         <w:lastRenderedPageBreak/>
-        <w:t>Redis</w:t>
-      </w:r>
-      <w:proofErr w:type="spellEnd"/>
-    </w:p>
-    <w:p>
-      <w:pPr>
-        <w:pStyle w:val="ListParagraph"/>
-        <w:numPr>
-          <w:ilvl w:val="0"/>
-          <w:numId w:val="8"/>
-        </w:numPr>
-        <w:rPr>
-          <w:sz w:val="32"/>
-          <w:szCs w:val="32"/>
-        </w:rPr>
-      </w:pPr>
-      <w:proofErr w:type="spellStart"/>
-      <w:r>
-        <w:rPr>
-          <w:sz w:val="32"/>
-          <w:szCs w:val="32"/>
-        </w:rPr>
-        <w:t>Multer</w:t>
-      </w:r>
-      <w:proofErr w:type="spellEnd"/>
-    </w:p>
-    <w:p>
-      <w:pPr>
-        <w:pStyle w:val="ListParagraph"/>
-        <w:numPr>
-          <w:ilvl w:val="0"/>
-          <w:numId w:val="5"/>
+        <w:t>Take a request action (accepted, rejected)</w:t>
+      </w:r>
+    </w:p>
+    <w:p>
+      <w:pPr>
+        <w:pStyle w:val="ListParagraph"/>
+        <w:numPr>
+          <w:ilvl w:val="0"/>
+          <w:numId w:val="17"/>
+        </w:numPr>
+        <w:rPr>
+          <w:sz w:val="32"/>
+          <w:szCs w:val="32"/>
+          <w:rtl/>
+        </w:rPr>
+      </w:pPr>
+      <w:r>
+        <w:rPr>
+          <w:sz w:val="32"/>
+          <w:szCs w:val="32"/>
+        </w:rPr>
+        <w:lastRenderedPageBreak/>
+        <w:t>Create request</w:t>
+      </w:r>
+    </w:p>
+    <w:p>
+      <w:pPr>
+        <w:rPr>
+          <w:b/>
+          <w:bCs/>
+          <w:sz w:val="44"/>
+          <w:szCs w:val="44"/>
+          <w:u w:val="single"/>
+          <w:rtl/>
+        </w:rPr>
+      </w:pPr>
+    </w:p>
+    <w:p>
+      <w:pPr>
+        <w:pStyle w:val="ListParagraph"/>
+        <w:numPr>
+          <w:ilvl w:val="0"/>
+          <w:numId w:val="17"/>
         </w:numPr>
         <w:rPr>
           <w:sz w:val="32"/>
@@ -1968,6 +2193,724 @@
         <w:pStyle w:val="ListParagraph"/>
         <w:numPr>
           <w:ilvl w:val="0"/>
+          <w:numId w:val="18"/>
+        </w:numPr>
+        <w:rPr>
+          <w:sz w:val="32"/>
+          <w:szCs w:val="32"/>
+        </w:rPr>
+      </w:pPr>
+      <w:r>
+        <w:rPr>
+          <w:sz w:val="32"/>
+          <w:szCs w:val="32"/>
+        </w:rPr>
+        <w:lastRenderedPageBreak/>
+        <w:t>Rate limiting (per IP, per route, Redis-backed)</w:t>
+      </w:r>
+    </w:p>
+    <w:p>
+      <w:pPr>
+        <w:pStyle w:val="ListParagraph"/>
+        <w:numPr>
+          <w:ilvl w:val="0"/>
+          <w:numId w:val="18"/>
+        </w:numPr>
+        <w:rPr>
+          <w:sz w:val="32"/>
+          <w:szCs w:val="32"/>
+        </w:rPr>
+      </w:pPr>
+      <w:r>
+        <w:rPr>
+          <w:sz w:val="32"/>
+          <w:szCs w:val="32"/>
+        </w:rPr>
+        <w:t>Login brute-force protection</w:t>
+      </w:r>
+    </w:p>
+    <w:p>
+      <w:pPr>
+        <w:pStyle w:val="ListParagraph"/>
+        <w:numPr>
+          <w:ilvl w:val="0"/>
+          <w:numId w:val="18"/>
+        </w:numPr>
+        <w:rPr>
+          <w:sz w:val="32"/>
+          <w:szCs w:val="32"/>
+        </w:rPr>
+        <w:sectPr>
+          <w:type w:val="continuous"/>
+          <w:pgSz w:w="12240" w:h="15840"/>
+          <w:pgMar w:top="1440" w:right="1440" w:bottom="1440" w:left="1440" w:header="720" w:footer="720" w:gutter="0"/>
+          <w:pgBorders w:offsetFrom="page">
+            <w:top w:val="thinThickThinSmallGap" w:sz="12" w:space="24" w:color="auto"/>
+            <w:left w:val="thinThickThinSmallGap" w:sz="12" w:space="24" w:color="auto"/>
+            <w:bottom w:val="thinThickThinSmallGap" w:sz="12" w:space="24" w:color="auto"/>
+            <w:right w:val="thinThickThinSmallGap" w:sz="12" w:space="24" w:color="auto"/>
+          </w:pgBorders>
+          <w:cols w:space="720"/>
+          <w:docGrid w:linePitch="360"/>
+        </w:sectPr>
+      </w:pPr>
+      <w:r>
+        <w:rPr>
+          <w:sz w:val="32"/>
+          <w:szCs w:val="32"/>
+        </w:rPr>
+        <w:t>Geo-restricted access (Egypt only)</w:t>
+      </w:r>
+    </w:p>
+    <w:p>
+      <w:pPr>
+        <w:rPr>
+          <w:b/>
+          <w:bCs/>
+          <w:sz w:val="44"/>
+          <w:szCs w:val="44"/>
+          <w:u w:val="single"/>
+        </w:rPr>
+        <w:sectPr>
+          <w:type w:val="continuous"/>
+          <w:pgSz w:w="12240" w:h="15840"/>
+          <w:pgMar w:top="1440" w:right="1440" w:bottom="1440" w:left="1440" w:header="720" w:footer="720" w:gutter="0"/>
+          <w:pgBorders w:offsetFrom="page">
+            <w:top w:val="thinThickThinSmallGap" w:sz="12" w:space="24" w:color="auto"/>
+            <w:left w:val="thinThickThinSmallGap" w:sz="12" w:space="24" w:color="auto"/>
+            <w:bottom w:val="thinThickThinSmallGap" w:sz="12" w:space="24" w:color="auto"/>
+            <w:right w:val="thinThickThinSmallGap" w:sz="12" w:space="24" w:color="auto"/>
+          </w:pgBorders>
+          <w:cols w:space="720"/>
+          <w:docGrid w:linePitch="360"/>
+        </w:sectPr>
+      </w:pPr>
+    </w:p>
+    <w:p>
+      <w:pPr>
+        <w:rPr>
+          <w:b/>
+          <w:bCs/>
+          <w:sz w:val="44"/>
+          <w:szCs w:val="44"/>
+          <w:u w:val="single"/>
+        </w:rPr>
+      </w:pPr>
+    </w:p>
+    <w:p>
+      <w:pPr>
+        <w:rPr>
+          <w:b/>
+          <w:bCs/>
+          <w:sz w:val="44"/>
+          <w:szCs w:val="44"/>
+          <w:u w:val="single"/>
+        </w:rPr>
+      </w:pPr>
+      <w:r>
+        <w:rPr>
+          <w:b/>
+          <w:bCs/>
+          <w:sz w:val="44"/>
+          <w:szCs w:val="44"/>
+          <w:u w:val="single"/>
+        </w:rPr>
+        <w:t>Sprints</w:t>
+      </w:r>
+      <w:r>
+        <w:rPr>
+          <w:b/>
+          <w:bCs/>
+          <w:sz w:val="44"/>
+          <w:szCs w:val="44"/>
+          <w:u w:val="single"/>
+        </w:rPr>
+        <w:t>:</w:t>
+      </w:r>
+    </w:p>
+    <w:p>
+      <w:pPr>
+        <w:pStyle w:val="ListParagraph"/>
+        <w:numPr>
+          <w:ilvl w:val="0"/>
+          <w:numId w:val="5"/>
+        </w:numPr>
+        <w:rPr>
+          <w:sz w:val="32"/>
+          <w:szCs w:val="32"/>
+        </w:rPr>
+        <w:sectPr>
+          <w:type w:val="continuous"/>
+          <w:pgSz w:w="12240" w:h="15840"/>
+          <w:pgMar w:top="1440" w:right="1440" w:bottom="1440" w:left="1440" w:header="720" w:footer="720" w:gutter="0"/>
+          <w:pgBorders w:offsetFrom="page">
+            <w:top w:val="thinThickThinSmallGap" w:sz="12" w:space="24" w:color="auto"/>
+            <w:left w:val="thinThickThinSmallGap" w:sz="12" w:space="24" w:color="auto"/>
+            <w:bottom w:val="thinThickThinSmallGap" w:sz="12" w:space="24" w:color="auto"/>
+            <w:right w:val="thinThickThinSmallGap" w:sz="12" w:space="24" w:color="auto"/>
+          </w:pgBorders>
+          <w:cols w:space="720"/>
+          <w:docGrid w:linePitch="360"/>
+        </w:sectPr>
+      </w:pPr>
+    </w:p>
+    <w:p>
+      <w:pPr>
+        <w:pStyle w:val="ListParagraph"/>
+        <w:numPr>
+          <w:ilvl w:val="0"/>
+          <w:numId w:val="5"/>
+        </w:numPr>
+        <w:rPr>
+          <w:sz w:val="32"/>
+          <w:szCs w:val="32"/>
+        </w:rPr>
+      </w:pPr>
+      <w:r>
+        <w:rPr>
+          <w:sz w:val="32"/>
+          <w:szCs w:val="32"/>
+        </w:rPr>
+        <w:lastRenderedPageBreak/>
+        <w:t xml:space="preserve">Sprint one </w:t>
+      </w:r>
+      <w:r>
+        <w:rPr>
+          <w:sz w:val="32"/>
+          <w:szCs w:val="32"/>
+        </w:rPr>
+        <w:t>(5/09/2026 – 11/09/2026)</w:t>
+      </w:r>
+    </w:p>
+    <w:p>
+      <w:pPr>
+        <w:pStyle w:val="ListParagraph"/>
+        <w:numPr>
+          <w:ilvl w:val="0"/>
+          <w:numId w:val="6"/>
+        </w:numPr>
+        <w:rPr>
+          <w:sz w:val="32"/>
+          <w:szCs w:val="32"/>
+        </w:rPr>
+        <w:sectPr>
+          <w:type w:val="continuous"/>
+          <w:pgSz w:w="12240" w:h="15840"/>
+          <w:pgMar w:top="1440" w:right="1440" w:bottom="1440" w:left="1440" w:header="720" w:footer="720" w:gutter="0"/>
+          <w:pgBorders w:offsetFrom="page">
+            <w:top w:val="thinThickThinSmallGap" w:sz="12" w:space="24" w:color="auto"/>
+            <w:left w:val="thinThickThinSmallGap" w:sz="12" w:space="24" w:color="auto"/>
+            <w:bottom w:val="thinThickThinSmallGap" w:sz="12" w:space="24" w:color="auto"/>
+            <w:right w:val="thinThickThinSmallGap" w:sz="12" w:space="24" w:color="auto"/>
+          </w:pgBorders>
+          <w:cols w:space="720"/>
+          <w:docGrid w:linePitch="360"/>
+        </w:sectPr>
+      </w:pPr>
+    </w:p>
+    <w:p>
+      <w:pPr>
+        <w:pStyle w:val="ListParagraph"/>
+        <w:numPr>
+          <w:ilvl w:val="0"/>
+          <w:numId w:val="6"/>
+        </w:numPr>
+        <w:rPr>
+          <w:sz w:val="32"/>
+          <w:szCs w:val="32"/>
+        </w:rPr>
+      </w:pPr>
+      <w:r>
+        <w:rPr>
+          <w:sz w:val="32"/>
+          <w:szCs w:val="32"/>
+        </w:rPr>
+        <w:lastRenderedPageBreak/>
+        <w:t>Setup application structure</w:t>
+      </w:r>
+    </w:p>
+    <w:p>
+      <w:pPr>
+        <w:pStyle w:val="ListParagraph"/>
+        <w:numPr>
+          <w:ilvl w:val="0"/>
+          <w:numId w:val="6"/>
+        </w:numPr>
+        <w:rPr>
+          <w:sz w:val="32"/>
+          <w:szCs w:val="32"/>
+        </w:rPr>
+      </w:pPr>
+      <w:r>
+        <w:rPr>
+          <w:sz w:val="32"/>
+          <w:szCs w:val="32"/>
+        </w:rPr>
+        <w:t>Connect DB</w:t>
+      </w:r>
+    </w:p>
+    <w:p>
+      <w:pPr>
+        <w:pStyle w:val="ListParagraph"/>
+        <w:numPr>
+          <w:ilvl w:val="0"/>
+          <w:numId w:val="6"/>
+        </w:numPr>
+        <w:rPr>
+          <w:sz w:val="32"/>
+          <w:szCs w:val="32"/>
+        </w:rPr>
+      </w:pPr>
+      <w:r>
+        <w:rPr>
+          <w:sz w:val="32"/>
+          <w:szCs w:val="32"/>
+        </w:rPr>
+        <w:t>MODEL</w:t>
+      </w:r>
+    </w:p>
+    <w:p>
+      <w:pPr>
+        <w:pStyle w:val="ListParagraph"/>
+        <w:numPr>
+          <w:ilvl w:val="0"/>
+          <w:numId w:val="6"/>
+        </w:numPr>
+        <w:rPr>
+          <w:sz w:val="32"/>
+          <w:szCs w:val="32"/>
+        </w:rPr>
+      </w:pPr>
+      <w:r>
+        <w:rPr>
+          <w:sz w:val="32"/>
+          <w:szCs w:val="32"/>
+        </w:rPr>
+        <w:lastRenderedPageBreak/>
+        <w:t>Repository</w:t>
+      </w:r>
+    </w:p>
+    <w:p>
+      <w:pPr>
+        <w:pStyle w:val="ListParagraph"/>
+        <w:numPr>
+          <w:ilvl w:val="0"/>
+          <w:numId w:val="6"/>
+        </w:numPr>
+        <w:rPr>
+          <w:sz w:val="32"/>
+          <w:szCs w:val="32"/>
+        </w:rPr>
+      </w:pPr>
+      <w:r>
+        <w:rPr>
+          <w:sz w:val="32"/>
+          <w:szCs w:val="32"/>
+        </w:rPr>
+        <w:t>Signup</w:t>
+      </w:r>
+    </w:p>
+    <w:p>
+      <w:pPr>
+        <w:pStyle w:val="ListParagraph"/>
+        <w:numPr>
+          <w:ilvl w:val="0"/>
+          <w:numId w:val="6"/>
+        </w:numPr>
+        <w:rPr>
+          <w:sz w:val="32"/>
+          <w:szCs w:val="32"/>
+        </w:rPr>
+      </w:pPr>
+      <w:r>
+        <w:rPr>
+          <w:sz w:val="32"/>
+          <w:szCs w:val="32"/>
+        </w:rPr>
+        <w:t>login</w:t>
+      </w:r>
+    </w:p>
+    <w:p>
+      <w:pPr>
+        <w:pStyle w:val="ListParagraph"/>
+        <w:numPr>
+          <w:ilvl w:val="0"/>
+          <w:numId w:val="6"/>
+        </w:numPr>
+        <w:rPr>
+          <w:sz w:val="32"/>
+          <w:szCs w:val="32"/>
+        </w:rPr>
+      </w:pPr>
+      <w:r>
+        <w:rPr>
+          <w:sz w:val="32"/>
+          <w:szCs w:val="32"/>
+        </w:rPr>
+        <w:t>Hash and encryption</w:t>
+      </w:r>
+    </w:p>
+    <w:p>
+      <w:pPr>
+        <w:pStyle w:val="ListParagraph"/>
+        <w:numPr>
+          <w:ilvl w:val="0"/>
+          <w:numId w:val="5"/>
+        </w:numPr>
+        <w:rPr>
+          <w:sz w:val="32"/>
+          <w:szCs w:val="32"/>
+        </w:rPr>
+        <w:sectPr>
+          <w:type w:val="continuous"/>
+          <w:pgSz w:w="12240" w:h="15840"/>
+          <w:pgMar w:top="1440" w:right="1440" w:bottom="1440" w:left="1440" w:header="720" w:footer="720" w:gutter="0"/>
+          <w:pgBorders w:offsetFrom="page">
+            <w:top w:val="thinThickThinSmallGap" w:sz="12" w:space="24" w:color="auto"/>
+            <w:left w:val="thinThickThinSmallGap" w:sz="12" w:space="24" w:color="auto"/>
+            <w:bottom w:val="thinThickThinSmallGap" w:sz="12" w:space="24" w:color="auto"/>
+            <w:right w:val="thinThickThinSmallGap" w:sz="12" w:space="24" w:color="auto"/>
+          </w:pgBorders>
+          <w:cols w:num="2" w:space="720"/>
+          <w:docGrid w:linePitch="360"/>
+        </w:sectPr>
+      </w:pPr>
+    </w:p>
+    <w:p>
+      <w:pPr>
+        <w:pStyle w:val="ListParagraph"/>
+        <w:numPr>
+          <w:ilvl w:val="0"/>
+          <w:numId w:val="5"/>
+        </w:numPr>
+        <w:rPr>
+          <w:sz w:val="32"/>
+          <w:szCs w:val="32"/>
+        </w:rPr>
+      </w:pPr>
+      <w:r>
+        <w:rPr>
+          <w:sz w:val="32"/>
+          <w:szCs w:val="32"/>
+        </w:rPr>
+        <w:lastRenderedPageBreak/>
+        <w:t>Sprint two (12/09/2026 – 18/09/2026)</w:t>
+      </w:r>
+    </w:p>
+    <w:p>
+      <w:pPr>
+        <w:pStyle w:val="ListParagraph"/>
+        <w:numPr>
+          <w:ilvl w:val="0"/>
+          <w:numId w:val="7"/>
+        </w:numPr>
+        <w:rPr>
+          <w:sz w:val="32"/>
+          <w:szCs w:val="32"/>
+        </w:rPr>
+        <w:sectPr>
+          <w:type w:val="continuous"/>
+          <w:pgSz w:w="12240" w:h="15840"/>
+          <w:pgMar w:top="1440" w:right="1440" w:bottom="1440" w:left="1440" w:header="720" w:footer="720" w:gutter="0"/>
+          <w:pgBorders w:offsetFrom="page">
+            <w:top w:val="thinThickThinSmallGap" w:sz="12" w:space="24" w:color="auto"/>
+            <w:left w:val="thinThickThinSmallGap" w:sz="12" w:space="24" w:color="auto"/>
+            <w:bottom w:val="thinThickThinSmallGap" w:sz="12" w:space="24" w:color="auto"/>
+            <w:right w:val="thinThickThinSmallGap" w:sz="12" w:space="24" w:color="auto"/>
+          </w:pgBorders>
+          <w:cols w:space="720"/>
+          <w:docGrid w:linePitch="360"/>
+        </w:sectPr>
+      </w:pPr>
+    </w:p>
+    <w:p>
+      <w:pPr>
+        <w:pStyle w:val="ListParagraph"/>
+        <w:numPr>
+          <w:ilvl w:val="0"/>
+          <w:numId w:val="7"/>
+        </w:numPr>
+        <w:rPr>
+          <w:sz w:val="32"/>
+          <w:szCs w:val="32"/>
+        </w:rPr>
+      </w:pPr>
+      <w:r>
+        <w:rPr>
+          <w:sz w:val="32"/>
+          <w:szCs w:val="32"/>
+        </w:rPr>
+        <w:lastRenderedPageBreak/>
+        <w:t>Error-exception</w:t>
+      </w:r>
+    </w:p>
+    <w:p>
+      <w:pPr>
+        <w:pStyle w:val="ListParagraph"/>
+        <w:numPr>
+          <w:ilvl w:val="0"/>
+          <w:numId w:val="7"/>
+        </w:numPr>
+        <w:rPr>
+          <w:sz w:val="32"/>
+          <w:szCs w:val="32"/>
+        </w:rPr>
+      </w:pPr>
+      <w:r>
+        <w:rPr>
+          <w:sz w:val="32"/>
+          <w:szCs w:val="32"/>
+        </w:rPr>
+        <w:t>Token</w:t>
+      </w:r>
+    </w:p>
+    <w:p>
+      <w:pPr>
+        <w:pStyle w:val="ListParagraph"/>
+        <w:numPr>
+          <w:ilvl w:val="0"/>
+          <w:numId w:val="7"/>
+        </w:numPr>
+        <w:rPr>
+          <w:sz w:val="32"/>
+          <w:szCs w:val="32"/>
+        </w:rPr>
+      </w:pPr>
+      <w:r>
+        <w:rPr>
+          <w:sz w:val="32"/>
+          <w:szCs w:val="32"/>
+        </w:rPr>
+        <w:t>Authentication</w:t>
+      </w:r>
+    </w:p>
+    <w:p>
+      <w:pPr>
+        <w:pStyle w:val="ListParagraph"/>
+        <w:numPr>
+          <w:ilvl w:val="0"/>
+          <w:numId w:val="7"/>
+        </w:numPr>
+        <w:rPr>
+          <w:sz w:val="32"/>
+          <w:szCs w:val="32"/>
+        </w:rPr>
+      </w:pPr>
+      <w:r>
+        <w:rPr>
+          <w:sz w:val="32"/>
+          <w:szCs w:val="32"/>
+        </w:rPr>
+        <w:lastRenderedPageBreak/>
+        <w:t>Authorization</w:t>
+      </w:r>
+    </w:p>
+    <w:p>
+      <w:pPr>
+        <w:pStyle w:val="ListParagraph"/>
+        <w:numPr>
+          <w:ilvl w:val="0"/>
+          <w:numId w:val="7"/>
+        </w:numPr>
+        <w:rPr>
+          <w:sz w:val="32"/>
+          <w:szCs w:val="32"/>
+        </w:rPr>
+      </w:pPr>
+      <w:r>
+        <w:rPr>
+          <w:sz w:val="32"/>
+          <w:szCs w:val="32"/>
+        </w:rPr>
+        <w:t>Validation</w:t>
+      </w:r>
+    </w:p>
+    <w:p>
+      <w:pPr>
+        <w:pStyle w:val="ListParagraph"/>
+        <w:numPr>
+          <w:ilvl w:val="0"/>
+          <w:numId w:val="5"/>
+        </w:numPr>
+        <w:rPr>
+          <w:sz w:val="32"/>
+          <w:szCs w:val="32"/>
+        </w:rPr>
+        <w:sectPr>
+          <w:type w:val="continuous"/>
+          <w:pgSz w:w="12240" w:h="15840"/>
+          <w:pgMar w:top="1440" w:right="1440" w:bottom="1440" w:left="1440" w:header="720" w:footer="720" w:gutter="0"/>
+          <w:pgBorders w:offsetFrom="page">
+            <w:top w:val="thinThickThinSmallGap" w:sz="12" w:space="24" w:color="auto"/>
+            <w:left w:val="thinThickThinSmallGap" w:sz="12" w:space="24" w:color="auto"/>
+            <w:bottom w:val="thinThickThinSmallGap" w:sz="12" w:space="24" w:color="auto"/>
+            <w:right w:val="thinThickThinSmallGap" w:sz="12" w:space="24" w:color="auto"/>
+          </w:pgBorders>
+          <w:cols w:num="2" w:space="720"/>
+          <w:docGrid w:linePitch="360"/>
+        </w:sectPr>
+      </w:pPr>
+    </w:p>
+    <w:p>
+      <w:pPr>
+        <w:pStyle w:val="ListParagraph"/>
+        <w:numPr>
+          <w:ilvl w:val="0"/>
+          <w:numId w:val="5"/>
+        </w:numPr>
+        <w:rPr>
+          <w:sz w:val="32"/>
+          <w:szCs w:val="32"/>
+        </w:rPr>
+      </w:pPr>
+      <w:r>
+        <w:rPr>
+          <w:sz w:val="32"/>
+          <w:szCs w:val="32"/>
+        </w:rPr>
+        <w:lastRenderedPageBreak/>
+        <w:t>Sprint three (19/09/2026 – 25/09/2026)</w:t>
+      </w:r>
+    </w:p>
+    <w:p>
+      <w:pPr>
+        <w:pStyle w:val="ListParagraph"/>
+        <w:numPr>
+          <w:ilvl w:val="0"/>
+          <w:numId w:val="8"/>
+        </w:numPr>
+        <w:rPr>
+          <w:sz w:val="32"/>
+          <w:szCs w:val="32"/>
+        </w:rPr>
+        <w:sectPr>
+          <w:type w:val="continuous"/>
+          <w:pgSz w:w="12240" w:h="15840"/>
+          <w:pgMar w:top="1440" w:right="1440" w:bottom="1440" w:left="1440" w:header="720" w:footer="720" w:gutter="0"/>
+          <w:pgBorders w:offsetFrom="page">
+            <w:top w:val="thinThickThinSmallGap" w:sz="12" w:space="24" w:color="auto"/>
+            <w:left w:val="thinThickThinSmallGap" w:sz="12" w:space="24" w:color="auto"/>
+            <w:bottom w:val="thinThickThinSmallGap" w:sz="12" w:space="24" w:color="auto"/>
+            <w:right w:val="thinThickThinSmallGap" w:sz="12" w:space="24" w:color="auto"/>
+          </w:pgBorders>
+          <w:cols w:space="720"/>
+          <w:docGrid w:linePitch="360"/>
+        </w:sectPr>
+      </w:pPr>
+    </w:p>
+    <w:p>
+      <w:pPr>
+        <w:pStyle w:val="ListParagraph"/>
+        <w:numPr>
+          <w:ilvl w:val="0"/>
+          <w:numId w:val="8"/>
+        </w:numPr>
+        <w:rPr>
+          <w:sz w:val="32"/>
+          <w:szCs w:val="32"/>
+        </w:rPr>
+      </w:pPr>
+      <w:r>
+        <w:rPr>
+          <w:sz w:val="32"/>
+          <w:szCs w:val="32"/>
+        </w:rPr>
+        <w:lastRenderedPageBreak/>
+        <w:t>Send email</w:t>
+      </w:r>
+    </w:p>
+    <w:p>
+      <w:pPr>
+        <w:pStyle w:val="ListParagraph"/>
+        <w:numPr>
+          <w:ilvl w:val="0"/>
+          <w:numId w:val="8"/>
+        </w:numPr>
+        <w:rPr>
+          <w:sz w:val="32"/>
+          <w:szCs w:val="32"/>
+        </w:rPr>
+      </w:pPr>
+      <w:r>
+        <w:rPr>
+          <w:sz w:val="32"/>
+          <w:szCs w:val="32"/>
+        </w:rPr>
+        <w:t>Otp</w:t>
+      </w:r>
+    </w:p>
+    <w:p>
+      <w:pPr>
+        <w:pStyle w:val="ListParagraph"/>
+        <w:numPr>
+          <w:ilvl w:val="0"/>
+          <w:numId w:val="8"/>
+        </w:numPr>
+        <w:rPr>
+          <w:sz w:val="32"/>
+          <w:szCs w:val="32"/>
+        </w:rPr>
+      </w:pPr>
+      <w:r>
+        <w:rPr>
+          <w:sz w:val="32"/>
+          <w:szCs w:val="32"/>
+        </w:rPr>
+        <w:lastRenderedPageBreak/>
+        <w:t>Redis</w:t>
+      </w:r>
+    </w:p>
+    <w:p>
+      <w:pPr>
+        <w:pStyle w:val="ListParagraph"/>
+        <w:numPr>
+          <w:ilvl w:val="0"/>
+          <w:numId w:val="8"/>
+        </w:numPr>
+        <w:rPr>
+          <w:sz w:val="32"/>
+          <w:szCs w:val="32"/>
+        </w:rPr>
+      </w:pPr>
+      <w:r>
+        <w:rPr>
+          <w:sz w:val="32"/>
+          <w:szCs w:val="32"/>
+        </w:rPr>
+        <w:t>Multer</w:t>
+      </w:r>
+    </w:p>
+    <w:p>
+      <w:pPr>
+        <w:pStyle w:val="ListParagraph"/>
+        <w:numPr>
+          <w:ilvl w:val="0"/>
+          <w:numId w:val="5"/>
+        </w:numPr>
+        <w:rPr>
+          <w:sz w:val="32"/>
+          <w:szCs w:val="32"/>
+        </w:rPr>
+        <w:sectPr>
+          <w:type w:val="continuous"/>
+          <w:pgSz w:w="12240" w:h="15840"/>
+          <w:pgMar w:top="1440" w:right="1440" w:bottom="1440" w:left="1440" w:header="720" w:footer="720" w:gutter="0"/>
+          <w:pgBorders w:offsetFrom="page">
+            <w:top w:val="thinThickThinSmallGap" w:sz="12" w:space="24" w:color="auto"/>
+            <w:left w:val="thinThickThinSmallGap" w:sz="12" w:space="24" w:color="auto"/>
+            <w:bottom w:val="thinThickThinSmallGap" w:sz="12" w:space="24" w:color="auto"/>
+            <w:right w:val="thinThickThinSmallGap" w:sz="12" w:space="24" w:color="auto"/>
+          </w:pgBorders>
+          <w:cols w:num="2" w:space="720"/>
+          <w:docGrid w:linePitch="360"/>
+        </w:sectPr>
+      </w:pPr>
+    </w:p>
+    <w:p>
+      <w:pPr>
+        <w:pStyle w:val="ListParagraph"/>
+        <w:numPr>
+          <w:ilvl w:val="0"/>
           <w:numId w:val="5"/>
         </w:numPr>
         <w:rPr>
@@ -2002,6 +2945,74 @@
           <w:szCs w:val="32"/>
         </w:rPr>
         <w:t>Deployment</w:t>
+      </w:r>
+    </w:p>
+    <w:p>
+      <w:pPr>
+        <w:pStyle w:val="ListParagraph"/>
+        <w:numPr>
+          <w:ilvl w:val="0"/>
+          <w:numId w:val="9"/>
+        </w:numPr>
+        <w:rPr>
+          <w:sz w:val="32"/>
+          <w:szCs w:val="32"/>
+        </w:rPr>
+      </w:pPr>
+      <w:r>
+        <w:rPr>
+          <w:sz w:val="32"/>
+          <w:szCs w:val="32"/>
+        </w:rPr>
+        <w:t xml:space="preserve">Deploy to VPS, process management with PM2 (cluster mode), environment-based configuration </w:t>
+      </w:r>
+      <w:proofErr w:type="gramStart"/>
+      <w:r>
+        <w:rPr>
+          <w:sz w:val="32"/>
+          <w:szCs w:val="32"/>
+        </w:rPr>
+        <w:t>(.</w:t>
+      </w:r>
+      <w:proofErr w:type="spellStart"/>
+      <w:r>
+        <w:rPr>
+          <w:sz w:val="32"/>
+          <w:szCs w:val="32"/>
+        </w:rPr>
+        <w:t>env</w:t>
+      </w:r>
+      <w:proofErr w:type="gramEnd"/>
+      <w:r>
+        <w:rPr>
+          <w:sz w:val="32"/>
+          <w:szCs w:val="32"/>
+        </w:rPr>
+        <w:t>.development</w:t>
+      </w:r>
+      <w:proofErr w:type="spellEnd"/>
+      <w:r>
+        <w:rPr>
+          <w:sz w:val="32"/>
+          <w:szCs w:val="32"/>
+        </w:rPr>
+        <w:t xml:space="preserve"> / .</w:t>
+      </w:r>
+      <w:proofErr w:type="spellStart"/>
+      <w:r>
+        <w:rPr>
+          <w:sz w:val="32"/>
+          <w:szCs w:val="32"/>
+        </w:rPr>
+        <w:t>env.production</w:t>
+      </w:r>
+      <w:proofErr w:type="spellEnd"/>
+      <w:r>
+        <w:rPr>
+          <w:sz w:val="32"/>
+          <w:szCs w:val="32"/>
+        </w:rPr>
+        <w:t>)</w:t>
       </w:r>
     </w:p>
     <w:p>
@@ -2185,6 +3196,184 @@
     </w:lvl>
   </w:abstractNum>
   <w:abstractNum w:abstractNumId="1" w15:restartNumberingAfterBreak="0">
+    <w:nsid w:val="136B122A"/>
+    <w:multiLevelType w:val="hybridMultilevel"/>
+    <w:tmpl w:val="168094E0"/>
+    <w:lvl w:ilvl="0" w:tplc="04090001">
+      <w:start w:val="1"/>
+      <w:numFmt w:val="bullet"/>
+      <w:lvlText w:val=""/>
+      <w:lvlJc w:val="left"/>
+      <w:pPr>
+        <w:ind w:left="1485" w:hanging="360"/>
+      </w:pPr>
+      <w:rPr>
+        <w:rFonts w:ascii="Symbol" w:hAnsi="Symbol" w:hint="default"/>
+      </w:rPr>
+    </w:lvl>
+    <w:lvl w:ilvl="1" w:tplc="04090019" w:tentative="1">
+      <w:start w:val="1"/>
+      <w:numFmt w:val="lowerLetter"/>
+      <w:lvlText w:val="%2."/>
+      <w:lvlJc w:val="left"/>
+      <w:pPr>
+        <w:ind w:left="2205" w:hanging="360"/>
+      </w:pPr>
+    </w:lvl>
+    <w:lvl w:ilvl="2" w:tplc="0409001B" w:tentative="1">
+      <w:start w:val="1"/>
+      <w:numFmt w:val="lowerRoman"/>
+      <w:lvlText w:val="%3."/>
+      <w:lvlJc w:val="right"/>
+      <w:pPr>
+        <w:ind w:left="2925" w:hanging="180"/>
+      </w:pPr>
+    </w:lvl>
+    <w:lvl w:ilvl="3" w:tplc="0409000F" w:tentative="1">
+      <w:start w:val="1"/>
+      <w:numFmt w:val="decimal"/>
+      <w:lvlText w:val="%4."/>
+      <w:lvlJc w:val="left"/>
+      <w:pPr>
+        <w:ind w:left="3645" w:hanging="360"/>
+      </w:pPr>
+    </w:lvl>
+    <w:lvl w:ilvl="4" w:tplc="04090019" w:tentative="1">
+      <w:start w:val="1"/>
+      <w:numFmt w:val="lowerLetter"/>
+      <w:lvlText w:val="%5."/>
+      <w:lvlJc w:val="left"/>
+      <w:pPr>
+        <w:ind w:left="4365" w:hanging="360"/>
+      </w:pPr>
+    </w:lvl>
+    <w:lvl w:ilvl="5" w:tplc="0409001B" w:tentative="1">
+      <w:start w:val="1"/>
+      <w:numFmt w:val="lowerRoman"/>
+      <w:lvlText w:val="%6."/>
+      <w:lvlJc w:val="right"/>
+      <w:pPr>
+        <w:ind w:left="5085" w:hanging="180"/>
+      </w:pPr>
+    </w:lvl>
+    <w:lvl w:ilvl="6" w:tplc="0409000F" w:tentative="1">
+      <w:start w:val="1"/>
+      <w:numFmt w:val="decimal"/>
+      <w:lvlText w:val="%7."/>
+      <w:lvlJc w:val="left"/>
+      <w:pPr>
+        <w:ind w:left="5805" w:hanging="360"/>
+      </w:pPr>
+    </w:lvl>
+    <w:lvl w:ilvl="7" w:tplc="04090019" w:tentative="1">
+      <w:start w:val="1"/>
+      <w:numFmt w:val="lowerLetter"/>
+      <w:lvlText w:val="%8."/>
+      <w:lvlJc w:val="left"/>
+      <w:pPr>
+        <w:ind w:left="6525" w:hanging="360"/>
+      </w:pPr>
+    </w:lvl>
+    <w:lvl w:ilvl="8" w:tplc="0409001B" w:tentative="1">
+      <w:start w:val="1"/>
+      <w:numFmt w:val="lowerRoman"/>
+      <w:lvlText w:val="%9."/>
+      <w:lvlJc w:val="right"/>
+      <w:pPr>
+        <w:ind w:left="7245" w:hanging="180"/>
+      </w:pPr>
+    </w:lvl>
+  </w:abstractNum>
+  <w:abstractNum w:abstractNumId="2" w15:restartNumberingAfterBreak="0">
+    <w:nsid w:val="13D2044D"/>
+    <w:multiLevelType w:val="hybridMultilevel"/>
+    <w:tmpl w:val="40E62674"/>
+    <w:lvl w:ilvl="0" w:tplc="AACA7A7C">
+      <w:start w:val="1"/>
+      <w:numFmt w:val="decimal"/>
+      <w:lvlText w:val="%1-"/>
+      <w:lvlJc w:val="left"/>
+      <w:pPr>
+        <w:ind w:left="1485" w:hanging="360"/>
+      </w:pPr>
+      <w:rPr>
+        <w:rFonts w:hint="default"/>
+      </w:rPr>
+    </w:lvl>
+    <w:lvl w:ilvl="1" w:tplc="04090019" w:tentative="1">
+      <w:start w:val="1"/>
+      <w:numFmt w:val="lowerLetter"/>
+      <w:lvlText w:val="%2."/>
+      <w:lvlJc w:val="left"/>
+      <w:pPr>
+        <w:ind w:left="2205" w:hanging="360"/>
+      </w:pPr>
+    </w:lvl>
+    <w:lvl w:ilvl="2" w:tplc="0409001B" w:tentative="1">
+      <w:start w:val="1"/>
+      <w:numFmt w:val="lowerRoman"/>
+      <w:lvlText w:val="%3."/>
+      <w:lvlJc w:val="right"/>
+      <w:pPr>
+        <w:ind w:left="2925" w:hanging="180"/>
+      </w:pPr>
+    </w:lvl>
+    <w:lvl w:ilvl="3" w:tplc="0409000F" w:tentative="1">
+      <w:start w:val="1"/>
+      <w:numFmt w:val="decimal"/>
+      <w:lvlText w:val="%4."/>
+      <w:lvlJc w:val="left"/>
+      <w:pPr>
+        <w:ind w:left="3645" w:hanging="360"/>
+      </w:pPr>
+    </w:lvl>
+    <w:lvl w:ilvl="4" w:tplc="04090019" w:tentative="1">
+      <w:start w:val="1"/>
+      <w:numFmt w:val="lowerLetter"/>
+      <w:lvlText w:val="%5."/>
+      <w:lvlJc w:val="left"/>
+      <w:pPr>
+        <w:ind w:left="4365" w:hanging="360"/>
+      </w:pPr>
+    </w:lvl>
+    <w:lvl w:ilvl="5" w:tplc="0409001B" w:tentative="1">
+      <w:start w:val="1"/>
+      <w:numFmt w:val="lowerRoman"/>
+      <w:lvlText w:val="%6."/>
+      <w:lvlJc w:val="right"/>
+      <w:pPr>
+        <w:ind w:left="5085" w:hanging="180"/>
+      </w:pPr>
+    </w:lvl>
+    <w:lvl w:ilvl="6" w:tplc="0409000F" w:tentative="1">
+      <w:start w:val="1"/>
+      <w:numFmt w:val="decimal"/>
+      <w:lvlText w:val="%7."/>
+      <w:lvlJc w:val="left"/>
+      <w:pPr>
+        <w:ind w:left="5805" w:hanging="360"/>
+      </w:pPr>
+    </w:lvl>
+    <w:lvl w:ilvl="7" w:tplc="04090019" w:tentative="1">
+      <w:start w:val="1"/>
+      <w:numFmt w:val="lowerLetter"/>
+      <w:lvlText w:val="%8."/>
+      <w:lvlJc w:val="left"/>
+      <w:pPr>
+        <w:ind w:left="6525" w:hanging="360"/>
+      </w:pPr>
+    </w:lvl>
+    <w:lvl w:ilvl="8" w:tplc="0409001B" w:tentative="1">
+      <w:start w:val="1"/>
+      <w:numFmt w:val="lowerRoman"/>
+      <w:lvlText w:val="%9."/>
+      <w:lvlJc w:val="right"/>
+      <w:pPr>
+        <w:ind w:left="7245" w:hanging="180"/>
+      </w:pPr>
+    </w:lvl>
+  </w:abstractNum>
+  <w:abstractNum w:abstractNumId="3" w15:restartNumberingAfterBreak="0">
     <w:nsid w:val="16F84DAD"/>
     <w:multiLevelType w:val="hybridMultilevel"/>
     <w:tmpl w:val="4A6A4B0A"/>
@@ -2273,7 +3462,96 @@
       </w:pPr>
     </w:lvl>
   </w:abstractNum>
-  <w:abstractNum w:abstractNumId="2" w15:restartNumberingAfterBreak="0">
+  <w:abstractNum w:abstractNumId="4" w15:restartNumberingAfterBreak="0">
+    <w:nsid w:val="18285BCE"/>
+    <w:multiLevelType w:val="hybridMultilevel"/>
+    <w:tmpl w:val="3544EF72"/>
+    <w:lvl w:ilvl="0" w:tplc="AACA7A7C">
+      <w:start w:val="1"/>
+      <w:numFmt w:val="decimal"/>
+      <w:lvlText w:val="%1-"/>
+      <w:lvlJc w:val="left"/>
+      <w:pPr>
+        <w:ind w:left="1485" w:hanging="360"/>
+      </w:pPr>
+      <w:rPr>
+        <w:rFonts w:hint="default"/>
+      </w:rPr>
+    </w:lvl>
+    <w:lvl w:ilvl="1" w:tplc="04090019" w:tentative="1">
+      <w:start w:val="1"/>
+      <w:numFmt w:val="lowerLetter"/>
+      <w:lvlText w:val="%2."/>
+      <w:lvlJc w:val="left"/>
+      <w:pPr>
+        <w:ind w:left="2205" w:hanging="360"/>
+      </w:pPr>
+    </w:lvl>
+    <w:lvl w:ilvl="2" w:tplc="0409001B" w:tentative="1">
+      <w:start w:val="1"/>
+      <w:numFmt w:val="lowerRoman"/>
+      <w:lvlText w:val="%3."/>
+      <w:lvlJc w:val="right"/>
+      <w:pPr>
+        <w:ind w:left="2925" w:hanging="180"/>
+      </w:pPr>
+    </w:lvl>
+    <w:lvl w:ilvl="3" w:tplc="0409000F" w:tentative="1">
+      <w:start w:val="1"/>
+      <w:numFmt w:val="decimal"/>
+      <w:lvlText w:val="%4."/>
+      <w:lvlJc w:val="left"/>
+      <w:pPr>
+        <w:ind w:left="3645" w:hanging="360"/>
+      </w:pPr>
+    </w:lvl>
+    <w:lvl w:ilvl="4" w:tplc="04090019" w:tentative="1">
+      <w:start w:val="1"/>
+      <w:numFmt w:val="lowerLetter"/>
+      <w:lvlText w:val="%5."/>
+      <w:lvlJc w:val="left"/>
+      <w:pPr>
+        <w:ind w:left="4365" w:hanging="360"/>
+      </w:pPr>
+    </w:lvl>
+    <w:lvl w:ilvl="5" w:tplc="0409001B" w:tentative="1">
+      <w:start w:val="1"/>
+      <w:numFmt w:val="lowerRoman"/>
+      <w:lvlText w:val="%6."/>
+      <w:lvlJc w:val="right"/>
+      <w:pPr>
+        <w:ind w:left="5085" w:hanging="180"/>
+      </w:pPr>
+    </w:lvl>
+    <w:lvl w:ilvl="6" w:tplc="0409000F" w:tentative="1">
+      <w:start w:val="1"/>
+      <w:numFmt w:val="decimal"/>
+      <w:lvlText w:val="%7."/>
+      <w:lvlJc w:val="left"/>
+      <w:pPr>
+        <w:ind w:left="5805" w:hanging="360"/>
+      </w:pPr>
+    </w:lvl>
+    <w:lvl w:ilvl="7" w:tplc="04090019" w:tentative="1">
+      <w:start w:val="1"/>
+      <w:numFmt w:val="lowerLetter"/>
+      <w:lvlText w:val="%8."/>
+      <w:lvlJc w:val="left"/>
+      <w:pPr>
+        <w:ind w:left="6525" w:hanging="360"/>
+      </w:pPr>
+    </w:lvl>
+    <w:lvl w:ilvl="8" w:tplc="0409001B" w:tentative="1">
+      <w:start w:val="1"/>
+      <w:numFmt w:val="lowerRoman"/>
+      <w:lvlText w:val="%9."/>
+      <w:lvlJc w:val="right"/>
+      <w:pPr>
+        <w:ind w:left="7245" w:hanging="180"/>
+      </w:pPr>
+    </w:lvl>
+  </w:abstractNum>
+  <w:abstractNum w:abstractNumId="5" w15:restartNumberingAfterBreak="0">
     <w:nsid w:val="19E520F8"/>
     <w:multiLevelType w:val="hybridMultilevel"/>
     <w:tmpl w:val="174E6598"/>
@@ -2362,7 +3640,7 @@
       </w:pPr>
     </w:lvl>
   </w:abstractNum>
-  <w:abstractNum w:abstractNumId="3" w15:restartNumberingAfterBreak="0">
+  <w:abstractNum w:abstractNumId="6" w15:restartNumberingAfterBreak="0">
     <w:nsid w:val="2C8D58AC"/>
     <w:multiLevelType w:val="hybridMultilevel"/>
     <w:tmpl w:val="16EA9878"/>
@@ -2475,17 +3753,17 @@
       </w:rPr>
     </w:lvl>
   </w:abstractNum>
-  <w:abstractNum w:abstractNumId="4" w15:restartNumberingAfterBreak="0">
-    <w:nsid w:val="352E6D4D"/>
+  <w:abstractNum w:abstractNumId="7" w15:restartNumberingAfterBreak="0">
+    <w:nsid w:val="332545F5"/>
     <w:multiLevelType w:val="hybridMultilevel"/>
-    <w:tmpl w:val="314E0254"/>
-    <w:lvl w:ilvl="0" w:tplc="FAE0E4E8">
+    <w:tmpl w:val="24B6A93A"/>
+    <w:lvl w:ilvl="0" w:tplc="AACA7A7C">
       <w:start w:val="1"/>
       <w:numFmt w:val="decimal"/>
       <w:lvlText w:val="%1-"/>
       <w:lvlJc w:val="left"/>
       <w:pPr>
-        <w:ind w:left="1530" w:hanging="405"/>
+        <w:ind w:left="1485" w:hanging="360"/>
       </w:pPr>
       <w:rPr>
         <w:rFonts w:hint="default"/>
@@ -2497,7 +3775,7 @@
       <w:lvlText w:val="%2."/>
       <w:lvlJc w:val="left"/>
       <w:pPr>
-        <w:ind w:left="2205" w:hanging="360"/>
+        <w:ind w:left="1440" w:hanging="360"/>
       </w:pPr>
     </w:lvl>
     <w:lvl w:ilvl="2" w:tplc="0409001B" w:tentative="1">
@@ -2506,7 +3784,7 @@
       <w:lvlText w:val="%3."/>
       <w:lvlJc w:val="right"/>
       <w:pPr>
-        <w:ind w:left="2925" w:hanging="180"/>
+        <w:ind w:left="2160" w:hanging="180"/>
       </w:pPr>
     </w:lvl>
     <w:lvl w:ilvl="3" w:tplc="0409000F" w:tentative="1">
@@ -2515,7 +3793,7 @@
       <w:lvlText w:val="%4."/>
       <w:lvlJc w:val="left"/>
       <w:pPr>
-        <w:ind w:left="3645" w:hanging="360"/>
+        <w:ind w:left="2880" w:hanging="360"/>
       </w:pPr>
     </w:lvl>
     <w:lvl w:ilvl="4" w:tplc="04090019" w:tentative="1">
@@ -2524,7 +3802,7 @@
       <w:lvlText w:val="%5."/>
       <w:lvlJc w:val="left"/>
       <w:pPr>
-        <w:ind w:left="4365" w:hanging="360"/>
+        <w:ind w:left="3600" w:hanging="360"/>
       </w:pPr>
     </w:lvl>
     <w:lvl w:ilvl="5" w:tplc="0409001B" w:tentative="1">
@@ -2533,7 +3811,7 @@
       <w:lvlText w:val="%6."/>
       <w:lvlJc w:val="right"/>
       <w:pPr>
-        <w:ind w:left="5085" w:hanging="180"/>
+        <w:ind w:left="4320" w:hanging="180"/>
       </w:pPr>
     </w:lvl>
     <w:lvl w:ilvl="6" w:tplc="0409000F" w:tentative="1">
@@ -2542,7 +3820,7 @@
       <w:lvlText w:val="%7."/>
       <w:lvlJc w:val="left"/>
       <w:pPr>
-        <w:ind w:left="5805" w:hanging="360"/>
+        <w:ind w:left="5040" w:hanging="360"/>
       </w:pPr>
     </w:lvl>
     <w:lvl w:ilvl="7" w:tplc="04090019" w:tentative="1">
@@ -2551,7 +3829,7 @@
       <w:lvlText w:val="%8."/>
       <w:lvlJc w:val="left"/>
       <w:pPr>
-        <w:ind w:left="6525" w:hanging="360"/>
+        <w:ind w:left="5760" w:hanging="360"/>
       </w:pPr>
     </w:lvl>
     <w:lvl w:ilvl="8" w:tplc="0409001B" w:tentative="1">
@@ -2560,11 +3838,100 @@
       <w:lvlText w:val="%9."/>
       <w:lvlJc w:val="right"/>
       <w:pPr>
+        <w:ind w:left="6480" w:hanging="180"/>
+      </w:pPr>
+    </w:lvl>
+  </w:abstractNum>
+  <w:abstractNum w:abstractNumId="8" w15:restartNumberingAfterBreak="0">
+    <w:nsid w:val="352E6D4D"/>
+    <w:multiLevelType w:val="hybridMultilevel"/>
+    <w:tmpl w:val="4C2CC018"/>
+    <w:lvl w:ilvl="0" w:tplc="FAE0E4E8">
+      <w:start w:val="1"/>
+      <w:numFmt w:val="decimal"/>
+      <w:lvlText w:val="%1-"/>
+      <w:lvlJc w:val="left"/>
+      <w:pPr>
+        <w:ind w:left="1530" w:hanging="405"/>
+      </w:pPr>
+      <w:rPr>
+        <w:rFonts w:hint="default"/>
+      </w:rPr>
+    </w:lvl>
+    <w:lvl w:ilvl="1" w:tplc="04090019" w:tentative="1">
+      <w:start w:val="1"/>
+      <w:numFmt w:val="lowerLetter"/>
+      <w:lvlText w:val="%2."/>
+      <w:lvlJc w:val="left"/>
+      <w:pPr>
+        <w:ind w:left="2205" w:hanging="360"/>
+      </w:pPr>
+    </w:lvl>
+    <w:lvl w:ilvl="2" w:tplc="0409001B" w:tentative="1">
+      <w:start w:val="1"/>
+      <w:numFmt w:val="lowerRoman"/>
+      <w:lvlText w:val="%3."/>
+      <w:lvlJc w:val="right"/>
+      <w:pPr>
+        <w:ind w:left="2925" w:hanging="180"/>
+      </w:pPr>
+    </w:lvl>
+    <w:lvl w:ilvl="3" w:tplc="0409000F" w:tentative="1">
+      <w:start w:val="1"/>
+      <w:numFmt w:val="decimal"/>
+      <w:lvlText w:val="%4."/>
+      <w:lvlJc w:val="left"/>
+      <w:pPr>
+        <w:ind w:left="3645" w:hanging="360"/>
+      </w:pPr>
+    </w:lvl>
+    <w:lvl w:ilvl="4" w:tplc="04090019" w:tentative="1">
+      <w:start w:val="1"/>
+      <w:numFmt w:val="lowerLetter"/>
+      <w:lvlText w:val="%5."/>
+      <w:lvlJc w:val="left"/>
+      <w:pPr>
+        <w:ind w:left="4365" w:hanging="360"/>
+      </w:pPr>
+    </w:lvl>
+    <w:lvl w:ilvl="5" w:tplc="0409001B" w:tentative="1">
+      <w:start w:val="1"/>
+      <w:numFmt w:val="lowerRoman"/>
+      <w:lvlText w:val="%6."/>
+      <w:lvlJc w:val="right"/>
+      <w:pPr>
+        <w:ind w:left="5085" w:hanging="180"/>
+      </w:pPr>
+    </w:lvl>
+    <w:lvl w:ilvl="6" w:tplc="0409000F" w:tentative="1">
+      <w:start w:val="1"/>
+      <w:numFmt w:val="decimal"/>
+      <w:lvlText w:val="%7."/>
+      <w:lvlJc w:val="left"/>
+      <w:pPr>
+        <w:ind w:left="5805" w:hanging="360"/>
+      </w:pPr>
+    </w:lvl>
+    <w:lvl w:ilvl="7" w:tplc="04090019" w:tentative="1">
+      <w:start w:val="1"/>
+      <w:numFmt w:val="lowerLetter"/>
+      <w:lvlText w:val="%8."/>
+      <w:lvlJc w:val="left"/>
+      <w:pPr>
+        <w:ind w:left="6525" w:hanging="360"/>
+      </w:pPr>
+    </w:lvl>
+    <w:lvl w:ilvl="8" w:tplc="0409001B" w:tentative="1">
+      <w:start w:val="1"/>
+      <w:numFmt w:val="lowerRoman"/>
+      <w:lvlText w:val="%9."/>
+      <w:lvlJc w:val="right"/>
+      <w:pPr>
         <w:ind w:left="7245" w:hanging="180"/>
       </w:pPr>
     </w:lvl>
   </w:abstractNum>
-  <w:abstractNum w:abstractNumId="5" w15:restartNumberingAfterBreak="0">
+  <w:abstractNum w:abstractNumId="9" w15:restartNumberingAfterBreak="0">
     <w:nsid w:val="3D841E73"/>
     <w:multiLevelType w:val="hybridMultilevel"/>
     <w:tmpl w:val="BD82B55A"/>
@@ -2677,7 +4044,96 @@
       </w:rPr>
     </w:lvl>
   </w:abstractNum>
-  <w:abstractNum w:abstractNumId="6" w15:restartNumberingAfterBreak="0">
+  <w:abstractNum w:abstractNumId="10" w15:restartNumberingAfterBreak="0">
+    <w:nsid w:val="3EB27BA0"/>
+    <w:multiLevelType w:val="hybridMultilevel"/>
+    <w:tmpl w:val="677A35B4"/>
+    <w:lvl w:ilvl="0" w:tplc="AACA7A7C">
+      <w:start w:val="1"/>
+      <w:numFmt w:val="decimal"/>
+      <w:lvlText w:val="%1-"/>
+      <w:lvlJc w:val="left"/>
+      <w:pPr>
+        <w:ind w:left="1485" w:hanging="360"/>
+      </w:pPr>
+      <w:rPr>
+        <w:rFonts w:hint="default"/>
+      </w:rPr>
+    </w:lvl>
+    <w:lvl w:ilvl="1" w:tplc="04090019" w:tentative="1">
+      <w:start w:val="1"/>
+      <w:numFmt w:val="lowerLetter"/>
+      <w:lvlText w:val="%2."/>
+      <w:lvlJc w:val="left"/>
+      <w:pPr>
+        <w:ind w:left="2205" w:hanging="360"/>
+      </w:pPr>
+    </w:lvl>
+    <w:lvl w:ilvl="2" w:tplc="0409001B" w:tentative="1">
+      <w:start w:val="1"/>
+      <w:numFmt w:val="lowerRoman"/>
+      <w:lvlText w:val="%3."/>
+      <w:lvlJc w:val="right"/>
+      <w:pPr>
+        <w:ind w:left="2925" w:hanging="180"/>
+      </w:pPr>
+    </w:lvl>
+    <w:lvl w:ilvl="3" w:tplc="0409000F" w:tentative="1">
+      <w:start w:val="1"/>
+      <w:numFmt w:val="decimal"/>
+      <w:lvlText w:val="%4."/>
+      <w:lvlJc w:val="left"/>
+      <w:pPr>
+        <w:ind w:left="3645" w:hanging="360"/>
+      </w:pPr>
+    </w:lvl>
+    <w:lvl w:ilvl="4" w:tplc="04090019" w:tentative="1">
+      <w:start w:val="1"/>
+      <w:numFmt w:val="lowerLetter"/>
+      <w:lvlText w:val="%5."/>
+      <w:lvlJc w:val="left"/>
+      <w:pPr>
+        <w:ind w:left="4365" w:hanging="360"/>
+      </w:pPr>
+    </w:lvl>
+    <w:lvl w:ilvl="5" w:tplc="0409001B" w:tentative="1">
+      <w:start w:val="1"/>
+      <w:numFmt w:val="lowerRoman"/>
+      <w:lvlText w:val="%6."/>
+      <w:lvlJc w:val="right"/>
+      <w:pPr>
+        <w:ind w:left="5085" w:hanging="180"/>
+      </w:pPr>
+    </w:lvl>
+    <w:lvl w:ilvl="6" w:tplc="0409000F" w:tentative="1">
+      <w:start w:val="1"/>
+      <w:numFmt w:val="decimal"/>
+      <w:lvlText w:val="%7."/>
+      <w:lvlJc w:val="left"/>
+      <w:pPr>
+        <w:ind w:left="5805" w:hanging="360"/>
+      </w:pPr>
+    </w:lvl>
+    <w:lvl w:ilvl="7" w:tplc="04090019" w:tentative="1">
+      <w:start w:val="1"/>
+      <w:numFmt w:val="lowerLetter"/>
+      <w:lvlText w:val="%8."/>
+      <w:lvlJc w:val="left"/>
+      <w:pPr>
+        <w:ind w:left="6525" w:hanging="360"/>
+      </w:pPr>
+    </w:lvl>
+    <w:lvl w:ilvl="8" w:tplc="0409001B" w:tentative="1">
+      <w:start w:val="1"/>
+      <w:numFmt w:val="lowerRoman"/>
+      <w:lvlText w:val="%9."/>
+      <w:lvlJc w:val="right"/>
+      <w:pPr>
+        <w:ind w:left="7245" w:hanging="180"/>
+      </w:pPr>
+    </w:lvl>
+  </w:abstractNum>
+  <w:abstractNum w:abstractNumId="11" w15:restartNumberingAfterBreak="0">
     <w:nsid w:val="42963C0F"/>
     <w:multiLevelType w:val="hybridMultilevel"/>
     <w:tmpl w:val="AEF43D50"/>
@@ -2790,7 +4246,7 @@
       </w:rPr>
     </w:lvl>
   </w:abstractNum>
-  <w:abstractNum w:abstractNumId="7" w15:restartNumberingAfterBreak="0">
+  <w:abstractNum w:abstractNumId="12" w15:restartNumberingAfterBreak="0">
     <w:nsid w:val="51183EA0"/>
     <w:multiLevelType w:val="hybridMultilevel"/>
     <w:tmpl w:val="A2DC844C"/>
@@ -2879,7 +4335,96 @@
       </w:pPr>
     </w:lvl>
   </w:abstractNum>
-  <w:abstractNum w:abstractNumId="8" w15:restartNumberingAfterBreak="0">
+  <w:abstractNum w:abstractNumId="13" w15:restartNumberingAfterBreak="0">
+    <w:nsid w:val="5AB92AF7"/>
+    <w:multiLevelType w:val="hybridMultilevel"/>
+    <w:tmpl w:val="58ECA7B4"/>
+    <w:lvl w:ilvl="0" w:tplc="68ACF84E">
+      <w:start w:val="1"/>
+      <w:numFmt w:val="decimal"/>
+      <w:lvlText w:val="%1-"/>
+      <w:lvlJc w:val="left"/>
+      <w:pPr>
+        <w:ind w:left="1485" w:hanging="360"/>
+      </w:pPr>
+      <w:rPr>
+        <w:rFonts w:hint="default"/>
+      </w:rPr>
+    </w:lvl>
+    <w:lvl w:ilvl="1" w:tplc="04090019" w:tentative="1">
+      <w:start w:val="1"/>
+      <w:numFmt w:val="lowerLetter"/>
+      <w:lvlText w:val="%2."/>
+      <w:lvlJc w:val="left"/>
+      <w:pPr>
+        <w:ind w:left="2205" w:hanging="360"/>
+      </w:pPr>
+    </w:lvl>
+    <w:lvl w:ilvl="2" w:tplc="0409001B" w:tentative="1">
+      <w:start w:val="1"/>
+      <w:numFmt w:val="lowerRoman"/>
+      <w:lvlText w:val="%3."/>
+      <w:lvlJc w:val="right"/>
+      <w:pPr>
+        <w:ind w:left="2925" w:hanging="180"/>
+      </w:pPr>
+    </w:lvl>
+    <w:lvl w:ilvl="3" w:tplc="0409000F" w:tentative="1">
+      <w:start w:val="1"/>
+      <w:numFmt w:val="decimal"/>
+      <w:lvlText w:val="%4."/>
+      <w:lvlJc w:val="left"/>
+      <w:pPr>
+        <w:ind w:left="3645" w:hanging="360"/>
+      </w:pPr>
+    </w:lvl>
+    <w:lvl w:ilvl="4" w:tplc="04090019" w:tentative="1">
+      <w:start w:val="1"/>
+      <w:numFmt w:val="lowerLetter"/>
+      <w:lvlText w:val="%5."/>
+      <w:lvlJc w:val="left"/>
+      <w:pPr>
+        <w:ind w:left="4365" w:hanging="360"/>
+      </w:pPr>
+    </w:lvl>
+    <w:lvl w:ilvl="5" w:tplc="0409001B" w:tentative="1">
+      <w:start w:val="1"/>
+      <w:numFmt w:val="lowerRoman"/>
+      <w:lvlText w:val="%6."/>
+      <w:lvlJc w:val="right"/>
+      <w:pPr>
+        <w:ind w:left="5085" w:hanging="180"/>
+      </w:pPr>
+    </w:lvl>
+    <w:lvl w:ilvl="6" w:tplc="0409000F" w:tentative="1">
+      <w:start w:val="1"/>
+      <w:numFmt w:val="decimal"/>
+      <w:lvlText w:val="%7."/>
+      <w:lvlJc w:val="left"/>
+      <w:pPr>
+        <w:ind w:left="5805" w:hanging="360"/>
+      </w:pPr>
+    </w:lvl>
+    <w:lvl w:ilvl="7" w:tplc="04090019" w:tentative="1">
+      <w:start w:val="1"/>
+      <w:numFmt w:val="lowerLetter"/>
+      <w:lvlText w:val="%8."/>
+      <w:lvlJc w:val="left"/>
+      <w:pPr>
+        <w:ind w:left="6525" w:hanging="360"/>
+      </w:pPr>
+    </w:lvl>
+    <w:lvl w:ilvl="8" w:tplc="0409001B" w:tentative="1">
+      <w:start w:val="1"/>
+      <w:numFmt w:val="lowerRoman"/>
+      <w:lvlText w:val="%9."/>
+      <w:lvlJc w:val="right"/>
+      <w:pPr>
+        <w:ind w:left="7245" w:hanging="180"/>
+      </w:pPr>
+    </w:lvl>
+  </w:abstractNum>
+  <w:abstractNum w:abstractNumId="14" w15:restartNumberingAfterBreak="0">
     <w:nsid w:val="632A02E2"/>
     <w:multiLevelType w:val="hybridMultilevel"/>
     <w:tmpl w:val="A30A4E5C"/>
@@ -2992,7 +4537,7 @@
       </w:rPr>
     </w:lvl>
   </w:abstractNum>
-  <w:abstractNum w:abstractNumId="9" w15:restartNumberingAfterBreak="0">
+  <w:abstractNum w:abstractNumId="15" w15:restartNumberingAfterBreak="0">
     <w:nsid w:val="69DC7116"/>
     <w:multiLevelType w:val="hybridMultilevel"/>
     <w:tmpl w:val="31282D18"/>
@@ -3105,7 +4650,7 @@
       </w:rPr>
     </w:lvl>
   </w:abstractNum>
-  <w:abstractNum w:abstractNumId="10" w15:restartNumberingAfterBreak="0">
+  <w:abstractNum w:abstractNumId="16" w15:restartNumberingAfterBreak="0">
     <w:nsid w:val="7C2F769B"/>
     <w:multiLevelType w:val="hybridMultilevel"/>
     <w:tmpl w:val="B4C09DE0"/>
@@ -3218,7 +4763,7 @@
       </w:rPr>
     </w:lvl>
   </w:abstractNum>
-  <w:abstractNum w:abstractNumId="11" w15:restartNumberingAfterBreak="0">
+  <w:abstractNum w:abstractNumId="17" w15:restartNumberingAfterBreak="0">
     <w:nsid w:val="7FC577D0"/>
     <w:multiLevelType w:val="hybridMultilevel"/>
     <w:tmpl w:val="3484347A"/>
@@ -3305,40 +4850,58 @@
     </w:lvl>
   </w:abstractNum>
   <w:num w:numId="1">
-    <w:abstractNumId w:val="11"/>
+    <w:abstractNumId w:val="17"/>
   </w:num>
   <w:num w:numId="2">
-    <w:abstractNumId w:val="9"/>
+    <w:abstractNumId w:val="15"/>
   </w:num>
   <w:num w:numId="3">
-    <w:abstractNumId w:val="10"/>
+    <w:abstractNumId w:val="16"/>
   </w:num>
   <w:num w:numId="4">
-    <w:abstractNumId w:val="7"/>
+    <w:abstractNumId w:val="12"/>
   </w:num>
   <w:num w:numId="5">
-    <w:abstractNumId w:val="1"/>
+    <w:abstractNumId w:val="3"/>
   </w:num>
   <w:num w:numId="6">
     <w:abstractNumId w:val="0"/>
   </w:num>
   <w:num w:numId="7">
+    <w:abstractNumId w:val="9"/>
+  </w:num>
+  <w:num w:numId="8">
+    <w:abstractNumId w:val="6"/>
+  </w:num>
+  <w:num w:numId="9">
+    <w:abstractNumId w:val="11"/>
+  </w:num>
+  <w:num w:numId="10">
+    <w:abstractNumId w:val="14"/>
+  </w:num>
+  <w:num w:numId="11">
+    <w:abstractNumId w:val="8"/>
+  </w:num>
+  <w:num w:numId="12">
     <w:abstractNumId w:val="5"/>
   </w:num>
-  <w:num w:numId="8">
-    <w:abstractNumId w:val="3"/>
+  <w:num w:numId="13">
+    <w:abstractNumId w:val="10"/>
   </w:num>
-  <w:num w:numId="9">
-    <w:abstractNumId w:val="6"/>
+  <w:num w:numId="14">
+    <w:abstractNumId w:val="7"/>
   </w:num>
-  <w:num w:numId="10">
-    <w:abstractNumId w:val="8"/>
-  </w:num>
-  <w:num w:numId="11">
+  <w:num w:numId="15">
     <w:abstractNumId w:val="4"/>
   </w:num>
-  <w:num w:numId="12">
+  <w:num w:numId="16">
     <w:abstractNumId w:val="2"/>
+  </w:num>
+  <w:num w:numId="17">
+    <w:abstractNumId w:val="13"/>
+  </w:num>
+  <w:num w:numId="18">
+    <w:abstractNumId w:val="1"/>
   </w:num>
 </w:numbering>
 </file>
@@ -4044,7 +5607,7 @@
 </file>
 
 <file path=customXml/itemProps1.xml><?xml version="1.0" encoding="utf-8"?>
-<ds:datastoreItem xmlns:ds="http://schemas.openxmlformats.org/officeDocument/2006/customXml" ds:itemID="{0D847A52-A3E0-44AC-95E2-5AE48D82D7FE}">
+<ds:datastoreItem xmlns:ds="http://schemas.openxmlformats.org/officeDocument/2006/customXml" ds:itemID="{CEFF6645-7219-49A2-99E3-ECEABC34D6E7}">
   <ds:schemaRefs>
     <ds:schemaRef ds:uri="http://schemas.openxmlformats.org/officeDocument/2006/bibliography"/>
   </ds:schemaRefs>

</xml_diff>